<commit_message>
feat(fca): apply clinician mark-up to the FCA template
- remove Primary Disability and Other Conditions from the front page
  (controls dropped from the docx and the scalar catalogue; the client
  profile fields and API are unchanged)
- Background guidance: service history -> therapy/intervention history,
  and document the referral source instead of the attribution sentence
- remove the Assessment limitations subsection
- replace eight domain guidance placeholders (indoor/outdoor mobility,
  transfers, sit/stand tolerance, attention, memory, executive
  functioning, supervision/safety) with the clinician's question-prompt
  guidance

Co-Authored-By: Claude Opus 5 <noreply@anthropic.com>
</commit_message>
<xml_diff>
--- a/backend/fca/templates/fca-v1.docx
+++ b/backend/fca/templates/fca-v1.docx
@@ -2608,133 +2608,6 @@
                         <w:rFonts w:ascii="Arial" w:hAnsi="Arial" w:eastAsia="Arial" w:cs="Arial"/>
                       </w:rPr>
                       <w:t>[PORTAL — REPORT DATE]</w:t>
-                    </w:r>
-                  </w:sdtContent>
-                </w:sdt>
-              </w:p>
-            </w:tc>
-          </w:tr>
-          <w:tr>
-            <w:trPr>
-              <w:cantSplit w:val="true"/>
-            </w:trPr>
-            <w:tc>
-              <w:tcPr>
-                <w:tcW w:type="dxa" w:w="3180"/>
-                <w:vAlign w:val="center"/>
-                <w:shd w:val="clear" w:fill="2F5651"/>
-                <w:tcMar>
-                  <w:top w:w="95" w:type="dxa"/>
-                  <w:bottom w:w="95" w:type="dxa"/>
-                  <w:start w:w="120" w:type="dxa"/>
-                  <w:end w:w="120" w:type="dxa"/>
-                </w:tcMar>
-              </w:tcPr>
-              <w:p>
-                <w:pPr>
-                  <w:pStyle w:val="OPAL–TableHeader"/>
-                  <w:jc w:val="left"/>
-                </w:pPr>
-                <w:r>
-                  <w:rPr>
-                    <w:rFonts w:ascii="Arial" w:hAnsi="Arial" w:eastAsia="Arial" w:cs="Arial"/>
-                  </w:rPr>
-                  <w:t>Primary Disability</w:t>
-                </w:r>
-              </w:p>
-            </w:tc>
-            <w:tc>
-              <w:tcPr>
-                <w:tcW w:type="dxa" w:w="6756"/>
-                <w:vAlign w:val="center"/>
-                <w:shd w:val="clear" w:fill="F4F7F5"/>
-                <w:tcMar>
-                  <w:top w:w="95" w:type="dxa"/>
-                  <w:bottom w:w="95" w:type="dxa"/>
-                  <w:start w:w="120" w:type="dxa"/>
-                  <w:end w:w="120" w:type="dxa"/>
-                </w:tcMar>
-              </w:tcPr>
-              <w:p>
-                <w:pPr>
-                  <w:pStyle w:val="OPAL–TableBody"/>
-                  <w:jc w:val="left"/>
-                </w:pPr>
-                <w:sdt>
-                  <w:sdtPr>
-                    <w:tag w:val="OPAL_CLIENT_PRIMARY_DISABILITY"/>
-                    <w:alias w:val="PORTAL — PRIMARY DISABILITY"/>
-                    <w:text/>
-                  </w:sdtPr>
-                  <w:sdtContent>
-                    <w:r>
-                      <w:rPr>
-                        <w:rFonts w:ascii="Arial" w:hAnsi="Arial" w:eastAsia="Arial" w:cs="Arial"/>
-                      </w:rPr>
-                      <w:t>[PORTAL — PRIMARY DISABILITY]</w:t>
-                    </w:r>
-                  </w:sdtContent>
-                </w:sdt>
-              </w:p>
-            </w:tc>
-          </w:tr>
-          <w:tr>
-            <w:trPr>
-              <w:cantSplit w:val="true"/>
-            </w:trPr>
-            <w:tc>
-              <w:tcPr>
-                <w:tcW w:type="dxa" w:w="3180"/>
-                <w:vAlign w:val="center"/>
-                <w:shd w:val="clear" w:fill="2F5651"/>
-                <w:tcMar>
-                  <w:top w:w="95" w:type="dxa"/>
-                  <w:bottom w:w="95" w:type="dxa"/>
-                  <w:start w:w="120" w:type="dxa"/>
-                  <w:end w:w="120" w:type="dxa"/>
-                </w:tcMar>
-              </w:tcPr>
-              <w:p>
-                <w:pPr>
-                  <w:pStyle w:val="OPAL–TableHeader"/>
-                  <w:jc w:val="left"/>
-                </w:pPr>
-                <w:r>
-                  <w:rPr>
-                    <w:rFonts w:ascii="Arial" w:hAnsi="Arial" w:eastAsia="Arial" w:cs="Arial"/>
-                  </w:rPr>
-                  <w:t>Other Conditions</w:t>
-                </w:r>
-              </w:p>
-            </w:tc>
-            <w:tc>
-              <w:tcPr>
-                <w:tcW w:type="dxa" w:w="6756"/>
-                <w:vAlign w:val="center"/>
-                <w:tcMar>
-                  <w:top w:w="95" w:type="dxa"/>
-                  <w:bottom w:w="95" w:type="dxa"/>
-                  <w:start w:w="120" w:type="dxa"/>
-                  <w:end w:w="120" w:type="dxa"/>
-                </w:tcMar>
-              </w:tcPr>
-              <w:p>
-                <w:pPr>
-                  <w:pStyle w:val="OPAL–TableBody"/>
-                  <w:jc w:val="left"/>
-                </w:pPr>
-                <w:sdt>
-                  <w:sdtPr>
-                    <w:tag w:val="OPAL_CLIENT_OTHER_CONDITIONS"/>
-                    <w:alias w:val="PORTAL — OTHER CONDITIONS"/>
-                    <w:text/>
-                  </w:sdtPr>
-                  <w:sdtContent>
-                    <w:r>
-                      <w:rPr>
-                        <w:rFonts w:ascii="Arial" w:hAnsi="Arial" w:eastAsia="Arial" w:cs="Arial"/>
-                      </w:rPr>
-                      <w:t>[PORTAL — OTHER CONDITIONS]</w:t>
                     </w:r>
                   </w:sdtContent>
                 </w:sdt>
@@ -3548,7 +3421,7 @@
             <w:pStyle w:val="OPAL–Placeholder"/>
           </w:pPr>
           <w:r>
-            <w:t>[Provide a concise, relevant account of the participant’s personal, developmental, health, education, employment and service history. Attribute information to its source and avoid unnecessary sensitive detail.]</w:t>
+            <w:t>[Provide a concise, relevant account of the participant’s personal, developmental, health, education, employment and therapy/intervention history. Document the referral source i.e., XX’s mother reported…]</w:t>
           </w:r>
         </w:p>
         <w:p>
@@ -4708,22 +4581,6 @@
           <w:pPr>
             <w:spacing w:after="40"/>
           </w:pPr>
-        </w:p>
-        <w:p>
-          <w:pPr>
-            <w:pStyle w:val="OPAL–Heading2"/>
-          </w:pPr>
-          <w:r>
-            <w:t>Assessment limitations</w:t>
-          </w:r>
-        </w:p>
-        <w:p>
-          <w:pPr>
-            <w:pStyle w:val="OPAL–Placeholder"/>
-          </w:pPr>
-          <w:r>
-            <w:t>[Identify missing records, limited observation opportunities, fluctuating presentation, informant discrepancies, cultural or language factors, fatigue, pain, distress, assessment adaptations and the effect of each limitation on confidence in the findings.]</w:t>
-          </w:r>
         </w:p>
         <w:sdt>
           <w:sdtPr>
@@ -7428,7 +7285,7 @@
                 <w:pStyle w:val="OPAL–Placeholder"/>
               </w:pPr>
               <w:r>
-                <w:t>[Describe usual movement within the home, gait or wheelchair mobility, access between rooms or levels, pace, endurance, prompts or physical assistance, aids used and observed safety.]</w:t>
+                <w:t>[How do you typically move around your home? Do you use any assistive devices (e.g., walker, cane, wheelchair) indoors? How do you manage tasks like getting from room to room, going up and down stairs, or moving between floors? Do you have any trouble reaching items on high or low shelves?]</w:t>
               </w:r>
             </w:p>
             <w:p>
@@ -7444,7 +7301,7 @@
                 <w:pStyle w:val="OPAL–Placeholder"/>
               </w:pPr>
               <w:r>
-                <w:t>[Describe performance on uneven surfaces, kerbs, gradients, distance, weather or crowds; specify aids, supervision, assistance and environmental barriers.]</w:t>
+                <w:t>[How often do you go outside, and what kind of mobility challenges do you face outdoors? Do you feel confident walking on different surfaces, such as grass, gravel, or uneven pavement? Do you use any mobility aids when you are outside? How do these devices help or limit your outdoor mobility?]</w:t>
               </w:r>
             </w:p>
             <w:p>
@@ -7460,7 +7317,7 @@
                 <w:pStyle w:val="OPAL–Placeholder"/>
               </w:pPr>
               <w:r>
-                <w:t>[Report bed, chair, toilet, shower and vehicle transfers; include technique, equipment, assistance level, variability, fatigue, pain and observed or reported risk.]</w:t>
+                <w:t>[How do you manage getting in and out of your car, shower, toilet, bed, and chair? Do you use any assistive devices or need help from someone during these transfers? Are there any transfers that you find particularly difficult or tiring? Have you had any incidents where you felt unsafe or had a fall during a transfer? How much support do you need with transfers?]</w:t>
               </w:r>
             </w:p>
             <w:p>
@@ -7492,7 +7349,7 @@
                 <w:pStyle w:val="OPAL–Placeholder"/>
               </w:pPr>
               <w:r>
-                <w:t>[State typical and maximum tolerance, positional changes, pain or fatigue, task impact and supports or equipment required.]</w:t>
+                <w:t>[How long can you comfortably sit without needing to change positions or stand up? Do you experience any pain or discomfort while sitting for extended periods? How long can you stand without needing to sit down or take a break? Do you experience any pain or fatigue while standing for extended periods?]</w:t>
               </w:r>
             </w:p>
             <w:p>
@@ -7646,7 +7503,7 @@
                 <w:pStyle w:val="OPAL–Placeholder"/>
               </w:pPr>
               <w:r>
-                <w:t>[Describe engagement, sustained and divided attention, distractibility, task persistence, pace, cueing and the effect on everyday activities.]</w:t>
+                <w:t>[Concentration/attention: During the assessment session, XX was able to engage in formalised assessment and overall scored X/6 for the domain of attention on the MoCA. How was their engagement during assessment/therapy sessions? Were they able to engage and respond to questions and instructions appropriately? Are they able to maintain concentration/attention during tasks such as cooking/work? Are they able to multi-task? Shift attention between tasks in a timely manner? How long can they stay focused on a task without getting distracted? Are there specific times of the day when they are more focussed or alert?]</w:t>
               </w:r>
             </w:p>
             <w:p>
@@ -7662,7 +7519,7 @@
                 <w:pStyle w:val="OPAL–Placeholder"/>
               </w:pPr>
               <w:r>
-                <w:t>[Describe immediate, recent and prospective memory, ability to retain instructions, use of compensatory strategies and consequences for daily routines, appointments and safety.]</w:t>
+                <w:t>[Memory: During the MoCA, XX was able to immediately recall XX words. He was able to recall XX out of five words after a delay and scored X/5 for the domain of memory. Were they able to recall historical information correctly? Were they able to remember instructions and follow through appropriately? Examples of good/poor memory?]</w:t>
               </w:r>
             </w:p>
             <w:p>
@@ -7678,7 +7535,7 @@
                 <w:pStyle w:val="OPAL–Placeholder"/>
               </w:pPr>
               <w:r>
-                <w:t>[Describe planning, organisation, cognitive flexibility, initiation, sequencing, error awareness, learning, generalisation and the level of support required.]</w:t>
+                <w:t>[XX experiences significant difficulties with executive functioning and this includes flexible thinking, organising and planning, regulating emotions, keeping track through self-monitoring, understanding different points of view, and starting tasks and staying focused to completion. XX requires direct support from his/her support workers for planning and organising, flexible thinking, and self-regulation. XX requires additional time and support for problem-solving. How do they cope with abrupt changes to their routine? Are they able to understand different points of view?]</w:t>
               </w:r>
             </w:p>
             <w:p>
@@ -7694,7 +7551,7 @@
                 <w:pStyle w:val="OPAL–Placeholder"/>
               </w:pPr>
               <w:r>
-                <w:t>[Describe capacity to identify hazards, respond to emergencies, remain safely alone, make day-to-day decisions and complete essential routines; state the required supervision and escalation plan.]</w:t>
+                <w:t>[XX is his/her own decision maker; however, he/she requires intermittent support with some decisions. XX is able to stay home alone for short periods but would have difficulties staying home alone by himself/herself for a few days with no support. XX requires reminders and prompting from his/her support workers to ensure daily tasks are completed, hence, without this support there is a risk that necessary daily tasks might be neglected. XX requires a high level of direct support for emotional regulation and self-management. If this level of support is not provided, XX will not be able to address other important tasks.]</w:t>
               </w:r>
             </w:p>
             <w:p>

</xml_diff>

<commit_message>
feat(fca): trim the FCA master — no preferred name, pronouns, NDIS goals, purpose/scope or consent prompts; list styles at 10.5pt
fca-v1.docx loses the Preferred Name and Pronouns rows of the participant
table, the two NDIS goal controls (and the redundant Participant Goals H3),
and the 'Assessment purpose and scope' and 'Consent and information sharing'
heading+prompt pairs under Referral Information. The header6 control now
carries the full name instead of the preferred name. 'OPAL – Bullet' and
'OPAL – Numbered List' are raised from 10pt to 10.5pt to match 'OPAL – Body'
for therapists writing in Word after download.

Template map: 54 controls / 80 occurrences / 29 scalars / 13 client tags.
Tests re-pinned to the new facts and retargeted to surviving profile fields;
the goal:N plan resolution is still covered against a minimal catalogue since
other templates use it. Client-profile columns are untouched.

Co-Authored-By: Claude Fable 5.1 <noreply@anthropic.com>
</commit_message>
<xml_diff>
--- a/backend/fca/templates/fca-v1.docx
+++ b/backend/fca/templates/fca-v1.docx
@@ -2058,133 +2058,6 @@
                         <w:rFonts w:ascii="Arial" w:hAnsi="Arial" w:eastAsia="Arial" w:cs="Arial"/>
                       </w:rPr>
                       <w:t>[PORTAL — CLIENT NAME]</w:t>
-                    </w:r>
-                  </w:sdtContent>
-                </w:sdt>
-              </w:p>
-            </w:tc>
-          </w:tr>
-          <w:tr>
-            <w:trPr>
-              <w:cantSplit w:val="true"/>
-            </w:trPr>
-            <w:tc>
-              <w:tcPr>
-                <w:tcW w:type="dxa" w:w="3180"/>
-                <w:vAlign w:val="center"/>
-                <w:shd w:val="clear" w:fill="2F5651"/>
-                <w:tcMar>
-                  <w:top w:w="95" w:type="dxa"/>
-                  <w:bottom w:w="95" w:type="dxa"/>
-                  <w:start w:w="120" w:type="dxa"/>
-                  <w:end w:w="120" w:type="dxa"/>
-                </w:tcMar>
-              </w:tcPr>
-              <w:p>
-                <w:pPr>
-                  <w:pStyle w:val="OPAL–TableHeader"/>
-                  <w:jc w:val="left"/>
-                </w:pPr>
-                <w:r>
-                  <w:rPr>
-                    <w:rFonts w:ascii="Arial" w:hAnsi="Arial" w:eastAsia="Arial" w:cs="Arial"/>
-                  </w:rPr>
-                  <w:t>Preferred Name</w:t>
-                </w:r>
-              </w:p>
-            </w:tc>
-            <w:tc>
-              <w:tcPr>
-                <w:tcW w:type="dxa" w:w="6756"/>
-                <w:vAlign w:val="center"/>
-                <w:shd w:val="clear" w:fill="F4F7F5"/>
-                <w:tcMar>
-                  <w:top w:w="95" w:type="dxa"/>
-                  <w:bottom w:w="95" w:type="dxa"/>
-                  <w:start w:w="120" w:type="dxa"/>
-                  <w:end w:w="120" w:type="dxa"/>
-                </w:tcMar>
-              </w:tcPr>
-              <w:p>
-                <w:pPr>
-                  <w:pStyle w:val="OPAL–TableBody"/>
-                  <w:jc w:val="left"/>
-                </w:pPr>
-                <w:sdt>
-                  <w:sdtPr>
-                    <w:tag w:val="OPAL_CLIENT_PREFERRED_NAME"/>
-                    <w:alias w:val="PORTAL — PREFERRED NAME"/>
-                    <w:text/>
-                  </w:sdtPr>
-                  <w:sdtContent>
-                    <w:r>
-                      <w:rPr>
-                        <w:rFonts w:ascii="Arial" w:hAnsi="Arial" w:eastAsia="Arial" w:cs="Arial"/>
-                      </w:rPr>
-                      <w:t>[PORTAL — PREFERRED NAME]</w:t>
-                    </w:r>
-                  </w:sdtContent>
-                </w:sdt>
-              </w:p>
-            </w:tc>
-          </w:tr>
-          <w:tr>
-            <w:trPr>
-              <w:cantSplit w:val="true"/>
-            </w:trPr>
-            <w:tc>
-              <w:tcPr>
-                <w:tcW w:type="dxa" w:w="3180"/>
-                <w:vAlign w:val="center"/>
-                <w:shd w:val="clear" w:fill="2F5651"/>
-                <w:tcMar>
-                  <w:top w:w="95" w:type="dxa"/>
-                  <w:bottom w:w="95" w:type="dxa"/>
-                  <w:start w:w="120" w:type="dxa"/>
-                  <w:end w:w="120" w:type="dxa"/>
-                </w:tcMar>
-              </w:tcPr>
-              <w:p>
-                <w:pPr>
-                  <w:pStyle w:val="OPAL–TableHeader"/>
-                  <w:jc w:val="left"/>
-                </w:pPr>
-                <w:r>
-                  <w:rPr>
-                    <w:rFonts w:ascii="Arial" w:hAnsi="Arial" w:eastAsia="Arial" w:cs="Arial"/>
-                  </w:rPr>
-                  <w:t>Pronouns</w:t>
-                </w:r>
-              </w:p>
-            </w:tc>
-            <w:tc>
-              <w:tcPr>
-                <w:tcW w:type="dxa" w:w="6756"/>
-                <w:vAlign w:val="center"/>
-                <w:tcMar>
-                  <w:top w:w="95" w:type="dxa"/>
-                  <w:bottom w:w="95" w:type="dxa"/>
-                  <w:start w:w="120" w:type="dxa"/>
-                  <w:end w:w="120" w:type="dxa"/>
-                </w:tcMar>
-              </w:tcPr>
-              <w:p>
-                <w:pPr>
-                  <w:pStyle w:val="OPAL–TableBody"/>
-                  <w:jc w:val="left"/>
-                </w:pPr>
-                <w:sdt>
-                  <w:sdtPr>
-                    <w:tag w:val="OPAL_CLIENT_PRONOUNS"/>
-                    <w:alias w:val="PORTAL — PRONOUNS"/>
-                    <w:text/>
-                  </w:sdtPr>
-                  <w:sdtContent>
-                    <w:r>
-                      <w:rPr>
-                        <w:rFonts w:ascii="Arial" w:hAnsi="Arial" w:eastAsia="Arial" w:cs="Arial"/>
-                      </w:rPr>
-                      <w:t>[PORTAL — PRONOUNS]</w:t>
                     </w:r>
                   </w:sdtContent>
                 </w:sdt>
@@ -3201,38 +3074,6 @@
             <w:pStyle w:val="OPAL–Heading2"/>
           </w:pPr>
           <w:r>
-            <w:t>Assessment purpose and scope</w:t>
-          </w:r>
-        </w:p>
-        <w:p>
-          <w:pPr>
-            <w:pStyle w:val="OPAL–Placeholder"/>
-          </w:pPr>
-          <w:r>
-            <w:t>[Define the participant’s disability-related functional questions, environments and activities assessed, the reporting period, and any matters outside the scope of this assessment.]</w:t>
-          </w:r>
-        </w:p>
-        <w:p>
-          <w:pPr>
-            <w:pStyle w:val="OPAL–Heading2"/>
-          </w:pPr>
-          <w:r>
-            <w:t>Consent and information sharing</w:t>
-          </w:r>
-        </w:p>
-        <w:p>
-          <w:pPr>
-            <w:pStyle w:val="OPAL–Placeholder"/>
-          </w:pPr>
-          <w:r>
-            <w:t>[Document consent for assessment, information collection and report distribution; identify the participant, nominee or guardian who provided consent and any communication or decision-making supports used.]</w:t>
-          </w:r>
-        </w:p>
-        <w:p>
-          <w:pPr>
-            <w:pStyle w:val="OPAL–Heading2"/>
-          </w:pPr>
-          <w:r>
             <w:t>Referral and report recipients</w:t>
           </w:r>
         </w:p>
@@ -3666,56 +3507,6 @@
         <w:p>
           <w:pPr>
             <w:pStyle w:val="OPAL–Heading2"/>
-          </w:pPr>
-          <w:r>
-            <w:t>Participant Goals</w:t>
-          </w:r>
-        </w:p>
-        <w:p>
-          <w:pPr>
-            <w:pStyle w:val="OPAL–Heading3"/>
-          </w:pPr>
-          <w:r>
-            <w:t>NDIS Goals (as per NDIS plan)</w:t>
-          </w:r>
-        </w:p>
-        <w:p>
-          <w:pPr>
-            <w:pStyle w:val="OPAL–Bullet"/>
-          </w:pPr>
-          <w:sdt>
-            <w:sdtPr>
-              <w:tag w:val="OPAL_CLIENT_NDIS_GOAL_1"/>
-              <w:alias w:val="PORTAL — CURRENT NDIS GOAL 1"/>
-              <w:text/>
-            </w:sdtPr>
-            <w:sdtContent>
-              <w:r>
-                <w:t>[PORTAL — CURRENT NDIS GOAL 1]</w:t>
-              </w:r>
-            </w:sdtContent>
-          </w:sdt>
-        </w:p>
-        <w:p>
-          <w:pPr>
-            <w:pStyle w:val="OPAL–Bullet"/>
-          </w:pPr>
-          <w:sdt>
-            <w:sdtPr>
-              <w:tag w:val="OPAL_CLIENT_NDIS_GOAL_2"/>
-              <w:alias w:val="PORTAL — CURRENT NDIS GOAL 2"/>
-              <w:text/>
-            </w:sdtPr>
-            <w:sdtContent>
-              <w:r>
-                <w:t>[PORTAL — CURRENT NDIS GOAL 2]</w:t>
-              </w:r>
-            </w:sdtContent>
-          </w:sdt>
-        </w:p>
-        <w:p>
-          <w:pPr>
-            <w:pStyle w:val="OPAL–Heading3"/>
           </w:pPr>
           <w:r>
             <w:t>Participant Goals</w:t>
@@ -10663,8 +10454,8 @@
     </w:pPr>
     <w:sdt>
       <w:sdtPr>
-        <w:tag w:val="OPAL_CLIENT_PREFERRED_NAME"/>
-        <w:alias w:val="PORTAL — PREFERRED NAME"/>
+        <w:tag w:val="OPAL_CLIENT_FULL_NAME"/>
+        <w:alias w:val="PORTAL — CLIENT NAME"/>
         <w:text/>
       </w:sdtPr>
       <w:sdtContent>
@@ -10675,7 +10466,7 @@
             <w:color w:val="566E70"/>
             <w:sz w:val="14"/>
           </w:rPr>
-          <w:t>[PORTAL — PREFERRED NAME]</w:t>
+          <w:t>[PORTAL — CLIENT NAME]</w:t>
         </w:r>
       </w:sdtContent>
     </w:sdt>
@@ -19888,7 +19679,7 @@
       <w:b w:val="0"/>
       <w:i w:val="0"/>
       <w:color w:val="263633"/>
-      <w:sz w:val="20"/>
+      <w:sz w:val="21"/>
     </w:rPr>
   </w:style>
   <w:style w:type="paragraph" w:customStyle="1" w:styleId="OPAL–NumberedList">
@@ -19909,7 +19700,7 @@
       <w:b w:val="0"/>
       <w:i w:val="0"/>
       <w:color w:val="263633"/>
-      <w:sz w:val="20"/>
+      <w:sz w:val="21"/>
     </w:rPr>
   </w:style>
   <w:style w:type="paragraph" w:customStyle="1" w:styleId="TOC1">

</xml_diff>

<commit_message>
feat(fca): drop the Relevant findings column from the Reports reviewed table
The table keeps Report / record, Author / provider and Date, widened to fill
the same 9936 dxa. No content controls change (still 54 / 80).

Co-Authored-By: Claude Fable 5.1 <noreply@anthropic.com>
</commit_message>
<xml_diff>
--- a/backend/fca/templates/fca-v1.docx
+++ b/backend/fca/templates/fca-v1.docx
@@ -4052,10 +4052,9 @@
             </w:tblBorders>
           </w:tblPr>
           <w:tblGrid>
-            <w:gridCol w:w="2683"/>
-            <w:gridCol w:w="2385"/>
-            <w:gridCol w:w="1292"/>
-            <w:gridCol w:w="3576"/>
+            <w:gridCol w:w="4300"/>
+            <w:gridCol w:w="3800"/>
+            <w:gridCol w:w="1836"/>
           </w:tblGrid>
           <w:tr>
             <w:trPr>
@@ -4064,7 +4063,7 @@
             </w:trPr>
             <w:tc>
               <w:tcPr>
-                <w:tcW w:type="dxa" w:w="2683"/>
+                <w:tcW w:type="dxa" w:w="4300"/>
                 <w:vAlign w:val="center"/>
                 <w:shd w:val="clear" w:fill="2F5651"/>
                 <w:tcMar>
@@ -4089,7 +4088,7 @@
             </w:tc>
             <w:tc>
               <w:tcPr>
-                <w:tcW w:type="dxa" w:w="2385"/>
+                <w:tcW w:type="dxa" w:w="3800"/>
                 <w:vAlign w:val="center"/>
                 <w:shd w:val="clear" w:fill="2F5651"/>
                 <w:tcMar>
@@ -4114,7 +4113,7 @@
             </w:tc>
             <w:tc>
               <w:tcPr>
-                <w:tcW w:type="dxa" w:w="1292"/>
+                <w:tcW w:type="dxa" w:w="1836"/>
                 <w:vAlign w:val="center"/>
                 <w:shd w:val="clear" w:fill="2F5651"/>
                 <w:tcMar>
@@ -4137,31 +4136,6 @@
                 </w:r>
               </w:p>
             </w:tc>
-            <w:tc>
-              <w:tcPr>
-                <w:tcW w:type="dxa" w:w="3576"/>
-                <w:vAlign w:val="center"/>
-                <w:shd w:val="clear" w:fill="2F5651"/>
-                <w:tcMar>
-                  <w:top w:w="90" w:type="dxa"/>
-                  <w:bottom w:w="90" w:type="dxa"/>
-                  <w:start w:w="120" w:type="dxa"/>
-                  <w:end w:w="120" w:type="dxa"/>
-                </w:tcMar>
-              </w:tcPr>
-              <w:p>
-                <w:pPr>
-                  <w:pStyle w:val="OPAL–TableHeader"/>
-                  <w:jc w:val="left"/>
-                </w:pPr>
-                <w:r>
-                  <w:rPr>
-                    <w:rFonts w:ascii="Arial" w:hAnsi="Arial" w:eastAsia="Arial" w:cs="Arial"/>
-                  </w:rPr>
-                  <w:t>Relevant findings</w:t>
-                </w:r>
-              </w:p>
-            </w:tc>
           </w:tr>
           <w:tr>
             <w:trPr>
@@ -4169,7 +4143,7 @@
             </w:trPr>
             <w:tc>
               <w:tcPr>
-                <w:tcW w:type="dxa" w:w="2683"/>
+                <w:tcW w:type="dxa" w:w="4300"/>
                 <w:vAlign w:val="center"/>
                 <w:tcMar>
                   <w:top w:w="90" w:type="dxa"/>
@@ -4195,7 +4169,7 @@
             </w:tc>
             <w:tc>
               <w:tcPr>
-                <w:tcW w:type="dxa" w:w="2385"/>
+                <w:tcW w:type="dxa" w:w="3800"/>
                 <w:vAlign w:val="center"/>
                 <w:tcMar>
                   <w:top w:w="90" w:type="dxa"/>
@@ -4221,7 +4195,7 @@
             </w:tc>
             <w:tc>
               <w:tcPr>
-                <w:tcW w:type="dxa" w:w="1292"/>
+                <w:tcW w:type="dxa" w:w="1836"/>
                 <w:vAlign w:val="center"/>
                 <w:tcMar>
                   <w:top w:w="90" w:type="dxa"/>
@@ -4245,32 +4219,6 @@
                 </w:r>
               </w:p>
             </w:tc>
-            <w:tc>
-              <w:tcPr>
-                <w:tcW w:type="dxa" w:w="3576"/>
-                <w:vAlign w:val="center"/>
-                <w:tcMar>
-                  <w:top w:w="90" w:type="dxa"/>
-                  <w:bottom w:w="90" w:type="dxa"/>
-                  <w:start w:w="120" w:type="dxa"/>
-                  <w:end w:w="120" w:type="dxa"/>
-                </w:tcMar>
-              </w:tcPr>
-              <w:p>
-                <w:pPr>
-                  <w:pStyle w:val="OPAL–TableBody"/>
-                  <w:jc w:val="left"/>
-                </w:pPr>
-                <w:r>
-                  <w:rPr>
-                    <w:rFonts w:ascii="Arial" w:hAnsi="Arial" w:eastAsia="Arial" w:cs="Arial"/>
-                    <w:i/>
-                    <w:color w:val="566E70"/>
-                  </w:rPr>
-                  <w:t>[RELEVANT EVIDENCE USED IN THIS REPORT]</w:t>
-                </w:r>
-              </w:p>
-            </w:tc>
           </w:tr>
           <w:tr>
             <w:trPr>
@@ -4278,7 +4226,7 @@
             </w:trPr>
             <w:tc>
               <w:tcPr>
-                <w:tcW w:type="dxa" w:w="2683"/>
+                <w:tcW w:type="dxa" w:w="4300"/>
                 <w:vAlign w:val="center"/>
                 <w:shd w:val="clear" w:fill="F4F7F5"/>
                 <w:tcMar>
@@ -4305,7 +4253,7 @@
             </w:tc>
             <w:tc>
               <w:tcPr>
-                <w:tcW w:type="dxa" w:w="2385"/>
+                <w:tcW w:type="dxa" w:w="3800"/>
                 <w:vAlign w:val="center"/>
                 <w:shd w:val="clear" w:fill="F4F7F5"/>
                 <w:tcMar>
@@ -4332,7 +4280,7 @@
             </w:tc>
             <w:tc>
               <w:tcPr>
-                <w:tcW w:type="dxa" w:w="1292"/>
+                <w:tcW w:type="dxa" w:w="1836"/>
                 <w:vAlign w:val="center"/>
                 <w:shd w:val="clear" w:fill="F4F7F5"/>
                 <w:tcMar>
@@ -4357,33 +4305,6 @@
                 </w:r>
               </w:p>
             </w:tc>
-            <w:tc>
-              <w:tcPr>
-                <w:tcW w:type="dxa" w:w="3576"/>
-                <w:vAlign w:val="center"/>
-                <w:shd w:val="clear" w:fill="F4F7F5"/>
-                <w:tcMar>
-                  <w:top w:w="90" w:type="dxa"/>
-                  <w:bottom w:w="90" w:type="dxa"/>
-                  <w:start w:w="120" w:type="dxa"/>
-                  <w:end w:w="120" w:type="dxa"/>
-                </w:tcMar>
-              </w:tcPr>
-              <w:p>
-                <w:pPr>
-                  <w:pStyle w:val="OPAL–TableBody"/>
-                  <w:jc w:val="left"/>
-                </w:pPr>
-                <w:r>
-                  <w:rPr>
-                    <w:rFonts w:ascii="Arial" w:hAnsi="Arial" w:eastAsia="Arial" w:cs="Arial"/>
-                    <w:i/>
-                    <w:color w:val="566E70"/>
-                  </w:rPr>
-                  <w:t>[RELEVANT EVIDENCE USED IN THIS REPORT]</w:t>
-                </w:r>
-              </w:p>
-            </w:tc>
           </w:tr>
           <w:tr>
             <w:trPr>
@@ -4391,7 +4312,7 @@
             </w:trPr>
             <w:tc>
               <w:tcPr>
-                <w:tcW w:type="dxa" w:w="2683"/>
+                <w:tcW w:type="dxa" w:w="4300"/>
                 <w:vAlign w:val="center"/>
                 <w:tcMar>
                   <w:top w:w="90" w:type="dxa"/>
@@ -4417,7 +4338,7 @@
             </w:tc>
             <w:tc>
               <w:tcPr>
-                <w:tcW w:type="dxa" w:w="2385"/>
+                <w:tcW w:type="dxa" w:w="3800"/>
                 <w:vAlign w:val="center"/>
                 <w:tcMar>
                   <w:top w:w="90" w:type="dxa"/>
@@ -4443,7 +4364,7 @@
             </w:tc>
             <w:tc>
               <w:tcPr>
-                <w:tcW w:type="dxa" w:w="1292"/>
+                <w:tcW w:type="dxa" w:w="1836"/>
                 <w:vAlign w:val="center"/>
                 <w:tcMar>
                   <w:top w:w="90" w:type="dxa"/>
@@ -4464,32 +4385,6 @@
                     <w:color w:val="566E70"/>
                   </w:rPr>
                   <w:t>[DATE]</w:t>
-                </w:r>
-              </w:p>
-            </w:tc>
-            <w:tc>
-              <w:tcPr>
-                <w:tcW w:type="dxa" w:w="3576"/>
-                <w:vAlign w:val="center"/>
-                <w:tcMar>
-                  <w:top w:w="90" w:type="dxa"/>
-                  <w:bottom w:w="90" w:type="dxa"/>
-                  <w:start w:w="120" w:type="dxa"/>
-                  <w:end w:w="120" w:type="dxa"/>
-                </w:tcMar>
-              </w:tcPr>
-              <w:p>
-                <w:pPr>
-                  <w:pStyle w:val="OPAL–TableBody"/>
-                  <w:jc w:val="left"/>
-                </w:pPr>
-                <w:r>
-                  <w:rPr>
-                    <w:rFonts w:ascii="Arial" w:hAnsi="Arial" w:eastAsia="Arial" w:cs="Arial"/>
-                    <w:i/>
-                    <w:color w:val="566E70"/>
-                  </w:rPr>
-                  <w:t>[RELEVANT EVIDENCE USED IN THIS REPORT]</w:t>
                 </w:r>
               </w:p>
             </w:tc>

</xml_diff>

<commit_message>
feat(fca): WHODAS table without square brackets; every style half a point larger with looser spacing
WHODAS 2.0: the 25 bracketed placeholders (prompt paragraph, score cells,
interpretation cells) lose their square brackets. Styles: body 10.5 -> 11pt,
headings +1pt, tables 9 -> 9.5pt, prompts/captions/header/footer +0.5pt, with
paragraph and line spacing opened up a touch; the TOC runs and header runs
that carry inline sizes are lifted to match. No content controls change.

Co-Authored-By: Claude Fable 5.1 <noreply@anthropic.com>
</commit_message>
<xml_diff>
--- a/backend/fca/templates/fca-v1.docx
+++ b/backend/fca/templates/fca-v1.docx
@@ -1254,7 +1254,7 @@
         <w:rPr>
           <w:rFonts w:ascii="Arial" w:hAnsi="Arial" w:eastAsia="Arial" w:cs="Arial"/>
           <w:color w:val="566E70"/>
-          <w:sz w:val="20"/>
+          <w:sz w:val="21"/>
         </w:rPr>
         <w:fldChar w:fldCharType="begin" w:dirty="true"/>
         <w:instrText xml:space="preserve"> TOC \o "1-3" \h \z \u </w:instrText>
@@ -1265,7 +1265,7 @@
           <w:rFonts w:ascii="Arial" w:hAnsi="Arial" w:eastAsia="Arial" w:cs="Arial"/>
           <w:b/>
           <w:color w:val="2F5651"/>
-          <w:sz w:val="20"/>
+          <w:sz w:val="21"/>
         </w:rPr>
         <w:t>Participant Details</w:t>
       </w:r>
@@ -1273,7 +1273,7 @@
         <w:rPr>
           <w:rFonts w:ascii="Arial" w:hAnsi="Arial" w:eastAsia="Arial" w:cs="Arial"/>
           <w:color w:val="2F5651"/>
-          <w:sz w:val="20"/>
+          <w:sz w:val="21"/>
         </w:rPr>
         <w:tab/>
       </w:r>
@@ -1282,7 +1282,7 @@
           <w:rFonts w:ascii="Arial" w:hAnsi="Arial" w:eastAsia="Arial" w:cs="Arial"/>
           <w:b/>
           <w:color w:val="2F5651"/>
-          <w:sz w:val="20"/>
+          <w:sz w:val="21"/>
         </w:rPr>
         <w:t>1</w:t>
       </w:r>
@@ -1299,7 +1299,7 @@
           <w:rFonts w:ascii="Arial" w:hAnsi="Arial" w:eastAsia="Arial" w:cs="Arial"/>
           <w:b/>
           <w:color w:val="2F5651"/>
-          <w:sz w:val="20"/>
+          <w:sz w:val="21"/>
         </w:rPr>
         <w:t>Referral Information</w:t>
       </w:r>
@@ -1307,7 +1307,7 @@
         <w:rPr>
           <w:rFonts w:ascii="Arial" w:hAnsi="Arial" w:eastAsia="Arial" w:cs="Arial"/>
           <w:color w:val="2F5651"/>
-          <w:sz w:val="20"/>
+          <w:sz w:val="21"/>
         </w:rPr>
         <w:tab/>
       </w:r>
@@ -1316,7 +1316,7 @@
           <w:rFonts w:ascii="Arial" w:hAnsi="Arial" w:eastAsia="Arial" w:cs="Arial"/>
           <w:b/>
           <w:color w:val="2F5651"/>
-          <w:sz w:val="20"/>
+          <w:sz w:val="21"/>
         </w:rPr>
         <w:t>2</w:t>
       </w:r>
@@ -1333,7 +1333,7 @@
           <w:rFonts w:ascii="Arial" w:hAnsi="Arial" w:eastAsia="Arial" w:cs="Arial"/>
           <w:b/>
           <w:color w:val="2F5651"/>
-          <w:sz w:val="20"/>
+          <w:sz w:val="21"/>
         </w:rPr>
         <w:t>Participant Information</w:t>
       </w:r>
@@ -1341,7 +1341,7 @@
         <w:rPr>
           <w:rFonts w:ascii="Arial" w:hAnsi="Arial" w:eastAsia="Arial" w:cs="Arial"/>
           <w:color w:val="2F5651"/>
-          <w:sz w:val="20"/>
+          <w:sz w:val="21"/>
         </w:rPr>
         <w:tab/>
       </w:r>
@@ -1350,7 +1350,7 @@
           <w:rFonts w:ascii="Arial" w:hAnsi="Arial" w:eastAsia="Arial" w:cs="Arial"/>
           <w:b/>
           <w:color w:val="2F5651"/>
-          <w:sz w:val="20"/>
+          <w:sz w:val="21"/>
         </w:rPr>
         <w:t>3</w:t>
       </w:r>
@@ -1367,7 +1367,7 @@
           <w:rFonts w:ascii="Arial" w:hAnsi="Arial" w:eastAsia="Arial" w:cs="Arial"/>
           <w:b/>
           <w:color w:val="2F5651"/>
-          <w:sz w:val="20"/>
+          <w:sz w:val="21"/>
         </w:rPr>
         <w:t>Assessment Method</w:t>
       </w:r>
@@ -1375,7 +1375,7 @@
         <w:rPr>
           <w:rFonts w:ascii="Arial" w:hAnsi="Arial" w:eastAsia="Arial" w:cs="Arial"/>
           <w:color w:val="2F5651"/>
-          <w:sz w:val="20"/>
+          <w:sz w:val="21"/>
         </w:rPr>
         <w:tab/>
       </w:r>
@@ -1384,7 +1384,7 @@
           <w:rFonts w:ascii="Arial" w:hAnsi="Arial" w:eastAsia="Arial" w:cs="Arial"/>
           <w:b/>
           <w:color w:val="2F5651"/>
-          <w:sz w:val="20"/>
+          <w:sz w:val="21"/>
         </w:rPr>
         <w:t>4</w:t>
       </w:r>
@@ -1401,7 +1401,7 @@
           <w:rFonts w:ascii="Arial" w:hAnsi="Arial" w:eastAsia="Arial" w:cs="Arial"/>
           <w:b w:val="0"/>
           <w:color w:val="263633"/>
-          <w:sz w:val="19"/>
+          <w:sz w:val="20"/>
         </w:rPr>
         <w:t>Assessment synthesis</w:t>
       </w:r>
@@ -1409,7 +1409,7 @@
         <w:rPr>
           <w:rFonts w:ascii="Arial" w:hAnsi="Arial" w:eastAsia="Arial" w:cs="Arial"/>
           <w:color w:val="263633"/>
-          <w:sz w:val="19"/>
+          <w:sz w:val="20"/>
         </w:rPr>
         <w:tab/>
       </w:r>
@@ -1418,7 +1418,7 @@
           <w:rFonts w:ascii="Arial" w:hAnsi="Arial" w:eastAsia="Arial" w:cs="Arial"/>
           <w:b w:val="0"/>
           <w:color w:val="263633"/>
-          <w:sz w:val="19"/>
+          <w:sz w:val="20"/>
         </w:rPr>
         <w:t>6</w:t>
       </w:r>
@@ -1435,7 +1435,7 @@
           <w:rFonts w:ascii="Arial" w:hAnsi="Arial" w:eastAsia="Arial" w:cs="Arial"/>
           <w:b/>
           <w:color w:val="2F5651"/>
-          <w:sz w:val="20"/>
+          <w:sz w:val="21"/>
         </w:rPr>
         <w:t>Assessment results for Functional Capacity</w:t>
       </w:r>
@@ -1443,7 +1443,7 @@
         <w:rPr>
           <w:rFonts w:ascii="Arial" w:hAnsi="Arial" w:eastAsia="Arial" w:cs="Arial"/>
           <w:color w:val="2F5651"/>
-          <w:sz w:val="20"/>
+          <w:sz w:val="21"/>
         </w:rPr>
         <w:tab/>
       </w:r>
@@ -1452,7 +1452,7 @@
           <w:rFonts w:ascii="Arial" w:hAnsi="Arial" w:eastAsia="Arial" w:cs="Arial"/>
           <w:b/>
           <w:color w:val="2F5651"/>
-          <w:sz w:val="20"/>
+          <w:sz w:val="21"/>
         </w:rPr>
         <w:t>7</w:t>
       </w:r>
@@ -1469,7 +1469,7 @@
           <w:rFonts w:ascii="Arial" w:hAnsi="Arial" w:eastAsia="Arial" w:cs="Arial"/>
           <w:b w:val="0"/>
           <w:color w:val="263633"/>
-          <w:sz w:val="19"/>
+          <w:sz w:val="20"/>
         </w:rPr>
         <w:t>Mobility</w:t>
       </w:r>
@@ -1477,7 +1477,7 @@
         <w:rPr>
           <w:rFonts w:ascii="Arial" w:hAnsi="Arial" w:eastAsia="Arial" w:cs="Arial"/>
           <w:color w:val="263633"/>
-          <w:sz w:val="19"/>
+          <w:sz w:val="20"/>
         </w:rPr>
         <w:tab/>
       </w:r>
@@ -1486,7 +1486,7 @@
           <w:rFonts w:ascii="Arial" w:hAnsi="Arial" w:eastAsia="Arial" w:cs="Arial"/>
           <w:b w:val="0"/>
           <w:color w:val="263633"/>
-          <w:sz w:val="19"/>
+          <w:sz w:val="20"/>
         </w:rPr>
         <w:t>8</w:t>
       </w:r>
@@ -1503,7 +1503,7 @@
           <w:rFonts w:ascii="Arial" w:hAnsi="Arial" w:eastAsia="Arial" w:cs="Arial"/>
           <w:b w:val="0"/>
           <w:color w:val="263633"/>
-          <w:sz w:val="19"/>
+          <w:sz w:val="20"/>
         </w:rPr>
         <w:t>Cognition</w:t>
       </w:r>
@@ -1511,7 +1511,7 @@
         <w:rPr>
           <w:rFonts w:ascii="Arial" w:hAnsi="Arial" w:eastAsia="Arial" w:cs="Arial"/>
           <w:color w:val="263633"/>
-          <w:sz w:val="19"/>
+          <w:sz w:val="20"/>
         </w:rPr>
         <w:tab/>
       </w:r>
@@ -1520,7 +1520,7 @@
           <w:rFonts w:ascii="Arial" w:hAnsi="Arial" w:eastAsia="Arial" w:cs="Arial"/>
           <w:b w:val="0"/>
           <w:color w:val="263633"/>
-          <w:sz w:val="19"/>
+          <w:sz w:val="20"/>
         </w:rPr>
         <w:t>9</w:t>
       </w:r>
@@ -1537,7 +1537,7 @@
           <w:rFonts w:ascii="Arial" w:hAnsi="Arial" w:eastAsia="Arial" w:cs="Arial"/>
           <w:b w:val="0"/>
           <w:color w:val="263633"/>
-          <w:sz w:val="19"/>
+          <w:sz w:val="20"/>
         </w:rPr>
         <w:t>Communication</w:t>
       </w:r>
@@ -1545,7 +1545,7 @@
         <w:rPr>
           <w:rFonts w:ascii="Arial" w:hAnsi="Arial" w:eastAsia="Arial" w:cs="Arial"/>
           <w:color w:val="263633"/>
-          <w:sz w:val="19"/>
+          <w:sz w:val="20"/>
         </w:rPr>
         <w:tab/>
       </w:r>
@@ -1554,7 +1554,7 @@
           <w:rFonts w:ascii="Arial" w:hAnsi="Arial" w:eastAsia="Arial" w:cs="Arial"/>
           <w:b w:val="0"/>
           <w:color w:val="263633"/>
-          <w:sz w:val="19"/>
+          <w:sz w:val="20"/>
         </w:rPr>
         <w:t>10</w:t>
       </w:r>
@@ -1571,7 +1571,7 @@
           <w:rFonts w:ascii="Arial" w:hAnsi="Arial" w:eastAsia="Arial" w:cs="Arial"/>
           <w:b w:val="0"/>
           <w:color w:val="263633"/>
-          <w:sz w:val="19"/>
+          <w:sz w:val="20"/>
         </w:rPr>
         <w:t>Psychological/Emotional</w:t>
       </w:r>
@@ -1579,7 +1579,7 @@
         <w:rPr>
           <w:rFonts w:ascii="Arial" w:hAnsi="Arial" w:eastAsia="Arial" w:cs="Arial"/>
           <w:color w:val="263633"/>
-          <w:sz w:val="19"/>
+          <w:sz w:val="20"/>
         </w:rPr>
         <w:tab/>
       </w:r>
@@ -1588,7 +1588,7 @@
           <w:rFonts w:ascii="Arial" w:hAnsi="Arial" w:eastAsia="Arial" w:cs="Arial"/>
           <w:b w:val="0"/>
           <w:color w:val="263633"/>
-          <w:sz w:val="19"/>
+          <w:sz w:val="20"/>
         </w:rPr>
         <w:t>11</w:t>
       </w:r>
@@ -1605,7 +1605,7 @@
           <w:rFonts w:ascii="Arial" w:hAnsi="Arial" w:eastAsia="Arial" w:cs="Arial"/>
           <w:b w:val="0"/>
           <w:color w:val="263633"/>
-          <w:sz w:val="19"/>
+          <w:sz w:val="20"/>
         </w:rPr>
         <w:t>Self-Care ADLs</w:t>
       </w:r>
@@ -1613,7 +1613,7 @@
         <w:rPr>
           <w:rFonts w:ascii="Arial" w:hAnsi="Arial" w:eastAsia="Arial" w:cs="Arial"/>
           <w:color w:val="263633"/>
-          <w:sz w:val="19"/>
+          <w:sz w:val="20"/>
         </w:rPr>
         <w:tab/>
       </w:r>
@@ -1622,7 +1622,7 @@
           <w:rFonts w:ascii="Arial" w:hAnsi="Arial" w:eastAsia="Arial" w:cs="Arial"/>
           <w:b w:val="0"/>
           <w:color w:val="263633"/>
-          <w:sz w:val="19"/>
+          <w:sz w:val="20"/>
         </w:rPr>
         <w:t>12</w:t>
       </w:r>
@@ -1639,7 +1639,7 @@
           <w:rFonts w:ascii="Arial" w:hAnsi="Arial" w:eastAsia="Arial" w:cs="Arial"/>
           <w:b w:val="0"/>
           <w:color w:val="263633"/>
-          <w:sz w:val="19"/>
+          <w:sz w:val="20"/>
         </w:rPr>
         <w:t>Domestic ADLs</w:t>
       </w:r>
@@ -1647,7 +1647,7 @@
         <w:rPr>
           <w:rFonts w:ascii="Arial" w:hAnsi="Arial" w:eastAsia="Arial" w:cs="Arial"/>
           <w:color w:val="263633"/>
-          <w:sz w:val="19"/>
+          <w:sz w:val="20"/>
         </w:rPr>
         <w:tab/>
       </w:r>
@@ -1656,7 +1656,7 @@
           <w:rFonts w:ascii="Arial" w:hAnsi="Arial" w:eastAsia="Arial" w:cs="Arial"/>
           <w:b w:val="0"/>
           <w:color w:val="263633"/>
-          <w:sz w:val="19"/>
+          <w:sz w:val="20"/>
         </w:rPr>
         <w:t>13</w:t>
       </w:r>
@@ -1673,7 +1673,7 @@
           <w:rFonts w:ascii="Arial" w:hAnsi="Arial" w:eastAsia="Arial" w:cs="Arial"/>
           <w:b w:val="0"/>
           <w:color w:val="263633"/>
-          <w:sz w:val="19"/>
+          <w:sz w:val="20"/>
         </w:rPr>
         <w:t>Community Access</w:t>
       </w:r>
@@ -1681,7 +1681,7 @@
         <w:rPr>
           <w:rFonts w:ascii="Arial" w:hAnsi="Arial" w:eastAsia="Arial" w:cs="Arial"/>
           <w:color w:val="263633"/>
-          <w:sz w:val="19"/>
+          <w:sz w:val="20"/>
         </w:rPr>
         <w:tab/>
       </w:r>
@@ -1690,7 +1690,7 @@
           <w:rFonts w:ascii="Arial" w:hAnsi="Arial" w:eastAsia="Arial" w:cs="Arial"/>
           <w:b w:val="0"/>
           <w:color w:val="263633"/>
-          <w:sz w:val="19"/>
+          <w:sz w:val="20"/>
         </w:rPr>
         <w:t>14</w:t>
       </w:r>
@@ -1707,7 +1707,7 @@
           <w:rFonts w:ascii="Arial" w:hAnsi="Arial" w:eastAsia="Arial" w:cs="Arial"/>
           <w:b w:val="0"/>
           <w:color w:val="263633"/>
-          <w:sz w:val="19"/>
+          <w:sz w:val="20"/>
         </w:rPr>
         <w:t>Behaviours of Concern</w:t>
       </w:r>
@@ -1715,7 +1715,7 @@
         <w:rPr>
           <w:rFonts w:ascii="Arial" w:hAnsi="Arial" w:eastAsia="Arial" w:cs="Arial"/>
           <w:color w:val="263633"/>
-          <w:sz w:val="19"/>
+          <w:sz w:val="20"/>
         </w:rPr>
         <w:tab/>
       </w:r>
@@ -1724,7 +1724,7 @@
           <w:rFonts w:ascii="Arial" w:hAnsi="Arial" w:eastAsia="Arial" w:cs="Arial"/>
           <w:b w:val="0"/>
           <w:color w:val="263633"/>
-          <w:sz w:val="19"/>
+          <w:sz w:val="20"/>
         </w:rPr>
         <w:t>15</w:t>
       </w:r>
@@ -1741,7 +1741,7 @@
           <w:rFonts w:ascii="Arial" w:hAnsi="Arial" w:eastAsia="Arial" w:cs="Arial"/>
           <w:b w:val="0"/>
           <w:color w:val="263633"/>
-          <w:sz w:val="19"/>
+          <w:sz w:val="20"/>
         </w:rPr>
         <w:t>Home Modifications and Assistive Technology</w:t>
       </w:r>
@@ -1749,7 +1749,7 @@
         <w:rPr>
           <w:rFonts w:ascii="Arial" w:hAnsi="Arial" w:eastAsia="Arial" w:cs="Arial"/>
           <w:color w:val="263633"/>
-          <w:sz w:val="19"/>
+          <w:sz w:val="20"/>
         </w:rPr>
         <w:tab/>
       </w:r>
@@ -1758,7 +1758,7 @@
           <w:rFonts w:ascii="Arial" w:hAnsi="Arial" w:eastAsia="Arial" w:cs="Arial"/>
           <w:b w:val="0"/>
           <w:color w:val="263633"/>
-          <w:sz w:val="19"/>
+          <w:sz w:val="20"/>
         </w:rPr>
         <w:t>16</w:t>
       </w:r>
@@ -1775,7 +1775,7 @@
           <w:rFonts w:ascii="Arial" w:hAnsi="Arial" w:eastAsia="Arial" w:cs="Arial"/>
           <w:b/>
           <w:color w:val="2F5651"/>
-          <w:sz w:val="20"/>
+          <w:sz w:val="21"/>
         </w:rPr>
         <w:t>Summary and Recommendations</w:t>
       </w:r>
@@ -1783,7 +1783,7 @@
         <w:rPr>
           <w:rFonts w:ascii="Arial" w:hAnsi="Arial" w:eastAsia="Arial" w:cs="Arial"/>
           <w:color w:val="2F5651"/>
-          <w:sz w:val="20"/>
+          <w:sz w:val="21"/>
         </w:rPr>
         <w:tab/>
       </w:r>
@@ -1792,7 +1792,7 @@
           <w:rFonts w:ascii="Arial" w:hAnsi="Arial" w:eastAsia="Arial" w:cs="Arial"/>
           <w:b/>
           <w:color w:val="2F5651"/>
-          <w:sz w:val="20"/>
+          <w:sz w:val="21"/>
         </w:rPr>
         <w:t>17</w:t>
       </w:r>
@@ -1809,7 +1809,7 @@
           <w:rFonts w:ascii="Arial" w:hAnsi="Arial" w:eastAsia="Arial" w:cs="Arial"/>
           <w:b w:val="0"/>
           <w:color w:val="263633"/>
-          <w:sz w:val="19"/>
+          <w:sz w:val="20"/>
         </w:rPr>
         <w:t>Core Supports</w:t>
       </w:r>
@@ -1817,7 +1817,7 @@
         <w:rPr>
           <w:rFonts w:ascii="Arial" w:hAnsi="Arial" w:eastAsia="Arial" w:cs="Arial"/>
           <w:color w:val="263633"/>
-          <w:sz w:val="19"/>
+          <w:sz w:val="20"/>
         </w:rPr>
         <w:tab/>
       </w:r>
@@ -1826,7 +1826,7 @@
           <w:rFonts w:ascii="Arial" w:hAnsi="Arial" w:eastAsia="Arial" w:cs="Arial"/>
           <w:b w:val="0"/>
           <w:color w:val="263633"/>
-          <w:sz w:val="19"/>
+          <w:sz w:val="20"/>
         </w:rPr>
         <w:t>18</w:t>
       </w:r>
@@ -1843,7 +1843,7 @@
           <w:rFonts w:ascii="Arial" w:hAnsi="Arial" w:eastAsia="Arial" w:cs="Arial"/>
           <w:b w:val="0"/>
           <w:color w:val="263633"/>
-          <w:sz w:val="19"/>
+          <w:sz w:val="20"/>
         </w:rPr>
         <w:t>Capacity Building</w:t>
       </w:r>
@@ -1851,7 +1851,7 @@
         <w:rPr>
           <w:rFonts w:ascii="Arial" w:hAnsi="Arial" w:eastAsia="Arial" w:cs="Arial"/>
           <w:color w:val="263633"/>
-          <w:sz w:val="19"/>
+          <w:sz w:val="20"/>
         </w:rPr>
         <w:tab/>
       </w:r>
@@ -1860,7 +1860,7 @@
           <w:rFonts w:ascii="Arial" w:hAnsi="Arial" w:eastAsia="Arial" w:cs="Arial"/>
           <w:b w:val="0"/>
           <w:color w:val="263633"/>
-          <w:sz w:val="19"/>
+          <w:sz w:val="20"/>
         </w:rPr>
         <w:t>19</w:t>
       </w:r>
@@ -1877,7 +1877,7 @@
           <w:rFonts w:ascii="Arial" w:hAnsi="Arial" w:eastAsia="Arial" w:cs="Arial"/>
           <w:b/>
           <w:color w:val="2F5651"/>
-          <w:sz w:val="20"/>
+          <w:sz w:val="21"/>
         </w:rPr>
         <w:t>Professional Declaration</w:t>
       </w:r>
@@ -1885,7 +1885,7 @@
         <w:rPr>
           <w:rFonts w:ascii="Arial" w:hAnsi="Arial" w:eastAsia="Arial" w:cs="Arial"/>
           <w:color w:val="2F5651"/>
-          <w:sz w:val="20"/>
+          <w:sz w:val="21"/>
         </w:rPr>
         <w:tab/>
       </w:r>
@@ -1894,7 +1894,7 @@
           <w:rFonts w:ascii="Arial" w:hAnsi="Arial" w:eastAsia="Arial" w:cs="Arial"/>
           <w:b/>
           <w:color w:val="2F5651"/>
-          <w:sz w:val="20"/>
+          <w:sz w:val="21"/>
         </w:rPr>
         <w:t>20</w:t>
       </w:r>
@@ -1911,7 +1911,7 @@
           <w:rFonts w:ascii="Arial" w:hAnsi="Arial" w:eastAsia="Arial" w:cs="Arial"/>
           <w:b/>
           <w:color w:val="2F5651"/>
-          <w:sz w:val="20"/>
+          <w:sz w:val="21"/>
         </w:rPr>
         <w:t>Appendices</w:t>
       </w:r>
@@ -1919,7 +1919,7 @@
         <w:rPr>
           <w:rFonts w:ascii="Arial" w:hAnsi="Arial" w:eastAsia="Arial" w:cs="Arial"/>
           <w:color w:val="2F5651"/>
-          <w:sz w:val="20"/>
+          <w:sz w:val="21"/>
         </w:rPr>
         <w:tab/>
       </w:r>
@@ -1928,7 +1928,7 @@
           <w:rFonts w:ascii="Arial" w:hAnsi="Arial" w:eastAsia="Arial" w:cs="Arial"/>
           <w:b/>
           <w:color w:val="2F5651"/>
-          <w:sz w:val="20"/>
+          <w:sz w:val="21"/>
         </w:rPr>
         <w:t>21</w:t>
       </w:r>
@@ -4439,7 +4439,7 @@
                 <w:pStyle w:val="OPAL–Placeholder"/>
               </w:pPr>
               <w:r>
-                <w:t>[Identify the version and respondent, administration date and conditions, total/domain scores, functional impact rating, comparison with observation and the clinical meaning of the results. Avoid interpreting a score outside the measure’s instructions.]</w:t>
+                <w:t>Identify the version and respondent, administration date and conditions, total/domain scores, functional impact rating, comparison with observation and the clinical meaning of the results. Avoid interpreting a score outside the measure’s instructions.</w:t>
               </w:r>
             </w:p>
             <w:tbl>
@@ -4620,7 +4620,7 @@
                         <w:i/>
                         <w:color w:val="566E70"/>
                       </w:rPr>
-                      <w:t>[ /30]</w:t>
+                      <w:t>/30</w:t>
                     </w:r>
                   </w:p>
                 </w:tc>
@@ -4646,7 +4646,7 @@
                         <w:i/>
                         <w:color w:val="566E70"/>
                       </w:rPr>
-                      <w:t>[SCORE]</w:t>
+                      <w:t>SCORE</w:t>
                     </w:r>
                   </w:p>
                 </w:tc>
@@ -4672,7 +4672,7 @@
                         <w:i/>
                         <w:color w:val="566E70"/>
                       </w:rPr>
-                      <w:t>[IMPACT / INTERPRETATION]</w:t>
+                      <w:t>IMPACT / INTERPRETATION</w:t>
                     </w:r>
                   </w:p>
                 </w:tc>
@@ -4729,7 +4729,7 @@
                         <w:i/>
                         <w:color w:val="566E70"/>
                       </w:rPr>
-                      <w:t>[ /25]</w:t>
+                      <w:t>/25</w:t>
                     </w:r>
                   </w:p>
                 </w:tc>
@@ -4756,7 +4756,7 @@
                         <w:i/>
                         <w:color w:val="566E70"/>
                       </w:rPr>
-                      <w:t>[SCORE]</w:t>
+                      <w:t>SCORE</w:t>
                     </w:r>
                   </w:p>
                 </w:tc>
@@ -4783,7 +4783,7 @@
                         <w:i/>
                         <w:color w:val="566E70"/>
                       </w:rPr>
-                      <w:t>[IMPACT / INTERPRETATION]</w:t>
+                      <w:t>IMPACT / INTERPRETATION</w:t>
                     </w:r>
                   </w:p>
                 </w:tc>
@@ -4838,7 +4838,7 @@
                         <w:i/>
                         <w:color w:val="566E70"/>
                       </w:rPr>
-                      <w:t>[ /20]</w:t>
+                      <w:t>/20</w:t>
                     </w:r>
                   </w:p>
                 </w:tc>
@@ -4864,7 +4864,7 @@
                         <w:i/>
                         <w:color w:val="566E70"/>
                       </w:rPr>
-                      <w:t>[SCORE]</w:t>
+                      <w:t>SCORE</w:t>
                     </w:r>
                   </w:p>
                 </w:tc>
@@ -4890,7 +4890,7 @@
                         <w:i/>
                         <w:color w:val="566E70"/>
                       </w:rPr>
-                      <w:t>[IMPACT / INTERPRETATION]</w:t>
+                      <w:t>IMPACT / INTERPRETATION</w:t>
                     </w:r>
                   </w:p>
                 </w:tc>
@@ -4947,7 +4947,7 @@
                         <w:i/>
                         <w:color w:val="566E70"/>
                       </w:rPr>
-                      <w:t>[ /25]</w:t>
+                      <w:t>/25</w:t>
                     </w:r>
                   </w:p>
                 </w:tc>
@@ -4974,7 +4974,7 @@
                         <w:i/>
                         <w:color w:val="566E70"/>
                       </w:rPr>
-                      <w:t>[SCORE]</w:t>
+                      <w:t>SCORE</w:t>
                     </w:r>
                   </w:p>
                 </w:tc>
@@ -5001,7 +5001,7 @@
                         <w:i/>
                         <w:color w:val="566E70"/>
                       </w:rPr>
-                      <w:t>[IMPACT / INTERPRETATION]</w:t>
+                      <w:t>IMPACT / INTERPRETATION</w:t>
                     </w:r>
                   </w:p>
                 </w:tc>
@@ -5056,7 +5056,7 @@
                         <w:i/>
                         <w:color w:val="566E70"/>
                       </w:rPr>
-                      <w:t>[ /20]</w:t>
+                      <w:t>/20</w:t>
                     </w:r>
                   </w:p>
                 </w:tc>
@@ -5082,7 +5082,7 @@
                         <w:i/>
                         <w:color w:val="566E70"/>
                       </w:rPr>
-                      <w:t>[SCORE]</w:t>
+                      <w:t>SCORE</w:t>
                     </w:r>
                   </w:p>
                 </w:tc>
@@ -5108,7 +5108,7 @@
                         <w:i/>
                         <w:color w:val="566E70"/>
                       </w:rPr>
-                      <w:t>[IMPACT / INTERPRETATION]</w:t>
+                      <w:t>IMPACT / INTERPRETATION</w:t>
                     </w:r>
                   </w:p>
                 </w:tc>
@@ -5165,7 +5165,7 @@
                         <w:i/>
                         <w:color w:val="566E70"/>
                       </w:rPr>
-                      <w:t>[ /20 OR N/A]</w:t>
+                      <w:t>/20 OR N/A</w:t>
                     </w:r>
                   </w:p>
                 </w:tc>
@@ -5192,7 +5192,7 @@
                         <w:i/>
                         <w:color w:val="566E70"/>
                       </w:rPr>
-                      <w:t>[SCORE]</w:t>
+                      <w:t>SCORE</w:t>
                     </w:r>
                   </w:p>
                 </w:tc>
@@ -5219,7 +5219,7 @@
                         <w:i/>
                         <w:color w:val="566E70"/>
                       </w:rPr>
-                      <w:t>[IMPACT / INTERPRETATION]</w:t>
+                      <w:t>IMPACT / INTERPRETATION</w:t>
                     </w:r>
                   </w:p>
                 </w:tc>
@@ -5274,7 +5274,7 @@
                         <w:i/>
                         <w:color w:val="566E70"/>
                       </w:rPr>
-                      <w:t>[ /40]</w:t>
+                      <w:t>/40</w:t>
                     </w:r>
                   </w:p>
                 </w:tc>
@@ -5300,7 +5300,7 @@
                         <w:i/>
                         <w:color w:val="566E70"/>
                       </w:rPr>
-                      <w:t>[SCORE]</w:t>
+                      <w:t>SCORE</w:t>
                     </w:r>
                   </w:p>
                 </w:tc>
@@ -5326,7 +5326,7 @@
                         <w:i/>
                         <w:color w:val="566E70"/>
                       </w:rPr>
-                      <w:t>[IMPACT / INTERPRETATION]</w:t>
+                      <w:t>IMPACT / INTERPRETATION</w:t>
                     </w:r>
                   </w:p>
                 </w:tc>
@@ -5383,7 +5383,7 @@
                         <w:i/>
                         <w:color w:val="566E70"/>
                       </w:rPr>
-                      <w:t>[RAW SCORE]</w:t>
+                      <w:t>RAW SCORE</w:t>
                     </w:r>
                   </w:p>
                 </w:tc>
@@ -5410,7 +5410,7 @@
                         <w:i/>
                         <w:color w:val="566E70"/>
                       </w:rPr>
-                      <w:t>[TOTAL / PERCENTAGE]</w:t>
+                      <w:t>TOTAL / PERCENTAGE</w:t>
                     </w:r>
                   </w:p>
                 </w:tc>
@@ -5437,7 +5437,7 @@
                         <w:i/>
                         <w:color w:val="566E70"/>
                       </w:rPr>
-                      <w:t>[OVERALL CLINICAL INTERPRETATION]</w:t>
+                      <w:t>OVERALL CLINICAL INTERPRETATION</w:t>
                     </w:r>
                   </w:p>
                 </w:tc>
@@ -10333,7 +10333,7 @@
         <w:rFonts w:ascii="Arial" w:hAnsi="Arial" w:eastAsia="Arial" w:cs="Arial"/>
         <w:b/>
         <w:color w:val="2F5651"/>
-        <w:sz w:val="15"/>
+        <w:sz w:val="16"/>
       </w:rPr>
       <w:t>FUNCTIONAL ASSESSMENT REPORT</w:t>
     </w:r>
@@ -10359,7 +10359,7 @@
             <w:rFonts w:ascii="Arial" w:hAnsi="Arial" w:eastAsia="Arial" w:cs="Arial"/>
             <w:b w:val="0"/>
             <w:color w:val="566E70"/>
-            <w:sz w:val="14"/>
+            <w:sz w:val="15"/>
           </w:rPr>
           <w:t>[PORTAL — CLIENT NAME]</w:t>
         </w:r>
@@ -10370,7 +10370,7 @@
         <w:rFonts w:ascii="Arial" w:hAnsi="Arial" w:eastAsia="Arial" w:cs="Arial"/>
         <w:b w:val="0"/>
         <w:color w:val="566E70"/>
-        <w:sz w:val="14"/>
+        <w:sz w:val="15"/>
       </w:rPr>
       <w:t xml:space="preserve"> | NDIS </w:t>
     </w:r>
@@ -10386,7 +10386,7 @@
             <w:rFonts w:ascii="Arial" w:hAnsi="Arial" w:eastAsia="Arial" w:cs="Arial"/>
             <w:b w:val="0"/>
             <w:color w:val="566E70"/>
-            <w:sz w:val="14"/>
+            <w:sz w:val="15"/>
           </w:rPr>
           <w:t>[PORTAL — NDIS NUMBER]</w:t>
         </w:r>
@@ -19127,7 +19127,7 @@
     <w:name w:val="Normal"/>
     <w:rsid w:val="00465943"/>
     <w:pPr>
-      <w:spacing w:after="120" w:line="269" w:lineRule="auto" w:before="0"/>
+      <w:spacing w:before="0" w:after="140" w:line="288" w:lineRule="auto"/>
     </w:pPr>
     <w:rPr>
       <w:rFonts w:asciiTheme="minorHAnsi" w:hAnsiTheme="minorHAnsi" w:ascii="Arial" w:hAnsi="Arial" w:eastAsia="Arial" w:cs="Arial"/>
@@ -19135,7 +19135,7 @@
       <w:i w:val="0"/>
       <w:color w:val="263633"/>
       <w:spacing w:val="-5"/>
-      <w:sz w:val="21"/>
+      <w:sz w:val="22"/>
     </w:rPr>
     <w:semiHidden/>
   </w:style>
@@ -19197,7 +19197,7 @@
     <w:rPr>
       <w:i w:val="0"/>
       <w:iCs w:val="0"/>
-      <w:sz w:val="22"/>
+      <w:sz w:val="24"/>
       <w:szCs w:val="22"/>
     </w:rPr>
     <w:semiHidden/>
@@ -19215,7 +19215,7 @@
     </w:pPr>
     <w:rPr>
       <w:rFonts w:cstheme="minorHAnsi"/>
-      <w:sz w:val="20"/>
+      <w:sz w:val="21"/>
     </w:rPr>
   </w:style>
   <w:style w:type="character" w:styleId="Hyperlink">
@@ -19234,14 +19234,14 @@
     <w:uiPriority w:val="1"/>
     <w:qFormat/>
     <w:pPr>
-      <w:spacing w:before="0" w:after="120" w:line="269" w:lineRule="auto"/>
+      <w:spacing w:before="0" w:after="140" w:line="288" w:lineRule="auto"/>
     </w:pPr>
     <w:rPr>
       <w:rFonts w:ascii="Arial" w:hAnsi="Arial" w:eastAsia="Arial" w:cs="Arial"/>
       <w:b w:val="0"/>
       <w:i w:val="0"/>
       <w:color w:val="263633"/>
-      <w:sz w:val="21"/>
+      <w:sz w:val="22"/>
     </w:rPr>
   </w:style>
   <w:style w:type="paragraph" w:customStyle="1" w:styleId="OPAL–BodyEmphasis">
@@ -19250,14 +19250,14 @@
     <w:uiPriority w:val="2"/>
     <w:qFormat/>
     <w:pPr>
-      <w:spacing w:after="120"/>
+      <w:spacing w:after="140"/>
     </w:pPr>
     <w:rPr>
       <w:rFonts w:ascii="Arial" w:hAnsi="Arial" w:eastAsia="Arial" w:cs="Arial"/>
       <w:b/>
       <w:i w:val="0"/>
       <w:color w:val="2F5651"/>
-      <w:sz w:val="21"/>
+      <w:sz w:val="22"/>
     </w:rPr>
   </w:style>
   <w:style w:type="paragraph" w:customStyle="1" w:styleId="OPAL–DocumentTitle">
@@ -19293,7 +19293,7 @@
       <w:b w:val="0"/>
       <w:i w:val="0"/>
       <w:color w:val="566E70"/>
-      <w:sz w:val="26"/>
+      <w:sz w:val="27"/>
     </w:rPr>
   </w:style>
   <w:style w:type="paragraph" w:customStyle="1" w:styleId="OPAL–Heading1">
@@ -19304,7 +19304,7 @@
     <w:pPr>
       <w:keepNext/>
       <w:keepLines/>
-      <w:spacing w:before="320" w:after="160"/>
+      <w:spacing w:before="360" w:after="180"/>
       <w:outlineLvl w:val="0"/>
     </w:pPr>
     <w:rPr>
@@ -19312,7 +19312,7 @@
       <w:b/>
       <w:i w:val="0"/>
       <w:color w:val="2F5651"/>
-      <w:sz w:val="38"/>
+      <w:sz w:val="40"/>
     </w:rPr>
   </w:style>
   <w:style w:type="paragraph" w:customStyle="1" w:styleId="OPAL–Heading2">
@@ -19323,7 +19323,7 @@
     <w:pPr>
       <w:keepNext/>
       <w:keepLines/>
-      <w:spacing w:before="260" w:after="100"/>
+      <w:spacing w:before="300" w:after="120"/>
       <w:outlineLvl w:val="1"/>
     </w:pPr>
     <w:rPr>
@@ -19331,7 +19331,7 @@
       <w:b/>
       <w:i w:val="0"/>
       <w:color w:val="2F5651"/>
-      <w:sz w:val="28"/>
+      <w:sz w:val="30"/>
     </w:rPr>
   </w:style>
   <w:style w:type="paragraph" w:customStyle="1" w:styleId="OPAL–Heading3">
@@ -19342,7 +19342,7 @@
     <w:pPr>
       <w:keepNext/>
       <w:keepLines/>
-      <w:spacing w:before="200" w:after="60"/>
+      <w:spacing w:before="240" w:after="80"/>
       <w:outlineLvl w:val="2"/>
     </w:pPr>
     <w:rPr>
@@ -19350,7 +19350,7 @@
       <w:b/>
       <w:i w:val="0"/>
       <w:color w:val="566E70"/>
-      <w:sz w:val="23"/>
+      <w:sz w:val="24"/>
     </w:rPr>
   </w:style>
   <w:style w:type="paragraph" w:customStyle="1" w:styleId="OPAL–Heading4">
@@ -19361,7 +19361,7 @@
     <w:pPr>
       <w:keepNext/>
       <w:keepLines/>
-      <w:spacing w:before="160" w:after="40"/>
+      <w:spacing w:before="180" w:after="60"/>
       <w:outlineLvl w:val="3"/>
     </w:pPr>
     <w:rPr>
@@ -19369,7 +19369,7 @@
       <w:b/>
       <w:i w:val="0"/>
       <w:color w:val="263633"/>
-      <w:sz w:val="21"/>
+      <w:sz w:val="22"/>
     </w:rPr>
   </w:style>
   <w:style w:type="paragraph" w:customStyle="1" w:styleId="OPAL–Placeholder">
@@ -19378,7 +19378,7 @@
     <w:uiPriority w:val="13"/>
     <w:qFormat/>
     <w:pPr>
-      <w:spacing w:before="60" w:after="140"/>
+      <w:spacing w:before="80" w:after="160" w:line="288" w:lineRule="auto"/>
       <w:ind w:left="216" w:right="144"/>
       <w:shd w:val="clear" w:fill="E8F1EC"/>
       <w:pBdr>
@@ -19390,7 +19390,7 @@
       <w:b w:val="0"/>
       <w:i/>
       <w:color w:val="566E70"/>
-      <w:sz w:val="20"/>
+      <w:sz w:val="21"/>
     </w:rPr>
   </w:style>
   <w:style w:type="paragraph" w:customStyle="1" w:styleId="OPAL–ClinicalPrompt">
@@ -19400,7 +19400,7 @@
     <w:qFormat/>
     <w:pPr>
       <w:keepLines/>
-      <w:spacing w:before="80" w:after="160"/>
+      <w:spacing w:before="100" w:after="180"/>
       <w:ind w:left="216" w:right="144"/>
       <w:shd w:val="clear" w:fill="F6EDE5"/>
       <w:pBdr>
@@ -19412,7 +19412,7 @@
       <w:b w:val="0"/>
       <w:i/>
       <w:color w:val="566E70"/>
-      <w:sz w:val="18"/>
+      <w:sz w:val="19"/>
     </w:rPr>
   </w:style>
   <w:style w:type="paragraph" w:customStyle="1" w:styleId="OPAL–KeyFinding">
@@ -19422,7 +19422,7 @@
     <w:qFormat/>
     <w:pPr>
       <w:keepLines/>
-      <w:spacing w:before="100" w:after="180"/>
+      <w:spacing w:before="120" w:after="200"/>
       <w:ind w:left="245" w:right="144"/>
       <w:shd w:val="clear" w:fill="E8F1EC"/>
       <w:pBdr>
@@ -19434,7 +19434,7 @@
       <w:b/>
       <w:i w:val="0"/>
       <w:color w:val="2F5651"/>
-      <w:sz w:val="21"/>
+      <w:sz w:val="22"/>
     </w:rPr>
   </w:style>
   <w:style w:type="paragraph" w:customStyle="1" w:styleId="OPAL–Recommendation">
@@ -19444,7 +19444,7 @@
     <w:qFormat/>
     <w:pPr>
       <w:keepLines/>
-      <w:spacing w:before="100" w:after="160"/>
+      <w:spacing w:before="120" w:after="180"/>
       <w:ind w:left="245" w:right="144"/>
       <w:shd w:val="clear" w:fill="FAF7F2"/>
       <w:pBdr>
@@ -19456,7 +19456,7 @@
       <w:b w:val="0"/>
       <w:i w:val="0"/>
       <w:color w:val="263633"/>
-      <w:sz w:val="20"/>
+      <w:sz w:val="21"/>
     </w:rPr>
   </w:style>
   <w:style w:type="paragraph" w:customStyle="1" w:styleId="OPAL–Caption">
@@ -19466,14 +19466,14 @@
     <w:qFormat/>
     <w:pPr>
       <w:keepNext/>
-      <w:spacing w:before="60" w:after="160"/>
+      <w:spacing w:before="80" w:after="180"/>
     </w:pPr>
     <w:rPr>
       <w:rFonts w:ascii="Arial" w:hAnsi="Arial" w:eastAsia="Arial" w:cs="Arial"/>
       <w:b w:val="0"/>
       <w:i/>
       <w:color w:val="62716E"/>
-      <w:sz w:val="17"/>
+      <w:sz w:val="18"/>
     </w:rPr>
   </w:style>
   <w:style w:type="paragraph" w:customStyle="1" w:styleId="OPAL–TableHeader">
@@ -19482,14 +19482,14 @@
     <w:uiPriority w:val="99"/>
     <w:semiHidden/>
     <w:pPr>
-      <w:spacing w:after="0" w:line="240" w:lineRule="auto"/>
+      <w:spacing w:before="20" w:after="20" w:line="252" w:lineRule="auto"/>
     </w:pPr>
     <w:rPr>
       <w:rFonts w:ascii="Arial" w:hAnsi="Arial" w:eastAsia="Arial" w:cs="Arial"/>
       <w:b/>
       <w:i w:val="0"/>
       <w:color w:val="FFFFFF"/>
-      <w:sz w:val="18"/>
+      <w:sz w:val="19"/>
     </w:rPr>
   </w:style>
   <w:style w:type="paragraph" w:customStyle="1" w:styleId="OPAL–TableBody">
@@ -19498,14 +19498,14 @@
     <w:uiPriority w:val="99"/>
     <w:semiHidden/>
     <w:pPr>
-      <w:spacing w:after="0" w:line="252" w:lineRule="auto"/>
+      <w:spacing w:before="20" w:after="20" w:line="264" w:lineRule="auto"/>
     </w:pPr>
     <w:rPr>
       <w:rFonts w:ascii="Arial" w:hAnsi="Arial" w:eastAsia="Arial" w:cs="Arial"/>
       <w:b w:val="0"/>
       <w:i w:val="0"/>
       <w:color w:val="263633"/>
-      <w:sz w:val="18"/>
+      <w:sz w:val="19"/>
     </w:rPr>
   </w:style>
   <w:style w:type="paragraph" w:customStyle="1" w:styleId="OPAL–DocumentControl">
@@ -19521,7 +19521,7 @@
       <w:b w:val="0"/>
       <w:i w:val="0"/>
       <w:color w:val="566E70"/>
-      <w:sz w:val="17"/>
+      <w:sz w:val="18"/>
     </w:rPr>
   </w:style>
   <w:style w:type="paragraph" w:customStyle="1" w:styleId="OPAL–Header">
@@ -19537,7 +19537,7 @@
       <w:b/>
       <w:i w:val="0"/>
       <w:color w:val="566E70"/>
-      <w:sz w:val="16"/>
+      <w:sz w:val="17"/>
     </w:rPr>
   </w:style>
   <w:style w:type="paragraph" w:customStyle="1" w:styleId="OPAL–Footer">
@@ -19553,7 +19553,7 @@
       <w:b w:val="0"/>
       <w:i w:val="0"/>
       <w:color w:val="62716E"/>
-      <w:sz w:val="16"/>
+      <w:sz w:val="17"/>
     </w:rPr>
   </w:style>
   <w:style w:type="paragraph" w:customStyle="1" w:styleId="OPAL–Bullet">
@@ -19562,7 +19562,7 @@
     <w:uiPriority w:val="3"/>
     <w:qFormat/>
     <w:pPr>
-      <w:spacing w:after="60"/>
+      <w:spacing w:after="80"/>
       <w:ind w:left="540" w:hanging="259"/>
       <w:numPr>
         <w:ilvl w:val="0"/>
@@ -19574,7 +19574,7 @@
       <w:b w:val="0"/>
       <w:i w:val="0"/>
       <w:color w:val="263633"/>
-      <w:sz w:val="21"/>
+      <w:sz w:val="22"/>
     </w:rPr>
   </w:style>
   <w:style w:type="paragraph" w:customStyle="1" w:styleId="OPAL–NumberedList">
@@ -19583,7 +19583,7 @@
     <w:uiPriority w:val="12"/>
     <w:qFormat/>
     <w:pPr>
-      <w:spacing w:after="60"/>
+      <w:spacing w:after="80"/>
       <w:ind w:left="540" w:hanging="259"/>
       <w:numPr>
         <w:ilvl w:val="0"/>
@@ -19595,7 +19595,7 @@
       <w:b w:val="0"/>
       <w:i w:val="0"/>
       <w:color w:val="263633"/>
-      <w:sz w:val="21"/>
+      <w:sz w:val="22"/>
     </w:rPr>
   </w:style>
   <w:style w:type="paragraph" w:customStyle="1" w:styleId="TOC1">

</xml_diff>

<commit_message>
feat(fca): physical sizes follow the Anti-Bribery and Corruption Standard
Measured from the PDF and applied to the master, Opal colours and styles
untouched: Arial 11pt body on 1.25 line spacing with 12pt after; H1 14pt,
H2 12pt, H3/H4 11pt; prompts, captions, tables, header and footer 9pt; lists
at 11pt with the bullet at 0.2in and text at 0.5in; 3pt table cell padding;
1in side margins with a deeper top band for the header and a 9pt footer.
Tables rescaled to the 9026 dxa text column. Contents entries 11pt / 9pt.

Co-Authored-By: Claude Fable 5.1 <noreply@anthropic.com>
</commit_message>
<xml_diff>
--- a/backend/fca/templates/fca-v1.docx
+++ b/backend/fca/templates/fca-v1.docx
@@ -108,7 +108,7 @@
     </w:p>
     <w:tbl>
       <w:tblPr>
-        <w:tblW w:type="dxa" w:w="10166"/>
+        <w:tblW w:type="dxa" w:w="9026"/>
         <w:jc w:val="left"/>
         <w:tblLayout w:type="fixed"/>
         <w:tblLook w:firstColumn="1" w:firstRow="1" w:lastColumn="0" w:lastRow="0" w:noHBand="0" w:noVBand="1" w:val="04A0"/>
@@ -123,9 +123,9 @@
         </w:tblBorders>
       </w:tblPr>
       <w:tblGrid>
-        <w:gridCol w:w="3389"/>
-        <w:gridCol w:w="3389"/>
-        <w:gridCol w:w="3388"/>
+        <w:gridCol w:w="3009"/>
+        <w:gridCol w:w="3009"/>
+        <w:gridCol w:w="3008"/>
       </w:tblGrid>
       <w:tr>
         <w:trPr>
@@ -134,7 +134,7 @@
         </w:trPr>
         <w:tc>
           <w:tcPr>
-            <w:tcW w:type="dxa" w:w="3389"/>
+            <w:tcW w:type="dxa" w:w="3009"/>
             <w:vAlign w:val="center"/>
             <w:shd w:val="clear" w:fill="2F5651"/>
             <w:tcMar>
@@ -159,7 +159,7 @@
         </w:tc>
         <w:tc>
           <w:tcPr>
-            <w:tcW w:type="dxa" w:w="3389"/>
+            <w:tcW w:type="dxa" w:w="3009"/>
             <w:vAlign w:val="center"/>
             <w:shd w:val="clear" w:fill="2F5651"/>
             <w:tcMar>
@@ -184,7 +184,7 @@
         </w:tc>
         <w:tc>
           <w:tcPr>
-            <w:tcW w:type="dxa" w:w="3388"/>
+            <w:tcW w:type="dxa" w:w="3008"/>
             <w:vAlign w:val="center"/>
             <w:shd w:val="clear" w:fill="2F5651"/>
             <w:tcMar>
@@ -214,7 +214,7 @@
         </w:trPr>
         <w:tc>
           <w:tcPr>
-            <w:tcW w:type="dxa" w:w="3389"/>
+            <w:tcW w:type="dxa" w:w="3009"/>
             <w:vAlign w:val="center"/>
             <w:shd w:val="clear" w:fill="E8F1EC"/>
             <w:tcMar>
@@ -250,7 +250,7 @@
         </w:tc>
         <w:tc>
           <w:tcPr>
-            <w:tcW w:type="dxa" w:w="3389"/>
+            <w:tcW w:type="dxa" w:w="3009"/>
             <w:vAlign w:val="center"/>
             <w:shd w:val="clear" w:fill="E8F1EC"/>
             <w:tcMar>
@@ -286,7 +286,7 @@
         </w:tc>
         <w:tc>
           <w:tcPr>
-            <w:tcW w:type="dxa" w:w="3388"/>
+            <w:tcW w:type="dxa" w:w="3008"/>
             <w:vAlign w:val="center"/>
             <w:shd w:val="clear" w:fill="E8F1EC"/>
             <w:tcMar>
@@ -431,7 +431,7 @@
           <w:footerReference w:type="default" r:id="rId22"/>
           <w:type w:val="continuous"/>
           <w:pgSz w:w="11906" w:h="16838" w:orient="portrait" w:code="9"/>
-          <w:pgMar w:top="792" w:right="1037" w:bottom="792" w:left="1037" w:header="288" w:footer="288" w:gutter="0"/>
+          <w:pgMar w:top="792" w:right="1440" w:bottom="792" w:left="1440" w:header="288" w:footer="288" w:gutter="0"/>
           <w:cols w:space="720"/>
           <w:docGrid w:linePitch="326"/>
         </w:sectPr>
@@ -456,7 +456,7 @@
     </w:p>
     <w:tbl>
       <w:tblPr>
-        <w:tblW w:type="dxa" w:w="9936"/>
+        <w:tblW w:type="dxa" w:w="9026"/>
         <w:jc w:val="left"/>
         <w:tblLayout w:type="fixed"/>
         <w:tblLook w:firstColumn="1" w:firstRow="1" w:lastColumn="0" w:lastRow="0" w:noHBand="0" w:noVBand="1" w:val="04A0"/>
@@ -471,8 +471,8 @@
         </w:tblBorders>
       </w:tblPr>
       <w:tblGrid>
-        <w:gridCol w:w="3180"/>
-        <w:gridCol w:w="6756"/>
+        <w:gridCol w:w="2889"/>
+        <w:gridCol w:w="6137"/>
       </w:tblGrid>
       <w:tr>
         <w:trPr>
@@ -481,7 +481,7 @@
         </w:trPr>
         <w:tc>
           <w:tcPr>
-            <w:tcW w:type="dxa" w:w="3180"/>
+            <w:tcW w:type="dxa" w:w="2889"/>
             <w:vAlign w:val="center"/>
             <w:shd w:val="clear" w:fill="2F5651"/>
             <w:tcMar>
@@ -506,7 +506,7 @@
         </w:tc>
         <w:tc>
           <w:tcPr>
-            <w:tcW w:type="dxa" w:w="6756"/>
+            <w:tcW w:type="dxa" w:w="6137"/>
             <w:vAlign w:val="center"/>
             <w:tcMar>
               <w:top w:w="95" w:type="dxa"/>
@@ -535,7 +535,7 @@
         </w:trPr>
         <w:tc>
           <w:tcPr>
-            <w:tcW w:type="dxa" w:w="3180"/>
+            <w:tcW w:type="dxa" w:w="2889"/>
             <w:vAlign w:val="center"/>
             <w:shd w:val="clear" w:fill="2F5651"/>
             <w:tcMar>
@@ -560,7 +560,7 @@
         </w:tc>
         <w:tc>
           <w:tcPr>
-            <w:tcW w:type="dxa" w:w="6756"/>
+            <w:tcW w:type="dxa" w:w="6137"/>
             <w:vAlign w:val="center"/>
             <w:shd w:val="clear" w:fill="F4F7F5"/>
             <w:tcMar>
@@ -590,7 +590,7 @@
         </w:trPr>
         <w:tc>
           <w:tcPr>
-            <w:tcW w:type="dxa" w:w="3180"/>
+            <w:tcW w:type="dxa" w:w="2889"/>
             <w:vAlign w:val="center"/>
             <w:shd w:val="clear" w:fill="2F5651"/>
             <w:tcMar>
@@ -615,7 +615,7 @@
         </w:tc>
         <w:tc>
           <w:tcPr>
-            <w:tcW w:type="dxa" w:w="6756"/>
+            <w:tcW w:type="dxa" w:w="6137"/>
             <w:vAlign w:val="center"/>
             <w:tcMar>
               <w:top w:w="95" w:type="dxa"/>
@@ -653,7 +653,7 @@
         </w:trPr>
         <w:tc>
           <w:tcPr>
-            <w:tcW w:type="dxa" w:w="3180"/>
+            <w:tcW w:type="dxa" w:w="2889"/>
             <w:vAlign w:val="center"/>
             <w:shd w:val="clear" w:fill="2F5651"/>
             <w:tcMar>
@@ -678,7 +678,7 @@
         </w:tc>
         <w:tc>
           <w:tcPr>
-            <w:tcW w:type="dxa" w:w="6756"/>
+            <w:tcW w:type="dxa" w:w="6137"/>
             <w:vAlign w:val="center"/>
             <w:shd w:val="clear" w:fill="F4F7F5"/>
             <w:tcMar>
@@ -717,7 +717,7 @@
         </w:trPr>
         <w:tc>
           <w:tcPr>
-            <w:tcW w:type="dxa" w:w="3180"/>
+            <w:tcW w:type="dxa" w:w="2889"/>
             <w:vAlign w:val="center"/>
             <w:shd w:val="clear" w:fill="2F5651"/>
             <w:tcMar>
@@ -742,7 +742,7 @@
         </w:tc>
         <w:tc>
           <w:tcPr>
-            <w:tcW w:type="dxa" w:w="6756"/>
+            <w:tcW w:type="dxa" w:w="6137"/>
             <w:vAlign w:val="center"/>
             <w:tcMar>
               <w:top w:w="95" w:type="dxa"/>
@@ -780,7 +780,7 @@
         </w:trPr>
         <w:tc>
           <w:tcPr>
-            <w:tcW w:type="dxa" w:w="3180"/>
+            <w:tcW w:type="dxa" w:w="2889"/>
             <w:vAlign w:val="center"/>
             <w:shd w:val="clear" w:fill="2F5651"/>
             <w:tcMar>
@@ -805,7 +805,7 @@
         </w:tc>
         <w:tc>
           <w:tcPr>
-            <w:tcW w:type="dxa" w:w="6756"/>
+            <w:tcW w:type="dxa" w:w="6137"/>
             <w:vAlign w:val="center"/>
             <w:shd w:val="clear" w:fill="F4F7F5"/>
             <w:tcMar>
@@ -865,7 +865,7 @@
         </w:trPr>
         <w:tc>
           <w:tcPr>
-            <w:tcW w:type="dxa" w:w="3180"/>
+            <w:tcW w:type="dxa" w:w="2889"/>
             <w:vAlign w:val="center"/>
             <w:shd w:val="clear" w:fill="2F5651"/>
             <w:tcMar>
@@ -890,7 +890,7 @@
         </w:tc>
         <w:tc>
           <w:tcPr>
-            <w:tcW w:type="dxa" w:w="6756"/>
+            <w:tcW w:type="dxa" w:w="6137"/>
             <w:vAlign w:val="center"/>
             <w:tcMar>
               <w:top w:w="95" w:type="dxa"/>
@@ -949,7 +949,7 @@
         </w:trPr>
         <w:tc>
           <w:tcPr>
-            <w:tcW w:type="dxa" w:w="3180"/>
+            <w:tcW w:type="dxa" w:w="2889"/>
             <w:vAlign w:val="center"/>
             <w:shd w:val="clear" w:fill="2F5651"/>
             <w:tcMar>
@@ -974,7 +974,7 @@
         </w:tc>
         <w:tc>
           <w:tcPr>
-            <w:tcW w:type="dxa" w:w="6756"/>
+            <w:tcW w:type="dxa" w:w="6137"/>
             <w:vAlign w:val="center"/>
             <w:shd w:val="clear" w:fill="F4F7F5"/>
             <w:tcMar>
@@ -1013,7 +1013,7 @@
         </w:trPr>
         <w:tc>
           <w:tcPr>
-            <w:tcW w:type="dxa" w:w="3180"/>
+            <w:tcW w:type="dxa" w:w="2889"/>
             <w:vAlign w:val="center"/>
             <w:shd w:val="clear" w:fill="2F5651"/>
             <w:tcMar>
@@ -1038,7 +1038,7 @@
         </w:tc>
         <w:tc>
           <w:tcPr>
-            <w:tcW w:type="dxa" w:w="6756"/>
+            <w:tcW w:type="dxa" w:w="6137"/>
             <w:vAlign w:val="center"/>
             <w:tcMar>
               <w:top w:w="95" w:type="dxa"/>
@@ -1097,7 +1097,7 @@
         </w:trPr>
         <w:tc>
           <w:tcPr>
-            <w:tcW w:type="dxa" w:w="3180"/>
+            <w:tcW w:type="dxa" w:w="2889"/>
             <w:vAlign w:val="center"/>
             <w:shd w:val="clear" w:fill="2F5651"/>
             <w:tcMar>
@@ -1122,7 +1122,7 @@
         </w:tc>
         <w:tc>
           <w:tcPr>
-            <w:tcW w:type="dxa" w:w="6756"/>
+            <w:tcW w:type="dxa" w:w="6137"/>
             <w:vAlign w:val="center"/>
             <w:shd w:val="clear" w:fill="F4F7F5"/>
             <w:tcMar>
@@ -1254,7 +1254,7 @@
         <w:rPr>
           <w:rFonts w:ascii="Arial" w:hAnsi="Arial" w:eastAsia="Arial" w:cs="Arial"/>
           <w:color w:val="566E70"/>
-          <w:sz w:val="21"/>
+          <w:sz w:val="22"/>
         </w:rPr>
         <w:fldChar w:fldCharType="begin" w:dirty="true"/>
         <w:instrText xml:space="preserve"> TOC \o "1-3" \h \z \u </w:instrText>
@@ -1265,7 +1265,7 @@
           <w:rFonts w:ascii="Arial" w:hAnsi="Arial" w:eastAsia="Arial" w:cs="Arial"/>
           <w:b/>
           <w:color w:val="2F5651"/>
-          <w:sz w:val="21"/>
+          <w:sz w:val="22"/>
         </w:rPr>
         <w:t>Participant Details</w:t>
       </w:r>
@@ -1273,7 +1273,7 @@
         <w:rPr>
           <w:rFonts w:ascii="Arial" w:hAnsi="Arial" w:eastAsia="Arial" w:cs="Arial"/>
           <w:color w:val="2F5651"/>
-          <w:sz w:val="21"/>
+          <w:sz w:val="22"/>
         </w:rPr>
         <w:tab/>
       </w:r>
@@ -1282,7 +1282,7 @@
           <w:rFonts w:ascii="Arial" w:hAnsi="Arial" w:eastAsia="Arial" w:cs="Arial"/>
           <w:b/>
           <w:color w:val="2F5651"/>
-          <w:sz w:val="21"/>
+          <w:sz w:val="22"/>
         </w:rPr>
         <w:t>1</w:t>
       </w:r>
@@ -1299,7 +1299,7 @@
           <w:rFonts w:ascii="Arial" w:hAnsi="Arial" w:eastAsia="Arial" w:cs="Arial"/>
           <w:b/>
           <w:color w:val="2F5651"/>
-          <w:sz w:val="21"/>
+          <w:sz w:val="22"/>
         </w:rPr>
         <w:t>Referral Information</w:t>
       </w:r>
@@ -1307,7 +1307,7 @@
         <w:rPr>
           <w:rFonts w:ascii="Arial" w:hAnsi="Arial" w:eastAsia="Arial" w:cs="Arial"/>
           <w:color w:val="2F5651"/>
-          <w:sz w:val="21"/>
+          <w:sz w:val="22"/>
         </w:rPr>
         <w:tab/>
       </w:r>
@@ -1316,7 +1316,7 @@
           <w:rFonts w:ascii="Arial" w:hAnsi="Arial" w:eastAsia="Arial" w:cs="Arial"/>
           <w:b/>
           <w:color w:val="2F5651"/>
-          <w:sz w:val="21"/>
+          <w:sz w:val="22"/>
         </w:rPr>
         <w:t>2</w:t>
       </w:r>
@@ -1333,7 +1333,7 @@
           <w:rFonts w:ascii="Arial" w:hAnsi="Arial" w:eastAsia="Arial" w:cs="Arial"/>
           <w:b/>
           <w:color w:val="2F5651"/>
-          <w:sz w:val="21"/>
+          <w:sz w:val="22"/>
         </w:rPr>
         <w:t>Participant Information</w:t>
       </w:r>
@@ -1341,7 +1341,7 @@
         <w:rPr>
           <w:rFonts w:ascii="Arial" w:hAnsi="Arial" w:eastAsia="Arial" w:cs="Arial"/>
           <w:color w:val="2F5651"/>
-          <w:sz w:val="21"/>
+          <w:sz w:val="22"/>
         </w:rPr>
         <w:tab/>
       </w:r>
@@ -1350,7 +1350,7 @@
           <w:rFonts w:ascii="Arial" w:hAnsi="Arial" w:eastAsia="Arial" w:cs="Arial"/>
           <w:b/>
           <w:color w:val="2F5651"/>
-          <w:sz w:val="21"/>
+          <w:sz w:val="22"/>
         </w:rPr>
         <w:t>3</w:t>
       </w:r>
@@ -1367,7 +1367,7 @@
           <w:rFonts w:ascii="Arial" w:hAnsi="Arial" w:eastAsia="Arial" w:cs="Arial"/>
           <w:b/>
           <w:color w:val="2F5651"/>
-          <w:sz w:val="21"/>
+          <w:sz w:val="22"/>
         </w:rPr>
         <w:t>Assessment Method</w:t>
       </w:r>
@@ -1375,7 +1375,7 @@
         <w:rPr>
           <w:rFonts w:ascii="Arial" w:hAnsi="Arial" w:eastAsia="Arial" w:cs="Arial"/>
           <w:color w:val="2F5651"/>
-          <w:sz w:val="21"/>
+          <w:sz w:val="22"/>
         </w:rPr>
         <w:tab/>
       </w:r>
@@ -1384,7 +1384,7 @@
           <w:rFonts w:ascii="Arial" w:hAnsi="Arial" w:eastAsia="Arial" w:cs="Arial"/>
           <w:b/>
           <w:color w:val="2F5651"/>
-          <w:sz w:val="21"/>
+          <w:sz w:val="22"/>
         </w:rPr>
         <w:t>4</w:t>
       </w:r>
@@ -1401,7 +1401,7 @@
           <w:rFonts w:ascii="Arial" w:hAnsi="Arial" w:eastAsia="Arial" w:cs="Arial"/>
           <w:b w:val="0"/>
           <w:color w:val="263633"/>
-          <w:sz w:val="20"/>
+          <w:sz w:val="18"/>
         </w:rPr>
         <w:t>Assessment synthesis</w:t>
       </w:r>
@@ -1409,7 +1409,7 @@
         <w:rPr>
           <w:rFonts w:ascii="Arial" w:hAnsi="Arial" w:eastAsia="Arial" w:cs="Arial"/>
           <w:color w:val="263633"/>
-          <w:sz w:val="20"/>
+          <w:sz w:val="18"/>
         </w:rPr>
         <w:tab/>
       </w:r>
@@ -1418,7 +1418,7 @@
           <w:rFonts w:ascii="Arial" w:hAnsi="Arial" w:eastAsia="Arial" w:cs="Arial"/>
           <w:b w:val="0"/>
           <w:color w:val="263633"/>
-          <w:sz w:val="20"/>
+          <w:sz w:val="18"/>
         </w:rPr>
         <w:t>6</w:t>
       </w:r>
@@ -1435,7 +1435,7 @@
           <w:rFonts w:ascii="Arial" w:hAnsi="Arial" w:eastAsia="Arial" w:cs="Arial"/>
           <w:b/>
           <w:color w:val="2F5651"/>
-          <w:sz w:val="21"/>
+          <w:sz w:val="22"/>
         </w:rPr>
         <w:t>Assessment results for Functional Capacity</w:t>
       </w:r>
@@ -1443,7 +1443,7 @@
         <w:rPr>
           <w:rFonts w:ascii="Arial" w:hAnsi="Arial" w:eastAsia="Arial" w:cs="Arial"/>
           <w:color w:val="2F5651"/>
-          <w:sz w:val="21"/>
+          <w:sz w:val="22"/>
         </w:rPr>
         <w:tab/>
       </w:r>
@@ -1452,7 +1452,7 @@
           <w:rFonts w:ascii="Arial" w:hAnsi="Arial" w:eastAsia="Arial" w:cs="Arial"/>
           <w:b/>
           <w:color w:val="2F5651"/>
-          <w:sz w:val="21"/>
+          <w:sz w:val="22"/>
         </w:rPr>
         <w:t>7</w:t>
       </w:r>
@@ -1469,7 +1469,7 @@
           <w:rFonts w:ascii="Arial" w:hAnsi="Arial" w:eastAsia="Arial" w:cs="Arial"/>
           <w:b w:val="0"/>
           <w:color w:val="263633"/>
-          <w:sz w:val="20"/>
+          <w:sz w:val="18"/>
         </w:rPr>
         <w:t>Mobility</w:t>
       </w:r>
@@ -1477,7 +1477,7 @@
         <w:rPr>
           <w:rFonts w:ascii="Arial" w:hAnsi="Arial" w:eastAsia="Arial" w:cs="Arial"/>
           <w:color w:val="263633"/>
-          <w:sz w:val="20"/>
+          <w:sz w:val="18"/>
         </w:rPr>
         <w:tab/>
       </w:r>
@@ -1486,7 +1486,7 @@
           <w:rFonts w:ascii="Arial" w:hAnsi="Arial" w:eastAsia="Arial" w:cs="Arial"/>
           <w:b w:val="0"/>
           <w:color w:val="263633"/>
-          <w:sz w:val="20"/>
+          <w:sz w:val="18"/>
         </w:rPr>
         <w:t>8</w:t>
       </w:r>
@@ -1503,7 +1503,7 @@
           <w:rFonts w:ascii="Arial" w:hAnsi="Arial" w:eastAsia="Arial" w:cs="Arial"/>
           <w:b w:val="0"/>
           <w:color w:val="263633"/>
-          <w:sz w:val="20"/>
+          <w:sz w:val="18"/>
         </w:rPr>
         <w:t>Cognition</w:t>
       </w:r>
@@ -1511,7 +1511,7 @@
         <w:rPr>
           <w:rFonts w:ascii="Arial" w:hAnsi="Arial" w:eastAsia="Arial" w:cs="Arial"/>
           <w:color w:val="263633"/>
-          <w:sz w:val="20"/>
+          <w:sz w:val="18"/>
         </w:rPr>
         <w:tab/>
       </w:r>
@@ -1520,7 +1520,7 @@
           <w:rFonts w:ascii="Arial" w:hAnsi="Arial" w:eastAsia="Arial" w:cs="Arial"/>
           <w:b w:val="0"/>
           <w:color w:val="263633"/>
-          <w:sz w:val="20"/>
+          <w:sz w:val="18"/>
         </w:rPr>
         <w:t>9</w:t>
       </w:r>
@@ -1537,7 +1537,7 @@
           <w:rFonts w:ascii="Arial" w:hAnsi="Arial" w:eastAsia="Arial" w:cs="Arial"/>
           <w:b w:val="0"/>
           <w:color w:val="263633"/>
-          <w:sz w:val="20"/>
+          <w:sz w:val="18"/>
         </w:rPr>
         <w:t>Communication</w:t>
       </w:r>
@@ -1545,7 +1545,7 @@
         <w:rPr>
           <w:rFonts w:ascii="Arial" w:hAnsi="Arial" w:eastAsia="Arial" w:cs="Arial"/>
           <w:color w:val="263633"/>
-          <w:sz w:val="20"/>
+          <w:sz w:val="18"/>
         </w:rPr>
         <w:tab/>
       </w:r>
@@ -1554,7 +1554,7 @@
           <w:rFonts w:ascii="Arial" w:hAnsi="Arial" w:eastAsia="Arial" w:cs="Arial"/>
           <w:b w:val="0"/>
           <w:color w:val="263633"/>
-          <w:sz w:val="20"/>
+          <w:sz w:val="18"/>
         </w:rPr>
         <w:t>10</w:t>
       </w:r>
@@ -1571,7 +1571,7 @@
           <w:rFonts w:ascii="Arial" w:hAnsi="Arial" w:eastAsia="Arial" w:cs="Arial"/>
           <w:b w:val="0"/>
           <w:color w:val="263633"/>
-          <w:sz w:val="20"/>
+          <w:sz w:val="18"/>
         </w:rPr>
         <w:t>Psychological/Emotional</w:t>
       </w:r>
@@ -1579,7 +1579,7 @@
         <w:rPr>
           <w:rFonts w:ascii="Arial" w:hAnsi="Arial" w:eastAsia="Arial" w:cs="Arial"/>
           <w:color w:val="263633"/>
-          <w:sz w:val="20"/>
+          <w:sz w:val="18"/>
         </w:rPr>
         <w:tab/>
       </w:r>
@@ -1588,7 +1588,7 @@
           <w:rFonts w:ascii="Arial" w:hAnsi="Arial" w:eastAsia="Arial" w:cs="Arial"/>
           <w:b w:val="0"/>
           <w:color w:val="263633"/>
-          <w:sz w:val="20"/>
+          <w:sz w:val="18"/>
         </w:rPr>
         <w:t>11</w:t>
       </w:r>
@@ -1605,7 +1605,7 @@
           <w:rFonts w:ascii="Arial" w:hAnsi="Arial" w:eastAsia="Arial" w:cs="Arial"/>
           <w:b w:val="0"/>
           <w:color w:val="263633"/>
-          <w:sz w:val="20"/>
+          <w:sz w:val="18"/>
         </w:rPr>
         <w:t>Self-Care ADLs</w:t>
       </w:r>
@@ -1613,7 +1613,7 @@
         <w:rPr>
           <w:rFonts w:ascii="Arial" w:hAnsi="Arial" w:eastAsia="Arial" w:cs="Arial"/>
           <w:color w:val="263633"/>
-          <w:sz w:val="20"/>
+          <w:sz w:val="18"/>
         </w:rPr>
         <w:tab/>
       </w:r>
@@ -1622,7 +1622,7 @@
           <w:rFonts w:ascii="Arial" w:hAnsi="Arial" w:eastAsia="Arial" w:cs="Arial"/>
           <w:b w:val="0"/>
           <w:color w:val="263633"/>
-          <w:sz w:val="20"/>
+          <w:sz w:val="18"/>
         </w:rPr>
         <w:t>12</w:t>
       </w:r>
@@ -1639,7 +1639,7 @@
           <w:rFonts w:ascii="Arial" w:hAnsi="Arial" w:eastAsia="Arial" w:cs="Arial"/>
           <w:b w:val="0"/>
           <w:color w:val="263633"/>
-          <w:sz w:val="20"/>
+          <w:sz w:val="18"/>
         </w:rPr>
         <w:t>Domestic ADLs</w:t>
       </w:r>
@@ -1647,7 +1647,7 @@
         <w:rPr>
           <w:rFonts w:ascii="Arial" w:hAnsi="Arial" w:eastAsia="Arial" w:cs="Arial"/>
           <w:color w:val="263633"/>
-          <w:sz w:val="20"/>
+          <w:sz w:val="18"/>
         </w:rPr>
         <w:tab/>
       </w:r>
@@ -1656,7 +1656,7 @@
           <w:rFonts w:ascii="Arial" w:hAnsi="Arial" w:eastAsia="Arial" w:cs="Arial"/>
           <w:b w:val="0"/>
           <w:color w:val="263633"/>
-          <w:sz w:val="20"/>
+          <w:sz w:val="18"/>
         </w:rPr>
         <w:t>13</w:t>
       </w:r>
@@ -1673,7 +1673,7 @@
           <w:rFonts w:ascii="Arial" w:hAnsi="Arial" w:eastAsia="Arial" w:cs="Arial"/>
           <w:b w:val="0"/>
           <w:color w:val="263633"/>
-          <w:sz w:val="20"/>
+          <w:sz w:val="18"/>
         </w:rPr>
         <w:t>Community Access</w:t>
       </w:r>
@@ -1681,7 +1681,7 @@
         <w:rPr>
           <w:rFonts w:ascii="Arial" w:hAnsi="Arial" w:eastAsia="Arial" w:cs="Arial"/>
           <w:color w:val="263633"/>
-          <w:sz w:val="20"/>
+          <w:sz w:val="18"/>
         </w:rPr>
         <w:tab/>
       </w:r>
@@ -1690,7 +1690,7 @@
           <w:rFonts w:ascii="Arial" w:hAnsi="Arial" w:eastAsia="Arial" w:cs="Arial"/>
           <w:b w:val="0"/>
           <w:color w:val="263633"/>
-          <w:sz w:val="20"/>
+          <w:sz w:val="18"/>
         </w:rPr>
         <w:t>14</w:t>
       </w:r>
@@ -1707,7 +1707,7 @@
           <w:rFonts w:ascii="Arial" w:hAnsi="Arial" w:eastAsia="Arial" w:cs="Arial"/>
           <w:b w:val="0"/>
           <w:color w:val="263633"/>
-          <w:sz w:val="20"/>
+          <w:sz w:val="18"/>
         </w:rPr>
         <w:t>Behaviours of Concern</w:t>
       </w:r>
@@ -1715,7 +1715,7 @@
         <w:rPr>
           <w:rFonts w:ascii="Arial" w:hAnsi="Arial" w:eastAsia="Arial" w:cs="Arial"/>
           <w:color w:val="263633"/>
-          <w:sz w:val="20"/>
+          <w:sz w:val="18"/>
         </w:rPr>
         <w:tab/>
       </w:r>
@@ -1724,7 +1724,7 @@
           <w:rFonts w:ascii="Arial" w:hAnsi="Arial" w:eastAsia="Arial" w:cs="Arial"/>
           <w:b w:val="0"/>
           <w:color w:val="263633"/>
-          <w:sz w:val="20"/>
+          <w:sz w:val="18"/>
         </w:rPr>
         <w:t>15</w:t>
       </w:r>
@@ -1741,7 +1741,7 @@
           <w:rFonts w:ascii="Arial" w:hAnsi="Arial" w:eastAsia="Arial" w:cs="Arial"/>
           <w:b w:val="0"/>
           <w:color w:val="263633"/>
-          <w:sz w:val="20"/>
+          <w:sz w:val="18"/>
         </w:rPr>
         <w:t>Home Modifications and Assistive Technology</w:t>
       </w:r>
@@ -1749,7 +1749,7 @@
         <w:rPr>
           <w:rFonts w:ascii="Arial" w:hAnsi="Arial" w:eastAsia="Arial" w:cs="Arial"/>
           <w:color w:val="263633"/>
-          <w:sz w:val="20"/>
+          <w:sz w:val="18"/>
         </w:rPr>
         <w:tab/>
       </w:r>
@@ -1758,7 +1758,7 @@
           <w:rFonts w:ascii="Arial" w:hAnsi="Arial" w:eastAsia="Arial" w:cs="Arial"/>
           <w:b w:val="0"/>
           <w:color w:val="263633"/>
-          <w:sz w:val="20"/>
+          <w:sz w:val="18"/>
         </w:rPr>
         <w:t>16</w:t>
       </w:r>
@@ -1775,7 +1775,7 @@
           <w:rFonts w:ascii="Arial" w:hAnsi="Arial" w:eastAsia="Arial" w:cs="Arial"/>
           <w:b/>
           <w:color w:val="2F5651"/>
-          <w:sz w:val="21"/>
+          <w:sz w:val="22"/>
         </w:rPr>
         <w:t>Summary and Recommendations</w:t>
       </w:r>
@@ -1783,7 +1783,7 @@
         <w:rPr>
           <w:rFonts w:ascii="Arial" w:hAnsi="Arial" w:eastAsia="Arial" w:cs="Arial"/>
           <w:color w:val="2F5651"/>
-          <w:sz w:val="21"/>
+          <w:sz w:val="22"/>
         </w:rPr>
         <w:tab/>
       </w:r>
@@ -1792,7 +1792,7 @@
           <w:rFonts w:ascii="Arial" w:hAnsi="Arial" w:eastAsia="Arial" w:cs="Arial"/>
           <w:b/>
           <w:color w:val="2F5651"/>
-          <w:sz w:val="21"/>
+          <w:sz w:val="22"/>
         </w:rPr>
         <w:t>17</w:t>
       </w:r>
@@ -1809,7 +1809,7 @@
           <w:rFonts w:ascii="Arial" w:hAnsi="Arial" w:eastAsia="Arial" w:cs="Arial"/>
           <w:b w:val="0"/>
           <w:color w:val="263633"/>
-          <w:sz w:val="20"/>
+          <w:sz w:val="18"/>
         </w:rPr>
         <w:t>Core Supports</w:t>
       </w:r>
@@ -1817,7 +1817,7 @@
         <w:rPr>
           <w:rFonts w:ascii="Arial" w:hAnsi="Arial" w:eastAsia="Arial" w:cs="Arial"/>
           <w:color w:val="263633"/>
-          <w:sz w:val="20"/>
+          <w:sz w:val="18"/>
         </w:rPr>
         <w:tab/>
       </w:r>
@@ -1826,7 +1826,7 @@
           <w:rFonts w:ascii="Arial" w:hAnsi="Arial" w:eastAsia="Arial" w:cs="Arial"/>
           <w:b w:val="0"/>
           <w:color w:val="263633"/>
-          <w:sz w:val="20"/>
+          <w:sz w:val="18"/>
         </w:rPr>
         <w:t>18</w:t>
       </w:r>
@@ -1843,7 +1843,7 @@
           <w:rFonts w:ascii="Arial" w:hAnsi="Arial" w:eastAsia="Arial" w:cs="Arial"/>
           <w:b w:val="0"/>
           <w:color w:val="263633"/>
-          <w:sz w:val="20"/>
+          <w:sz w:val="18"/>
         </w:rPr>
         <w:t>Capacity Building</w:t>
       </w:r>
@@ -1851,7 +1851,7 @@
         <w:rPr>
           <w:rFonts w:ascii="Arial" w:hAnsi="Arial" w:eastAsia="Arial" w:cs="Arial"/>
           <w:color w:val="263633"/>
-          <w:sz w:val="20"/>
+          <w:sz w:val="18"/>
         </w:rPr>
         <w:tab/>
       </w:r>
@@ -1860,7 +1860,7 @@
           <w:rFonts w:ascii="Arial" w:hAnsi="Arial" w:eastAsia="Arial" w:cs="Arial"/>
           <w:b w:val="0"/>
           <w:color w:val="263633"/>
-          <w:sz w:val="20"/>
+          <w:sz w:val="18"/>
         </w:rPr>
         <w:t>19</w:t>
       </w:r>
@@ -1877,7 +1877,7 @@
           <w:rFonts w:ascii="Arial" w:hAnsi="Arial" w:eastAsia="Arial" w:cs="Arial"/>
           <w:b/>
           <w:color w:val="2F5651"/>
-          <w:sz w:val="21"/>
+          <w:sz w:val="22"/>
         </w:rPr>
         <w:t>Professional Declaration</w:t>
       </w:r>
@@ -1885,7 +1885,7 @@
         <w:rPr>
           <w:rFonts w:ascii="Arial" w:hAnsi="Arial" w:eastAsia="Arial" w:cs="Arial"/>
           <w:color w:val="2F5651"/>
-          <w:sz w:val="21"/>
+          <w:sz w:val="22"/>
         </w:rPr>
         <w:tab/>
       </w:r>
@@ -1894,7 +1894,7 @@
           <w:rFonts w:ascii="Arial" w:hAnsi="Arial" w:eastAsia="Arial" w:cs="Arial"/>
           <w:b/>
           <w:color w:val="2F5651"/>
-          <w:sz w:val="21"/>
+          <w:sz w:val="22"/>
         </w:rPr>
         <w:t>20</w:t>
       </w:r>
@@ -1911,7 +1911,7 @@
           <w:rFonts w:ascii="Arial" w:hAnsi="Arial" w:eastAsia="Arial" w:cs="Arial"/>
           <w:b/>
           <w:color w:val="2F5651"/>
-          <w:sz w:val="21"/>
+          <w:sz w:val="22"/>
         </w:rPr>
         <w:t>Appendices</w:t>
       </w:r>
@@ -1919,7 +1919,7 @@
         <w:rPr>
           <w:rFonts w:ascii="Arial" w:hAnsi="Arial" w:eastAsia="Arial" w:cs="Arial"/>
           <w:color w:val="2F5651"/>
-          <w:sz w:val="21"/>
+          <w:sz w:val="22"/>
         </w:rPr>
         <w:tab/>
       </w:r>
@@ -1928,7 +1928,7 @@
           <w:rFonts w:ascii="Arial" w:hAnsi="Arial" w:eastAsia="Arial" w:cs="Arial"/>
           <w:b/>
           <w:color w:val="2F5651"/>
-          <w:sz w:val="21"/>
+          <w:sz w:val="22"/>
         </w:rPr>
         <w:t>21</w:t>
       </w:r>
@@ -1950,7 +1950,7 @@
           <w:headerReference w:type="default" r:id="rId23"/>
           <w:footerReference w:type="default" r:id="rId24"/>
           <w:pgSz w:w="11906" w:h="16838" w:orient="portrait" w:code="9"/>
-          <w:pgMar w:top="1037" w:right="1152" w:bottom="979" w:left="1152" w:header="360" w:footer="360" w:gutter="0"/>
+          <w:pgMar w:top="1900" w:right="1440" w:bottom="1180" w:left="1440" w:header="560" w:footer="720" w:gutter="0"/>
           <w:cols w:space="720"/>
           <w:docGrid w:linePitch="326"/>
           <w:pgNumType w:fmt="lowerRoman" w:start="1"/>
@@ -1982,7 +1982,7 @@
         </w:p>
         <w:tbl>
           <w:tblPr>
-            <w:tblW w:type="dxa" w:w="9936"/>
+            <w:tblW w:type="dxa" w:w="9026"/>
             <w:jc w:val="left"/>
             <w:tblLayout w:type="fixed"/>
             <w:tblLook w:firstColumn="1" w:firstRow="1" w:lastColumn="0" w:lastRow="0" w:noHBand="0" w:noVBand="1" w:val="04A0"/>
@@ -1997,8 +1997,8 @@
             </w:tblBorders>
           </w:tblPr>
           <w:tblGrid>
-            <w:gridCol w:w="3180"/>
-            <w:gridCol w:w="6756"/>
+            <w:gridCol w:w="2889"/>
+            <w:gridCol w:w="6137"/>
           </w:tblGrid>
           <w:tr>
             <w:trPr>
@@ -2007,7 +2007,7 @@
             </w:trPr>
             <w:tc>
               <w:tcPr>
-                <w:tcW w:type="dxa" w:w="3180"/>
+                <w:tcW w:type="dxa" w:w="2889"/>
                 <w:vAlign w:val="center"/>
                 <w:shd w:val="clear" w:fill="2F5651"/>
                 <w:tcMar>
@@ -2032,7 +2032,7 @@
             </w:tc>
             <w:tc>
               <w:tcPr>
-                <w:tcW w:type="dxa" w:w="6756"/>
+                <w:tcW w:type="dxa" w:w="6137"/>
                 <w:vAlign w:val="center"/>
                 <w:tcMar>
                   <w:top w:w="95" w:type="dxa"/>
@@ -2070,7 +2070,7 @@
             </w:trPr>
             <w:tc>
               <w:tcPr>
-                <w:tcW w:type="dxa" w:w="3180"/>
+                <w:tcW w:type="dxa" w:w="2889"/>
                 <w:vAlign w:val="center"/>
                 <w:shd w:val="clear" w:fill="2F5651"/>
                 <w:tcMar>
@@ -2095,7 +2095,7 @@
             </w:tc>
             <w:tc>
               <w:tcPr>
-                <w:tcW w:type="dxa" w:w="6756"/>
+                <w:tcW w:type="dxa" w:w="6137"/>
                 <w:vAlign w:val="center"/>
                 <w:shd w:val="clear" w:fill="F4F7F5"/>
                 <w:tcMar>
@@ -2134,7 +2134,7 @@
             </w:trPr>
             <w:tc>
               <w:tcPr>
-                <w:tcW w:type="dxa" w:w="3180"/>
+                <w:tcW w:type="dxa" w:w="2889"/>
                 <w:vAlign w:val="center"/>
                 <w:shd w:val="clear" w:fill="2F5651"/>
                 <w:tcMar>
@@ -2159,7 +2159,7 @@
             </w:tc>
             <w:tc>
               <w:tcPr>
-                <w:tcW w:type="dxa" w:w="6756"/>
+                <w:tcW w:type="dxa" w:w="6137"/>
                 <w:vAlign w:val="center"/>
                 <w:tcMar>
                   <w:top w:w="95" w:type="dxa"/>
@@ -2197,7 +2197,7 @@
             </w:trPr>
             <w:tc>
               <w:tcPr>
-                <w:tcW w:type="dxa" w:w="3180"/>
+                <w:tcW w:type="dxa" w:w="2889"/>
                 <w:vAlign w:val="center"/>
                 <w:shd w:val="clear" w:fill="2F5651"/>
                 <w:tcMar>
@@ -2222,7 +2222,7 @@
             </w:tc>
             <w:tc>
               <w:tcPr>
-                <w:tcW w:type="dxa" w:w="6756"/>
+                <w:tcW w:type="dxa" w:w="6137"/>
                 <w:vAlign w:val="center"/>
                 <w:shd w:val="clear" w:fill="F4F7F5"/>
                 <w:tcMar>
@@ -2282,7 +2282,7 @@
             </w:trPr>
             <w:tc>
               <w:tcPr>
-                <w:tcW w:type="dxa" w:w="3180"/>
+                <w:tcW w:type="dxa" w:w="2889"/>
                 <w:vAlign w:val="center"/>
                 <w:shd w:val="clear" w:fill="2F5651"/>
                 <w:tcMar>
@@ -2307,7 +2307,7 @@
             </w:tc>
             <w:tc>
               <w:tcPr>
-                <w:tcW w:type="dxa" w:w="6756"/>
+                <w:tcW w:type="dxa" w:w="6137"/>
                 <w:vAlign w:val="center"/>
                 <w:tcMar>
                   <w:top w:w="95" w:type="dxa"/>
@@ -2345,7 +2345,7 @@
             </w:trPr>
             <w:tc>
               <w:tcPr>
-                <w:tcW w:type="dxa" w:w="3180"/>
+                <w:tcW w:type="dxa" w:w="2889"/>
                 <w:vAlign w:val="center"/>
                 <w:shd w:val="clear" w:fill="2F5651"/>
                 <w:tcMar>
@@ -2370,7 +2370,7 @@
             </w:tc>
             <w:tc>
               <w:tcPr>
-                <w:tcW w:type="dxa" w:w="6756"/>
+                <w:tcW w:type="dxa" w:w="6137"/>
                 <w:vAlign w:val="center"/>
                 <w:shd w:val="clear" w:fill="F4F7F5"/>
                 <w:tcMar>
@@ -2430,7 +2430,7 @@
             </w:trPr>
             <w:tc>
               <w:tcPr>
-                <w:tcW w:type="dxa" w:w="3180"/>
+                <w:tcW w:type="dxa" w:w="2889"/>
                 <w:vAlign w:val="center"/>
                 <w:shd w:val="clear" w:fill="2F5651"/>
                 <w:tcMar>
@@ -2455,7 +2455,7 @@
             </w:tc>
             <w:tc>
               <w:tcPr>
-                <w:tcW w:type="dxa" w:w="6756"/>
+                <w:tcW w:type="dxa" w:w="6137"/>
                 <w:vAlign w:val="center"/>
                 <w:tcMar>
                   <w:top w:w="95" w:type="dxa"/>
@@ -2493,7 +2493,7 @@
             </w:trPr>
             <w:tc>
               <w:tcPr>
-                <w:tcW w:type="dxa" w:w="3180"/>
+                <w:tcW w:type="dxa" w:w="2889"/>
                 <w:vAlign w:val="center"/>
                 <w:shd w:val="clear" w:fill="2F5651"/>
                 <w:tcMar>
@@ -2518,7 +2518,7 @@
             </w:tc>
             <w:tc>
               <w:tcPr>
-                <w:tcW w:type="dxa" w:w="6756"/>
+                <w:tcW w:type="dxa" w:w="6137"/>
                 <w:vAlign w:val="center"/>
                 <w:shd w:val="clear" w:fill="F4F7F5"/>
                 <w:tcMar>
@@ -2557,7 +2557,7 @@
             </w:trPr>
             <w:tc>
               <w:tcPr>
-                <w:tcW w:type="dxa" w:w="3180"/>
+                <w:tcW w:type="dxa" w:w="2889"/>
                 <w:vAlign w:val="center"/>
                 <w:shd w:val="clear" w:fill="2F5651"/>
                 <w:tcMar>
@@ -2582,7 +2582,7 @@
             </w:tc>
             <w:tc>
               <w:tcPr>
-                <w:tcW w:type="dxa" w:w="6756"/>
+                <w:tcW w:type="dxa" w:w="6137"/>
                 <w:vAlign w:val="center"/>
                 <w:tcMar>
                   <w:top w:w="95" w:type="dxa"/>
@@ -2630,7 +2630,7 @@
         </w:p>
         <w:tbl>
           <w:tblPr>
-            <w:tblW w:type="dxa" w:w="9936"/>
+            <w:tblW w:type="dxa" w:w="9026"/>
             <w:jc w:val="left"/>
             <w:tblLayout w:type="fixed"/>
             <w:tblLook w:firstColumn="1" w:firstRow="1" w:lastColumn="0" w:lastRow="0" w:noHBand="0" w:noVBand="1" w:val="04A0"/>
@@ -2645,8 +2645,8 @@
             </w:tblBorders>
           </w:tblPr>
           <w:tblGrid>
-            <w:gridCol w:w="3180"/>
-            <w:gridCol w:w="6756"/>
+            <w:gridCol w:w="2889"/>
+            <w:gridCol w:w="6137"/>
           </w:tblGrid>
           <w:tr>
             <w:trPr>
@@ -2655,7 +2655,7 @@
             </w:trPr>
             <w:tc>
               <w:tcPr>
-                <w:tcW w:type="dxa" w:w="3180"/>
+                <w:tcW w:type="dxa" w:w="2889"/>
                 <w:vAlign w:val="center"/>
                 <w:shd w:val="clear" w:fill="2F5651"/>
                 <w:tcMar>
@@ -2680,7 +2680,7 @@
             </w:tc>
             <w:tc>
               <w:tcPr>
-                <w:tcW w:type="dxa" w:w="6756"/>
+                <w:tcW w:type="dxa" w:w="6137"/>
                 <w:vAlign w:val="center"/>
                 <w:tcMar>
                   <w:top w:w="95" w:type="dxa"/>
@@ -2718,7 +2718,7 @@
             </w:trPr>
             <w:tc>
               <w:tcPr>
-                <w:tcW w:type="dxa" w:w="3180"/>
+                <w:tcW w:type="dxa" w:w="2889"/>
                 <w:vAlign w:val="center"/>
                 <w:shd w:val="clear" w:fill="2F5651"/>
                 <w:tcMar>
@@ -2743,7 +2743,7 @@
             </w:tc>
             <w:tc>
               <w:tcPr>
-                <w:tcW w:type="dxa" w:w="6756"/>
+                <w:tcW w:type="dxa" w:w="6137"/>
                 <w:vAlign w:val="center"/>
                 <w:shd w:val="clear" w:fill="F4F7F5"/>
                 <w:tcMar>
@@ -2803,7 +2803,7 @@
             </w:trPr>
             <w:tc>
               <w:tcPr>
-                <w:tcW w:type="dxa" w:w="3180"/>
+                <w:tcW w:type="dxa" w:w="2889"/>
                 <w:vAlign w:val="center"/>
                 <w:shd w:val="clear" w:fill="2F5651"/>
                 <w:tcMar>
@@ -2828,7 +2828,7 @@
             </w:tc>
             <w:tc>
               <w:tcPr>
-                <w:tcW w:type="dxa" w:w="6756"/>
+                <w:tcW w:type="dxa" w:w="6137"/>
                 <w:vAlign w:val="center"/>
                 <w:tcMar>
                   <w:top w:w="95" w:type="dxa"/>
@@ -2866,7 +2866,7 @@
             </w:trPr>
             <w:tc>
               <w:tcPr>
-                <w:tcW w:type="dxa" w:w="3180"/>
+                <w:tcW w:type="dxa" w:w="2889"/>
                 <w:vAlign w:val="center"/>
                 <w:shd w:val="clear" w:fill="2F5651"/>
                 <w:tcMar>
@@ -2891,7 +2891,7 @@
             </w:tc>
             <w:tc>
               <w:tcPr>
-                <w:tcW w:type="dxa" w:w="6756"/>
+                <w:tcW w:type="dxa" w:w="6137"/>
                 <w:vAlign w:val="center"/>
                 <w:shd w:val="clear" w:fill="F4F7F5"/>
                 <w:tcMar>
@@ -2951,7 +2951,7 @@
             </w:trPr>
             <w:tc>
               <w:tcPr>
-                <w:tcW w:type="dxa" w:w="3180"/>
+                <w:tcW w:type="dxa" w:w="2889"/>
                 <w:vAlign w:val="center"/>
                 <w:shd w:val="clear" w:fill="2F5651"/>
                 <w:tcMar>
@@ -2976,7 +2976,7 @@
             </w:tc>
             <w:tc>
               <w:tcPr>
-                <w:tcW w:type="dxa" w:w="6756"/>
+                <w:tcW w:type="dxa" w:w="6137"/>
                 <w:vAlign w:val="center"/>
                 <w:tcMar>
                   <w:top w:w="95" w:type="dxa"/>
@@ -3079,7 +3079,7 @@
         </w:p>
         <w:tbl>
           <w:tblPr>
-            <w:tblW w:type="dxa" w:w="9936"/>
+            <w:tblW w:type="dxa" w:w="9026"/>
             <w:jc w:val="left"/>
             <w:tblLayout w:type="fixed"/>
             <w:tblLook w:firstColumn="1" w:firstRow="1" w:lastColumn="0" w:lastRow="0" w:noHBand="0" w:noVBand="1" w:val="04A0"/>
@@ -3094,8 +3094,8 @@
             </w:tblBorders>
           </w:tblPr>
           <w:tblGrid>
-            <w:gridCol w:w="3180"/>
-            <w:gridCol w:w="6756"/>
+            <w:gridCol w:w="2889"/>
+            <w:gridCol w:w="6137"/>
           </w:tblGrid>
           <w:tr>
             <w:trPr>
@@ -3104,7 +3104,7 @@
             </w:trPr>
             <w:tc>
               <w:tcPr>
-                <w:tcW w:type="dxa" w:w="3180"/>
+                <w:tcW w:type="dxa" w:w="2889"/>
                 <w:vAlign w:val="center"/>
                 <w:shd w:val="clear" w:fill="2F5651"/>
                 <w:tcMar>
@@ -3129,7 +3129,7 @@
             </w:tc>
             <w:tc>
               <w:tcPr>
-                <w:tcW w:type="dxa" w:w="6756"/>
+                <w:tcW w:type="dxa" w:w="6137"/>
                 <w:vAlign w:val="center"/>
                 <w:tcMar>
                   <w:top w:w="95" w:type="dxa"/>
@@ -3167,7 +3167,7 @@
             </w:trPr>
             <w:tc>
               <w:tcPr>
-                <w:tcW w:type="dxa" w:w="3180"/>
+                <w:tcW w:type="dxa" w:w="2889"/>
                 <w:vAlign w:val="center"/>
                 <w:shd w:val="clear" w:fill="2F5651"/>
                 <w:tcMar>
@@ -3192,7 +3192,7 @@
             </w:tc>
             <w:tc>
               <w:tcPr>
-                <w:tcW w:type="dxa" w:w="6756"/>
+                <w:tcW w:type="dxa" w:w="6137"/>
                 <w:vAlign w:val="center"/>
                 <w:shd w:val="clear" w:fill="F4F7F5"/>
                 <w:tcMar>
@@ -3231,7 +3231,7 @@
             </w:trPr>
             <w:tc>
               <w:tcPr>
-                <w:tcW w:type="dxa" w:w="3180"/>
+                <w:tcW w:type="dxa" w:w="2889"/>
                 <w:vAlign w:val="center"/>
                 <w:shd w:val="clear" w:fill="2F5651"/>
                 <w:tcMar>
@@ -3256,7 +3256,7 @@
             </w:tc>
             <w:tc>
               <w:tcPr>
-                <w:tcW w:type="dxa" w:w="6756"/>
+                <w:tcW w:type="dxa" w:w="6137"/>
                 <w:vAlign w:val="center"/>
                 <w:tcMar>
                   <w:top w:w="95" w:type="dxa"/>
@@ -3294,7 +3294,7 @@
             </w:trPr>
             <w:tc>
               <w:tcPr>
-                <w:tcW w:type="dxa" w:w="3180"/>
+                <w:tcW w:type="dxa" w:w="2889"/>
                 <w:vAlign w:val="center"/>
                 <w:shd w:val="clear" w:fill="2F5651"/>
                 <w:tcMar>
@@ -3319,7 +3319,7 @@
             </w:tc>
             <w:tc>
               <w:tcPr>
-                <w:tcW w:type="dxa" w:w="6756"/>
+                <w:tcW w:type="dxa" w:w="6137"/>
                 <w:vAlign w:val="center"/>
                 <w:shd w:val="clear" w:fill="F4F7F5"/>
                 <w:tcMar>
@@ -3564,7 +3564,7 @@
         </w:p>
         <w:tbl>
           <w:tblPr>
-            <w:tblW w:type="dxa" w:w="9936"/>
+            <w:tblW w:type="dxa" w:w="9026"/>
             <w:jc w:val="left"/>
             <w:tblLayout w:type="fixed"/>
             <w:tblLook w:firstColumn="1" w:firstRow="1" w:lastColumn="0" w:lastRow="0" w:noHBand="0" w:noVBand="1" w:val="04A0"/>
@@ -3579,10 +3579,10 @@
             </w:tblBorders>
           </w:tblPr>
           <w:tblGrid>
-            <w:gridCol w:w="2484"/>
-            <w:gridCol w:w="1788"/>
-            <w:gridCol w:w="2186"/>
-            <w:gridCol w:w="3478"/>
+            <w:gridCol w:w="2257"/>
+            <w:gridCol w:w="1624"/>
+            <w:gridCol w:w="1986"/>
+            <w:gridCol w:w="3159"/>
           </w:tblGrid>
           <w:tr>
             <w:trPr>
@@ -3591,7 +3591,7 @@
             </w:trPr>
             <w:tc>
               <w:tcPr>
-                <w:tcW w:type="dxa" w:w="2484"/>
+                <w:tcW w:type="dxa" w:w="2257"/>
                 <w:vAlign w:val="center"/>
                 <w:shd w:val="clear" w:fill="2F5651"/>
                 <w:tcMar>
@@ -3616,7 +3616,7 @@
             </w:tc>
             <w:tc>
               <w:tcPr>
-                <w:tcW w:type="dxa" w:w="1788"/>
+                <w:tcW w:type="dxa" w:w="1624"/>
                 <w:vAlign w:val="center"/>
                 <w:shd w:val="clear" w:fill="2F5651"/>
                 <w:tcMar>
@@ -3641,7 +3641,7 @@
             </w:tc>
             <w:tc>
               <w:tcPr>
-                <w:tcW w:type="dxa" w:w="2186"/>
+                <w:tcW w:type="dxa" w:w="1986"/>
                 <w:vAlign w:val="center"/>
                 <w:shd w:val="clear" w:fill="2F5651"/>
                 <w:tcMar>
@@ -3666,7 +3666,7 @@
             </w:tc>
             <w:tc>
               <w:tcPr>
-                <w:tcW w:type="dxa" w:w="3478"/>
+                <w:tcW w:type="dxa" w:w="3159"/>
                 <w:vAlign w:val="center"/>
                 <w:shd w:val="clear" w:fill="2F5651"/>
                 <w:tcMar>
@@ -3696,7 +3696,7 @@
             </w:trPr>
             <w:tc>
               <w:tcPr>
-                <w:tcW w:type="dxa" w:w="2484"/>
+                <w:tcW w:type="dxa" w:w="2257"/>
                 <w:vAlign w:val="center"/>
                 <w:tcMar>
                   <w:top w:w="90" w:type="dxa"/>
@@ -3722,7 +3722,7 @@
             </w:tc>
             <w:tc>
               <w:tcPr>
-                <w:tcW w:type="dxa" w:w="1788"/>
+                <w:tcW w:type="dxa" w:w="1624"/>
                 <w:vAlign w:val="center"/>
                 <w:tcMar>
                   <w:top w:w="90" w:type="dxa"/>
@@ -3748,7 +3748,7 @@
             </w:tc>
             <w:tc>
               <w:tcPr>
-                <w:tcW w:type="dxa" w:w="2186"/>
+                <w:tcW w:type="dxa" w:w="1986"/>
                 <w:vAlign w:val="center"/>
                 <w:tcMar>
                   <w:top w:w="90" w:type="dxa"/>
@@ -3774,7 +3774,7 @@
             </w:tc>
             <w:tc>
               <w:tcPr>
-                <w:tcW w:type="dxa" w:w="3478"/>
+                <w:tcW w:type="dxa" w:w="3159"/>
                 <w:vAlign w:val="center"/>
                 <w:tcMar>
                   <w:top w:w="90" w:type="dxa"/>
@@ -3805,7 +3805,7 @@
             </w:trPr>
             <w:tc>
               <w:tcPr>
-                <w:tcW w:type="dxa" w:w="2484"/>
+                <w:tcW w:type="dxa" w:w="2257"/>
                 <w:vAlign w:val="center"/>
                 <w:shd w:val="clear" w:fill="F4F7F5"/>
                 <w:tcMar>
@@ -3832,7 +3832,7 @@
             </w:tc>
             <w:tc>
               <w:tcPr>
-                <w:tcW w:type="dxa" w:w="1788"/>
+                <w:tcW w:type="dxa" w:w="1624"/>
                 <w:vAlign w:val="center"/>
                 <w:shd w:val="clear" w:fill="F4F7F5"/>
                 <w:tcMar>
@@ -3859,7 +3859,7 @@
             </w:tc>
             <w:tc>
               <w:tcPr>
-                <w:tcW w:type="dxa" w:w="2186"/>
+                <w:tcW w:type="dxa" w:w="1986"/>
                 <w:vAlign w:val="center"/>
                 <w:shd w:val="clear" w:fill="F4F7F5"/>
                 <w:tcMar>
@@ -3886,7 +3886,7 @@
             </w:tc>
             <w:tc>
               <w:tcPr>
-                <w:tcW w:type="dxa" w:w="3478"/>
+                <w:tcW w:type="dxa" w:w="3159"/>
                 <w:vAlign w:val="center"/>
                 <w:shd w:val="clear" w:fill="F4F7F5"/>
                 <w:tcMar>
@@ -3918,7 +3918,7 @@
             </w:trPr>
             <w:tc>
               <w:tcPr>
-                <w:tcW w:type="dxa" w:w="2484"/>
+                <w:tcW w:type="dxa" w:w="2257"/>
                 <w:vAlign w:val="center"/>
                 <w:tcMar>
                   <w:top w:w="90" w:type="dxa"/>
@@ -3944,7 +3944,7 @@
             </w:tc>
             <w:tc>
               <w:tcPr>
-                <w:tcW w:type="dxa" w:w="1788"/>
+                <w:tcW w:type="dxa" w:w="1624"/>
                 <w:vAlign w:val="center"/>
                 <w:tcMar>
                   <w:top w:w="90" w:type="dxa"/>
@@ -3970,7 +3970,7 @@
             </w:tc>
             <w:tc>
               <w:tcPr>
-                <w:tcW w:type="dxa" w:w="2186"/>
+                <w:tcW w:type="dxa" w:w="1986"/>
                 <w:vAlign w:val="center"/>
                 <w:tcMar>
                   <w:top w:w="90" w:type="dxa"/>
@@ -3996,7 +3996,7 @@
             </w:tc>
             <w:tc>
               <w:tcPr>
-                <w:tcW w:type="dxa" w:w="3478"/>
+                <w:tcW w:type="dxa" w:w="3159"/>
                 <w:vAlign w:val="center"/>
                 <w:tcMar>
                   <w:top w:w="90" w:type="dxa"/>
@@ -4037,7 +4037,7 @@
         </w:p>
         <w:tbl>
           <w:tblPr>
-            <w:tblW w:type="dxa" w:w="9936"/>
+            <w:tblW w:type="dxa" w:w="9026"/>
             <w:jc w:val="left"/>
             <w:tblLayout w:type="fixed"/>
             <w:tblLook w:firstColumn="1" w:firstRow="1" w:lastColumn="0" w:lastRow="0" w:noHBand="0" w:noVBand="1" w:val="04A0"/>
@@ -4052,9 +4052,9 @@
             </w:tblBorders>
           </w:tblPr>
           <w:tblGrid>
-            <w:gridCol w:w="4300"/>
-            <w:gridCol w:w="3800"/>
-            <w:gridCol w:w="1836"/>
+            <w:gridCol w:w="3906"/>
+            <w:gridCol w:w="3452"/>
+            <w:gridCol w:w="1668"/>
           </w:tblGrid>
           <w:tr>
             <w:trPr>
@@ -4063,7 +4063,7 @@
             </w:trPr>
             <w:tc>
               <w:tcPr>
-                <w:tcW w:type="dxa" w:w="4300"/>
+                <w:tcW w:type="dxa" w:w="3906"/>
                 <w:vAlign w:val="center"/>
                 <w:shd w:val="clear" w:fill="2F5651"/>
                 <w:tcMar>
@@ -4088,7 +4088,7 @@
             </w:tc>
             <w:tc>
               <w:tcPr>
-                <w:tcW w:type="dxa" w:w="3800"/>
+                <w:tcW w:type="dxa" w:w="3452"/>
                 <w:vAlign w:val="center"/>
                 <w:shd w:val="clear" w:fill="2F5651"/>
                 <w:tcMar>
@@ -4113,7 +4113,7 @@
             </w:tc>
             <w:tc>
               <w:tcPr>
-                <w:tcW w:type="dxa" w:w="1836"/>
+                <w:tcW w:type="dxa" w:w="1668"/>
                 <w:vAlign w:val="center"/>
                 <w:shd w:val="clear" w:fill="2F5651"/>
                 <w:tcMar>
@@ -4143,7 +4143,7 @@
             </w:trPr>
             <w:tc>
               <w:tcPr>
-                <w:tcW w:type="dxa" w:w="4300"/>
+                <w:tcW w:type="dxa" w:w="3906"/>
                 <w:vAlign w:val="center"/>
                 <w:tcMar>
                   <w:top w:w="90" w:type="dxa"/>
@@ -4169,7 +4169,7 @@
             </w:tc>
             <w:tc>
               <w:tcPr>
-                <w:tcW w:type="dxa" w:w="3800"/>
+                <w:tcW w:type="dxa" w:w="3452"/>
                 <w:vAlign w:val="center"/>
                 <w:tcMar>
                   <w:top w:w="90" w:type="dxa"/>
@@ -4195,7 +4195,7 @@
             </w:tc>
             <w:tc>
               <w:tcPr>
-                <w:tcW w:type="dxa" w:w="1836"/>
+                <w:tcW w:type="dxa" w:w="1668"/>
                 <w:vAlign w:val="center"/>
                 <w:tcMar>
                   <w:top w:w="90" w:type="dxa"/>
@@ -4226,7 +4226,7 @@
             </w:trPr>
             <w:tc>
               <w:tcPr>
-                <w:tcW w:type="dxa" w:w="4300"/>
+                <w:tcW w:type="dxa" w:w="3906"/>
                 <w:vAlign w:val="center"/>
                 <w:shd w:val="clear" w:fill="F4F7F5"/>
                 <w:tcMar>
@@ -4253,7 +4253,7 @@
             </w:tc>
             <w:tc>
               <w:tcPr>
-                <w:tcW w:type="dxa" w:w="3800"/>
+                <w:tcW w:type="dxa" w:w="3452"/>
                 <w:vAlign w:val="center"/>
                 <w:shd w:val="clear" w:fill="F4F7F5"/>
                 <w:tcMar>
@@ -4280,7 +4280,7 @@
             </w:tc>
             <w:tc>
               <w:tcPr>
-                <w:tcW w:type="dxa" w:w="1836"/>
+                <w:tcW w:type="dxa" w:w="1668"/>
                 <w:vAlign w:val="center"/>
                 <w:shd w:val="clear" w:fill="F4F7F5"/>
                 <w:tcMar>
@@ -4312,7 +4312,7 @@
             </w:trPr>
             <w:tc>
               <w:tcPr>
-                <w:tcW w:type="dxa" w:w="4300"/>
+                <w:tcW w:type="dxa" w:w="3906"/>
                 <w:vAlign w:val="center"/>
                 <w:tcMar>
                   <w:top w:w="90" w:type="dxa"/>
@@ -4338,7 +4338,7 @@
             </w:tc>
             <w:tc>
               <w:tcPr>
-                <w:tcW w:type="dxa" w:w="3800"/>
+                <w:tcW w:type="dxa" w:w="3452"/>
                 <w:vAlign w:val="center"/>
                 <w:tcMar>
                   <w:top w:w="90" w:type="dxa"/>
@@ -4364,7 +4364,7 @@
             </w:tc>
             <w:tc>
               <w:tcPr>
-                <w:tcW w:type="dxa" w:w="1836"/>
+                <w:tcW w:type="dxa" w:w="1668"/>
                 <w:vAlign w:val="center"/>
                 <w:tcMar>
                   <w:top w:w="90" w:type="dxa"/>
@@ -4444,7 +4444,7 @@
             </w:p>
             <w:tbl>
               <w:tblPr>
-                <w:tblW w:type="dxa" w:w="9936"/>
+                <w:tblW w:type="dxa" w:w="9026"/>
                 <w:jc w:val="left"/>
                 <w:tblLayout w:type="fixed"/>
                 <w:tblLook w:firstColumn="1" w:firstRow="1" w:lastColumn="0" w:lastRow="0" w:noHBand="0" w:noVBand="1" w:val="04A0"/>
@@ -4459,10 +4459,10 @@
                 </w:tblBorders>
               </w:tblPr>
               <w:tblGrid>
-                <w:gridCol w:w="2981"/>
-                <w:gridCol w:w="1292"/>
-                <w:gridCol w:w="1987"/>
-                <w:gridCol w:w="3676"/>
+                <w:gridCol w:w="2708"/>
+                <w:gridCol w:w="1174"/>
+                <w:gridCol w:w="1805"/>
+                <w:gridCol w:w="3339"/>
               </w:tblGrid>
               <w:tr>
                 <w:trPr>
@@ -4471,7 +4471,7 @@
                 </w:trPr>
                 <w:tc>
                   <w:tcPr>
-                    <w:tcW w:type="dxa" w:w="2981"/>
+                    <w:tcW w:type="dxa" w:w="2708"/>
                     <w:vAlign w:val="center"/>
                     <w:shd w:val="clear" w:fill="2F5651"/>
                     <w:tcMar>
@@ -4496,7 +4496,7 @@
                 </w:tc>
                 <w:tc>
                   <w:tcPr>
-                    <w:tcW w:type="dxa" w:w="1292"/>
+                    <w:tcW w:type="dxa" w:w="1174"/>
                     <w:vAlign w:val="center"/>
                     <w:shd w:val="clear" w:fill="2F5651"/>
                     <w:tcMar>
@@ -4521,7 +4521,7 @@
                 </w:tc>
                 <w:tc>
                   <w:tcPr>
-                    <w:tcW w:type="dxa" w:w="1987"/>
+                    <w:tcW w:type="dxa" w:w="1805"/>
                     <w:vAlign w:val="center"/>
                     <w:shd w:val="clear" w:fill="2F5651"/>
                     <w:tcMar>
@@ -4546,7 +4546,7 @@
                 </w:tc>
                 <w:tc>
                   <w:tcPr>
-                    <w:tcW w:type="dxa" w:w="3676"/>
+                    <w:tcW w:type="dxa" w:w="3339"/>
                     <w:vAlign w:val="center"/>
                     <w:shd w:val="clear" w:fill="2F5651"/>
                     <w:tcMar>
@@ -4576,7 +4576,7 @@
                 </w:trPr>
                 <w:tc>
                   <w:tcPr>
-                    <w:tcW w:type="dxa" w:w="2981"/>
+                    <w:tcW w:type="dxa" w:w="2708"/>
                     <w:vAlign w:val="center"/>
                     <w:tcMar>
                       <w:top w:w="90" w:type="dxa"/>
@@ -4600,7 +4600,7 @@
                 </w:tc>
                 <w:tc>
                   <w:tcPr>
-                    <w:tcW w:type="dxa" w:w="1292"/>
+                    <w:tcW w:type="dxa" w:w="1174"/>
                     <w:vAlign w:val="center"/>
                     <w:tcMar>
                       <w:top w:w="90" w:type="dxa"/>
@@ -4626,7 +4626,7 @@
                 </w:tc>
                 <w:tc>
                   <w:tcPr>
-                    <w:tcW w:type="dxa" w:w="1987"/>
+                    <w:tcW w:type="dxa" w:w="1805"/>
                     <w:vAlign w:val="center"/>
                     <w:tcMar>
                       <w:top w:w="90" w:type="dxa"/>
@@ -4652,7 +4652,7 @@
                 </w:tc>
                 <w:tc>
                   <w:tcPr>
-                    <w:tcW w:type="dxa" w:w="3676"/>
+                    <w:tcW w:type="dxa" w:w="3339"/>
                     <w:vAlign w:val="center"/>
                     <w:tcMar>
                       <w:top w:w="90" w:type="dxa"/>
@@ -4683,7 +4683,7 @@
                 </w:trPr>
                 <w:tc>
                   <w:tcPr>
-                    <w:tcW w:type="dxa" w:w="2981"/>
+                    <w:tcW w:type="dxa" w:w="2708"/>
                     <w:vAlign w:val="center"/>
                     <w:shd w:val="clear" w:fill="F4F7F5"/>
                     <w:tcMar>
@@ -4708,7 +4708,7 @@
                 </w:tc>
                 <w:tc>
                   <w:tcPr>
-                    <w:tcW w:type="dxa" w:w="1292"/>
+                    <w:tcW w:type="dxa" w:w="1174"/>
                     <w:vAlign w:val="center"/>
                     <w:shd w:val="clear" w:fill="F4F7F5"/>
                     <w:tcMar>
@@ -4735,7 +4735,7 @@
                 </w:tc>
                 <w:tc>
                   <w:tcPr>
-                    <w:tcW w:type="dxa" w:w="1987"/>
+                    <w:tcW w:type="dxa" w:w="1805"/>
                     <w:vAlign w:val="center"/>
                     <w:shd w:val="clear" w:fill="F4F7F5"/>
                     <w:tcMar>
@@ -4762,7 +4762,7 @@
                 </w:tc>
                 <w:tc>
                   <w:tcPr>
-                    <w:tcW w:type="dxa" w:w="3676"/>
+                    <w:tcW w:type="dxa" w:w="3339"/>
                     <w:vAlign w:val="center"/>
                     <w:shd w:val="clear" w:fill="F4F7F5"/>
                     <w:tcMar>
@@ -4794,7 +4794,7 @@
                 </w:trPr>
                 <w:tc>
                   <w:tcPr>
-                    <w:tcW w:type="dxa" w:w="2981"/>
+                    <w:tcW w:type="dxa" w:w="2708"/>
                     <w:vAlign w:val="center"/>
                     <w:tcMar>
                       <w:top w:w="90" w:type="dxa"/>
@@ -4818,7 +4818,7 @@
                 </w:tc>
                 <w:tc>
                   <w:tcPr>
-                    <w:tcW w:type="dxa" w:w="1292"/>
+                    <w:tcW w:type="dxa" w:w="1174"/>
                     <w:vAlign w:val="center"/>
                     <w:tcMar>
                       <w:top w:w="90" w:type="dxa"/>
@@ -4844,7 +4844,7 @@
                 </w:tc>
                 <w:tc>
                   <w:tcPr>
-                    <w:tcW w:type="dxa" w:w="1987"/>
+                    <w:tcW w:type="dxa" w:w="1805"/>
                     <w:vAlign w:val="center"/>
                     <w:tcMar>
                       <w:top w:w="90" w:type="dxa"/>
@@ -4870,7 +4870,7 @@
                 </w:tc>
                 <w:tc>
                   <w:tcPr>
-                    <w:tcW w:type="dxa" w:w="3676"/>
+                    <w:tcW w:type="dxa" w:w="3339"/>
                     <w:vAlign w:val="center"/>
                     <w:tcMar>
                       <w:top w:w="90" w:type="dxa"/>
@@ -4901,7 +4901,7 @@
                 </w:trPr>
                 <w:tc>
                   <w:tcPr>
-                    <w:tcW w:type="dxa" w:w="2981"/>
+                    <w:tcW w:type="dxa" w:w="2708"/>
                     <w:vAlign w:val="center"/>
                     <w:shd w:val="clear" w:fill="F4F7F5"/>
                     <w:tcMar>
@@ -4926,7 +4926,7 @@
                 </w:tc>
                 <w:tc>
                   <w:tcPr>
-                    <w:tcW w:type="dxa" w:w="1292"/>
+                    <w:tcW w:type="dxa" w:w="1174"/>
                     <w:vAlign w:val="center"/>
                     <w:shd w:val="clear" w:fill="F4F7F5"/>
                     <w:tcMar>
@@ -4953,7 +4953,7 @@
                 </w:tc>
                 <w:tc>
                   <w:tcPr>
-                    <w:tcW w:type="dxa" w:w="1987"/>
+                    <w:tcW w:type="dxa" w:w="1805"/>
                     <w:vAlign w:val="center"/>
                     <w:shd w:val="clear" w:fill="F4F7F5"/>
                     <w:tcMar>
@@ -4980,7 +4980,7 @@
                 </w:tc>
                 <w:tc>
                   <w:tcPr>
-                    <w:tcW w:type="dxa" w:w="3676"/>
+                    <w:tcW w:type="dxa" w:w="3339"/>
                     <w:vAlign w:val="center"/>
                     <w:shd w:val="clear" w:fill="F4F7F5"/>
                     <w:tcMar>
@@ -5012,7 +5012,7 @@
                 </w:trPr>
                 <w:tc>
                   <w:tcPr>
-                    <w:tcW w:type="dxa" w:w="2981"/>
+                    <w:tcW w:type="dxa" w:w="2708"/>
                     <w:vAlign w:val="center"/>
                     <w:tcMar>
                       <w:top w:w="90" w:type="dxa"/>
@@ -5036,7 +5036,7 @@
                 </w:tc>
                 <w:tc>
                   <w:tcPr>
-                    <w:tcW w:type="dxa" w:w="1292"/>
+                    <w:tcW w:type="dxa" w:w="1174"/>
                     <w:vAlign w:val="center"/>
                     <w:tcMar>
                       <w:top w:w="90" w:type="dxa"/>
@@ -5062,7 +5062,7 @@
                 </w:tc>
                 <w:tc>
                   <w:tcPr>
-                    <w:tcW w:type="dxa" w:w="1987"/>
+                    <w:tcW w:type="dxa" w:w="1805"/>
                     <w:vAlign w:val="center"/>
                     <w:tcMar>
                       <w:top w:w="90" w:type="dxa"/>
@@ -5088,7 +5088,7 @@
                 </w:tc>
                 <w:tc>
                   <w:tcPr>
-                    <w:tcW w:type="dxa" w:w="3676"/>
+                    <w:tcW w:type="dxa" w:w="3339"/>
                     <w:vAlign w:val="center"/>
                     <w:tcMar>
                       <w:top w:w="90" w:type="dxa"/>
@@ -5119,7 +5119,7 @@
                 </w:trPr>
                 <w:tc>
                   <w:tcPr>
-                    <w:tcW w:type="dxa" w:w="2981"/>
+                    <w:tcW w:type="dxa" w:w="2708"/>
                     <w:vAlign w:val="center"/>
                     <w:shd w:val="clear" w:fill="F4F7F5"/>
                     <w:tcMar>
@@ -5144,7 +5144,7 @@
                 </w:tc>
                 <w:tc>
                   <w:tcPr>
-                    <w:tcW w:type="dxa" w:w="1292"/>
+                    <w:tcW w:type="dxa" w:w="1174"/>
                     <w:vAlign w:val="center"/>
                     <w:shd w:val="clear" w:fill="F4F7F5"/>
                     <w:tcMar>
@@ -5171,7 +5171,7 @@
                 </w:tc>
                 <w:tc>
                   <w:tcPr>
-                    <w:tcW w:type="dxa" w:w="1987"/>
+                    <w:tcW w:type="dxa" w:w="1805"/>
                     <w:vAlign w:val="center"/>
                     <w:shd w:val="clear" w:fill="F4F7F5"/>
                     <w:tcMar>
@@ -5198,7 +5198,7 @@
                 </w:tc>
                 <w:tc>
                   <w:tcPr>
-                    <w:tcW w:type="dxa" w:w="3676"/>
+                    <w:tcW w:type="dxa" w:w="3339"/>
                     <w:vAlign w:val="center"/>
                     <w:shd w:val="clear" w:fill="F4F7F5"/>
                     <w:tcMar>
@@ -5230,7 +5230,7 @@
                 </w:trPr>
                 <w:tc>
                   <w:tcPr>
-                    <w:tcW w:type="dxa" w:w="2981"/>
+                    <w:tcW w:type="dxa" w:w="2708"/>
                     <w:vAlign w:val="center"/>
                     <w:tcMar>
                       <w:top w:w="90" w:type="dxa"/>
@@ -5254,7 +5254,7 @@
                 </w:tc>
                 <w:tc>
                   <w:tcPr>
-                    <w:tcW w:type="dxa" w:w="1292"/>
+                    <w:tcW w:type="dxa" w:w="1174"/>
                     <w:vAlign w:val="center"/>
                     <w:tcMar>
                       <w:top w:w="90" w:type="dxa"/>
@@ -5280,7 +5280,7 @@
                 </w:tc>
                 <w:tc>
                   <w:tcPr>
-                    <w:tcW w:type="dxa" w:w="1987"/>
+                    <w:tcW w:type="dxa" w:w="1805"/>
                     <w:vAlign w:val="center"/>
                     <w:tcMar>
                       <w:top w:w="90" w:type="dxa"/>
@@ -5306,7 +5306,7 @@
                 </w:tc>
                 <w:tc>
                   <w:tcPr>
-                    <w:tcW w:type="dxa" w:w="3676"/>
+                    <w:tcW w:type="dxa" w:w="3339"/>
                     <w:vAlign w:val="center"/>
                     <w:tcMar>
                       <w:top w:w="90" w:type="dxa"/>
@@ -5337,7 +5337,7 @@
                 </w:trPr>
                 <w:tc>
                   <w:tcPr>
-                    <w:tcW w:type="dxa" w:w="2981"/>
+                    <w:tcW w:type="dxa" w:w="2708"/>
                     <w:vAlign w:val="center"/>
                     <w:shd w:val="clear" w:fill="F4F7F5"/>
                     <w:tcMar>
@@ -5362,7 +5362,7 @@
                 </w:tc>
                 <w:tc>
                   <w:tcPr>
-                    <w:tcW w:type="dxa" w:w="1292"/>
+                    <w:tcW w:type="dxa" w:w="1174"/>
                     <w:vAlign w:val="center"/>
                     <w:shd w:val="clear" w:fill="F4F7F5"/>
                     <w:tcMar>
@@ -5389,7 +5389,7 @@
                 </w:tc>
                 <w:tc>
                   <w:tcPr>
-                    <w:tcW w:type="dxa" w:w="1987"/>
+                    <w:tcW w:type="dxa" w:w="1805"/>
                     <w:vAlign w:val="center"/>
                     <w:shd w:val="clear" w:fill="F4F7F5"/>
                     <w:tcMar>
@@ -5416,7 +5416,7 @@
                 </w:tc>
                 <w:tc>
                   <w:tcPr>
-                    <w:tcW w:type="dxa" w:w="3676"/>
+                    <w:tcW w:type="dxa" w:w="3339"/>
                     <w:vAlign w:val="center"/>
                     <w:shd w:val="clear" w:fill="F4F7F5"/>
                     <w:tcMar>
@@ -5483,7 +5483,7 @@
             </w:p>
             <w:tbl>
               <w:tblPr>
-                <w:tblW w:type="dxa" w:w="9936"/>
+                <w:tblW w:type="dxa" w:w="9026"/>
                 <w:jc w:val="left"/>
                 <w:tblLayout w:type="fixed"/>
                 <w:tblLook w:firstColumn="1" w:firstRow="1" w:lastColumn="0" w:lastRow="0" w:noHBand="0" w:noVBand="1" w:val="04A0"/>
@@ -5498,9 +5498,9 @@
                 </w:tblBorders>
               </w:tblPr>
               <w:tblGrid>
-                <w:gridCol w:w="3378"/>
-                <w:gridCol w:w="1590"/>
-                <w:gridCol w:w="4968"/>
+                <w:gridCol w:w="3069"/>
+                <w:gridCol w:w="1444"/>
+                <w:gridCol w:w="4513"/>
               </w:tblGrid>
               <w:tr>
                 <w:trPr>
@@ -5509,7 +5509,7 @@
                 </w:trPr>
                 <w:tc>
                   <w:tcPr>
-                    <w:tcW w:type="dxa" w:w="3378"/>
+                    <w:tcW w:type="dxa" w:w="3069"/>
                     <w:vAlign w:val="center"/>
                     <w:shd w:val="clear" w:fill="2F5651"/>
                     <w:tcMar>
@@ -5534,7 +5534,7 @@
                 </w:tc>
                 <w:tc>
                   <w:tcPr>
-                    <w:tcW w:type="dxa" w:w="1590"/>
+                    <w:tcW w:type="dxa" w:w="1444"/>
                     <w:vAlign w:val="center"/>
                     <w:shd w:val="clear" w:fill="2F5651"/>
                     <w:tcMar>
@@ -5559,7 +5559,7 @@
                 </w:tc>
                 <w:tc>
                   <w:tcPr>
-                    <w:tcW w:type="dxa" w:w="4968"/>
+                    <w:tcW w:type="dxa" w:w="4513"/>
                     <w:vAlign w:val="center"/>
                     <w:shd w:val="clear" w:fill="2F5651"/>
                     <w:tcMar>
@@ -5589,7 +5589,7 @@
                 </w:trPr>
                 <w:tc>
                   <w:tcPr>
-                    <w:tcW w:type="dxa" w:w="3378"/>
+                    <w:tcW w:type="dxa" w:w="3069"/>
                     <w:vAlign w:val="center"/>
                     <w:tcMar>
                       <w:top w:w="90" w:type="dxa"/>
@@ -5613,7 +5613,7 @@
                 </w:tc>
                 <w:tc>
                   <w:tcPr>
-                    <w:tcW w:type="dxa" w:w="1590"/>
+                    <w:tcW w:type="dxa" w:w="1444"/>
                     <w:vAlign w:val="center"/>
                     <w:tcMar>
                       <w:top w:w="90" w:type="dxa"/>
@@ -5639,7 +5639,7 @@
                 </w:tc>
                 <w:tc>
                   <w:tcPr>
-                    <w:tcW w:type="dxa" w:w="4968"/>
+                    <w:tcW w:type="dxa" w:w="4513"/>
                     <w:vAlign w:val="center"/>
                     <w:tcMar>
                       <w:top w:w="90" w:type="dxa"/>
@@ -5670,7 +5670,7 @@
                 </w:trPr>
                 <w:tc>
                   <w:tcPr>
-                    <w:tcW w:type="dxa" w:w="3378"/>
+                    <w:tcW w:type="dxa" w:w="3069"/>
                     <w:vAlign w:val="center"/>
                     <w:shd w:val="clear" w:fill="F4F7F5"/>
                     <w:tcMar>
@@ -5695,7 +5695,7 @@
                 </w:tc>
                 <w:tc>
                   <w:tcPr>
-                    <w:tcW w:type="dxa" w:w="1590"/>
+                    <w:tcW w:type="dxa" w:w="1444"/>
                     <w:vAlign w:val="center"/>
                     <w:shd w:val="clear" w:fill="F4F7F5"/>
                     <w:tcMar>
@@ -5722,7 +5722,7 @@
                 </w:tc>
                 <w:tc>
                   <w:tcPr>
-                    <w:tcW w:type="dxa" w:w="4968"/>
+                    <w:tcW w:type="dxa" w:w="4513"/>
                     <w:vAlign w:val="center"/>
                     <w:shd w:val="clear" w:fill="F4F7F5"/>
                     <w:tcMar>
@@ -5754,7 +5754,7 @@
                 </w:trPr>
                 <w:tc>
                   <w:tcPr>
-                    <w:tcW w:type="dxa" w:w="3378"/>
+                    <w:tcW w:type="dxa" w:w="3069"/>
                     <w:vAlign w:val="center"/>
                     <w:tcMar>
                       <w:top w:w="90" w:type="dxa"/>
@@ -5778,7 +5778,7 @@
                 </w:tc>
                 <w:tc>
                   <w:tcPr>
-                    <w:tcW w:type="dxa" w:w="1590"/>
+                    <w:tcW w:type="dxa" w:w="1444"/>
                     <w:vAlign w:val="center"/>
                     <w:tcMar>
                       <w:top w:w="90" w:type="dxa"/>
@@ -5804,7 +5804,7 @@
                 </w:tc>
                 <w:tc>
                   <w:tcPr>
-                    <w:tcW w:type="dxa" w:w="4968"/>
+                    <w:tcW w:type="dxa" w:w="4513"/>
                     <w:vAlign w:val="center"/>
                     <w:tcMar>
                       <w:top w:w="90" w:type="dxa"/>
@@ -5835,7 +5835,7 @@
                 </w:trPr>
                 <w:tc>
                   <w:tcPr>
-                    <w:tcW w:type="dxa" w:w="3378"/>
+                    <w:tcW w:type="dxa" w:w="3069"/>
                     <w:vAlign w:val="center"/>
                     <w:shd w:val="clear" w:fill="F4F7F5"/>
                     <w:tcMar>
@@ -5860,7 +5860,7 @@
                 </w:tc>
                 <w:tc>
                   <w:tcPr>
-                    <w:tcW w:type="dxa" w:w="1590"/>
+                    <w:tcW w:type="dxa" w:w="1444"/>
                     <w:vAlign w:val="center"/>
                     <w:shd w:val="clear" w:fill="F4F7F5"/>
                     <w:tcMar>
@@ -5887,7 +5887,7 @@
                 </w:tc>
                 <w:tc>
                   <w:tcPr>
-                    <w:tcW w:type="dxa" w:w="4968"/>
+                    <w:tcW w:type="dxa" w:w="4513"/>
                     <w:vAlign w:val="center"/>
                     <w:shd w:val="clear" w:fill="F4F7F5"/>
                     <w:tcMar>
@@ -5919,7 +5919,7 @@
                 </w:trPr>
                 <w:tc>
                   <w:tcPr>
-                    <w:tcW w:type="dxa" w:w="3378"/>
+                    <w:tcW w:type="dxa" w:w="3069"/>
                     <w:vAlign w:val="center"/>
                     <w:tcMar>
                       <w:top w:w="90" w:type="dxa"/>
@@ -5943,7 +5943,7 @@
                 </w:tc>
                 <w:tc>
                   <w:tcPr>
-                    <w:tcW w:type="dxa" w:w="1590"/>
+                    <w:tcW w:type="dxa" w:w="1444"/>
                     <w:vAlign w:val="center"/>
                     <w:tcMar>
                       <w:top w:w="90" w:type="dxa"/>
@@ -5969,7 +5969,7 @@
                 </w:tc>
                 <w:tc>
                   <w:tcPr>
-                    <w:tcW w:type="dxa" w:w="4968"/>
+                    <w:tcW w:type="dxa" w:w="4513"/>
                     <w:vAlign w:val="center"/>
                     <w:tcMar>
                       <w:top w:w="90" w:type="dxa"/>
@@ -6000,7 +6000,7 @@
                 </w:trPr>
                 <w:tc>
                   <w:tcPr>
-                    <w:tcW w:type="dxa" w:w="3378"/>
+                    <w:tcW w:type="dxa" w:w="3069"/>
                     <w:vAlign w:val="center"/>
                     <w:shd w:val="clear" w:fill="F4F7F5"/>
                     <w:tcMar>
@@ -6025,7 +6025,7 @@
                 </w:tc>
                 <w:tc>
                   <w:tcPr>
-                    <w:tcW w:type="dxa" w:w="1590"/>
+                    <w:tcW w:type="dxa" w:w="1444"/>
                     <w:vAlign w:val="center"/>
                     <w:shd w:val="clear" w:fill="F4F7F5"/>
                     <w:tcMar>
@@ -6052,7 +6052,7 @@
                 </w:tc>
                 <w:tc>
                   <w:tcPr>
-                    <w:tcW w:type="dxa" w:w="4968"/>
+                    <w:tcW w:type="dxa" w:w="4513"/>
                     <w:vAlign w:val="center"/>
                     <w:shd w:val="clear" w:fill="F4F7F5"/>
                     <w:tcMar>
@@ -6084,7 +6084,7 @@
                 </w:trPr>
                 <w:tc>
                   <w:tcPr>
-                    <w:tcW w:type="dxa" w:w="3378"/>
+                    <w:tcW w:type="dxa" w:w="3069"/>
                     <w:vAlign w:val="center"/>
                     <w:tcMar>
                       <w:top w:w="90" w:type="dxa"/>
@@ -6108,7 +6108,7 @@
                 </w:tc>
                 <w:tc>
                   <w:tcPr>
-                    <w:tcW w:type="dxa" w:w="1590"/>
+                    <w:tcW w:type="dxa" w:w="1444"/>
                     <w:vAlign w:val="center"/>
                     <w:tcMar>
                       <w:top w:w="90" w:type="dxa"/>
@@ -6134,7 +6134,7 @@
                 </w:tc>
                 <w:tc>
                   <w:tcPr>
-                    <w:tcW w:type="dxa" w:w="4968"/>
+                    <w:tcW w:type="dxa" w:w="4513"/>
                     <w:vAlign w:val="center"/>
                     <w:tcMar>
                       <w:top w:w="90" w:type="dxa"/>
@@ -6165,7 +6165,7 @@
                 </w:trPr>
                 <w:tc>
                   <w:tcPr>
-                    <w:tcW w:type="dxa" w:w="3378"/>
+                    <w:tcW w:type="dxa" w:w="3069"/>
                     <w:vAlign w:val="center"/>
                     <w:shd w:val="clear" w:fill="F4F7F5"/>
                     <w:tcMar>
@@ -6190,7 +6190,7 @@
                 </w:tc>
                 <w:tc>
                   <w:tcPr>
-                    <w:tcW w:type="dxa" w:w="1590"/>
+                    <w:tcW w:type="dxa" w:w="1444"/>
                     <w:vAlign w:val="center"/>
                     <w:shd w:val="clear" w:fill="F4F7F5"/>
                     <w:tcMar>
@@ -6217,7 +6217,7 @@
                 </w:tc>
                 <w:tc>
                   <w:tcPr>
-                    <w:tcW w:type="dxa" w:w="4968"/>
+                    <w:tcW w:type="dxa" w:w="4513"/>
                     <w:vAlign w:val="center"/>
                     <w:shd w:val="clear" w:fill="F4F7F5"/>
                     <w:tcMar>
@@ -6368,7 +6368,7 @@
         </w:p>
         <w:tbl>
           <w:tblPr>
-            <w:tblW w:type="dxa" w:w="9936"/>
+            <w:tblW w:type="dxa" w:w="9026"/>
             <w:jc w:val="left"/>
             <w:tblLayout w:type="fixed"/>
             <w:tblLook w:firstColumn="1" w:firstRow="1" w:lastColumn="0" w:lastRow="0" w:noHBand="0" w:noVBand="1" w:val="04A0"/>
@@ -6383,10 +6383,10 @@
             </w:tblBorders>
           </w:tblPr>
           <w:tblGrid>
-            <w:gridCol w:w="1788"/>
-            <w:gridCol w:w="1888"/>
-            <w:gridCol w:w="1888"/>
-            <w:gridCol w:w="4372"/>
+            <w:gridCol w:w="1624"/>
+            <w:gridCol w:w="1715"/>
+            <w:gridCol w:w="1715"/>
+            <w:gridCol w:w="3972"/>
           </w:tblGrid>
           <w:tr>
             <w:trPr>
@@ -6395,7 +6395,7 @@
             </w:trPr>
             <w:tc>
               <w:tcPr>
-                <w:tcW w:type="dxa" w:w="1788"/>
+                <w:tcW w:type="dxa" w:w="1624"/>
                 <w:vAlign w:val="center"/>
                 <w:shd w:val="clear" w:fill="2F5651"/>
                 <w:tcMar>
@@ -6420,7 +6420,7 @@
             </w:tc>
             <w:tc>
               <w:tcPr>
-                <w:tcW w:type="dxa" w:w="1888"/>
+                <w:tcW w:type="dxa" w:w="1715"/>
                 <w:vAlign w:val="center"/>
                 <w:shd w:val="clear" w:fill="2F5651"/>
                 <w:tcMar>
@@ -6445,7 +6445,7 @@
             </w:tc>
             <w:tc>
               <w:tcPr>
-                <w:tcW w:type="dxa" w:w="1888"/>
+                <w:tcW w:type="dxa" w:w="1715"/>
                 <w:vAlign w:val="center"/>
                 <w:shd w:val="clear" w:fill="2F5651"/>
                 <w:tcMar>
@@ -6470,7 +6470,7 @@
             </w:tc>
             <w:tc>
               <w:tcPr>
-                <w:tcW w:type="dxa" w:w="4372"/>
+                <w:tcW w:type="dxa" w:w="3972"/>
                 <w:vAlign w:val="center"/>
                 <w:shd w:val="clear" w:fill="2F5651"/>
                 <w:tcMar>
@@ -6500,7 +6500,7 @@
             </w:trPr>
             <w:tc>
               <w:tcPr>
-                <w:tcW w:type="dxa" w:w="1788"/>
+                <w:tcW w:type="dxa" w:w="1624"/>
                 <w:vAlign w:val="center"/>
                 <w:tcMar>
                   <w:top w:w="90" w:type="dxa"/>
@@ -6524,7 +6524,7 @@
             </w:tc>
             <w:tc>
               <w:tcPr>
-                <w:tcW w:type="dxa" w:w="1888"/>
+                <w:tcW w:type="dxa" w:w="1715"/>
                 <w:vAlign w:val="center"/>
                 <w:tcMar>
                   <w:top w:w="90" w:type="dxa"/>
@@ -6550,7 +6550,7 @@
             </w:tc>
             <w:tc>
               <w:tcPr>
-                <w:tcW w:type="dxa" w:w="1888"/>
+                <w:tcW w:type="dxa" w:w="1715"/>
                 <w:vAlign w:val="center"/>
                 <w:tcMar>
                   <w:top w:w="90" w:type="dxa"/>
@@ -6576,7 +6576,7 @@
             </w:tc>
             <w:tc>
               <w:tcPr>
-                <w:tcW w:type="dxa" w:w="4372"/>
+                <w:tcW w:type="dxa" w:w="3972"/>
                 <w:vAlign w:val="center"/>
                 <w:tcMar>
                   <w:top w:w="90" w:type="dxa"/>
@@ -6607,7 +6607,7 @@
             </w:trPr>
             <w:tc>
               <w:tcPr>
-                <w:tcW w:type="dxa" w:w="1788"/>
+                <w:tcW w:type="dxa" w:w="1624"/>
                 <w:vAlign w:val="center"/>
                 <w:shd w:val="clear" w:fill="F4F7F5"/>
                 <w:tcMar>
@@ -6632,7 +6632,7 @@
             </w:tc>
             <w:tc>
               <w:tcPr>
-                <w:tcW w:type="dxa" w:w="1888"/>
+                <w:tcW w:type="dxa" w:w="1715"/>
                 <w:vAlign w:val="center"/>
                 <w:shd w:val="clear" w:fill="F4F7F5"/>
                 <w:tcMar>
@@ -6659,7 +6659,7 @@
             </w:tc>
             <w:tc>
               <w:tcPr>
-                <w:tcW w:type="dxa" w:w="1888"/>
+                <w:tcW w:type="dxa" w:w="1715"/>
                 <w:vAlign w:val="center"/>
                 <w:shd w:val="clear" w:fill="F4F7F5"/>
                 <w:tcMar>
@@ -6686,7 +6686,7 @@
             </w:tc>
             <w:tc>
               <w:tcPr>
-                <w:tcW w:type="dxa" w:w="4372"/>
+                <w:tcW w:type="dxa" w:w="3972"/>
                 <w:vAlign w:val="center"/>
                 <w:shd w:val="clear" w:fill="F4F7F5"/>
                 <w:tcMar>
@@ -6718,7 +6718,7 @@
             </w:trPr>
             <w:tc>
               <w:tcPr>
-                <w:tcW w:type="dxa" w:w="1788"/>
+                <w:tcW w:type="dxa" w:w="1624"/>
                 <w:vAlign w:val="center"/>
                 <w:tcMar>
                   <w:top w:w="90" w:type="dxa"/>
@@ -6742,7 +6742,7 @@
             </w:tc>
             <w:tc>
               <w:tcPr>
-                <w:tcW w:type="dxa" w:w="1888"/>
+                <w:tcW w:type="dxa" w:w="1715"/>
                 <w:vAlign w:val="center"/>
                 <w:tcMar>
                   <w:top w:w="90" w:type="dxa"/>
@@ -6768,7 +6768,7 @@
             </w:tc>
             <w:tc>
               <w:tcPr>
-                <w:tcW w:type="dxa" w:w="1888"/>
+                <w:tcW w:type="dxa" w:w="1715"/>
                 <w:vAlign w:val="center"/>
                 <w:tcMar>
                   <w:top w:w="90" w:type="dxa"/>
@@ -6794,7 +6794,7 @@
             </w:tc>
             <w:tc>
               <w:tcPr>
-                <w:tcW w:type="dxa" w:w="4372"/>
+                <w:tcW w:type="dxa" w:w="3972"/>
                 <w:vAlign w:val="center"/>
                 <w:tcMar>
                   <w:top w:w="90" w:type="dxa"/>
@@ -6825,7 +6825,7 @@
             </w:trPr>
             <w:tc>
               <w:tcPr>
-                <w:tcW w:type="dxa" w:w="1788"/>
+                <w:tcW w:type="dxa" w:w="1624"/>
                 <w:vAlign w:val="center"/>
                 <w:shd w:val="clear" w:fill="F4F7F5"/>
                 <w:tcMar>
@@ -6850,7 +6850,7 @@
             </w:tc>
             <w:tc>
               <w:tcPr>
-                <w:tcW w:type="dxa" w:w="1888"/>
+                <w:tcW w:type="dxa" w:w="1715"/>
                 <w:vAlign w:val="center"/>
                 <w:shd w:val="clear" w:fill="F4F7F5"/>
                 <w:tcMar>
@@ -6877,7 +6877,7 @@
             </w:tc>
             <w:tc>
               <w:tcPr>
-                <w:tcW w:type="dxa" w:w="1888"/>
+                <w:tcW w:type="dxa" w:w="1715"/>
                 <w:vAlign w:val="center"/>
                 <w:shd w:val="clear" w:fill="F4F7F5"/>
                 <w:tcMar>
@@ -6904,7 +6904,7 @@
             </w:tc>
             <w:tc>
               <w:tcPr>
-                <w:tcW w:type="dxa" w:w="4372"/>
+                <w:tcW w:type="dxa" w:w="3972"/>
                 <w:vAlign w:val="center"/>
                 <w:shd w:val="clear" w:fill="F4F7F5"/>
                 <w:tcMar>
@@ -6936,7 +6936,7 @@
             </w:trPr>
             <w:tc>
               <w:tcPr>
-                <w:tcW w:type="dxa" w:w="1788"/>
+                <w:tcW w:type="dxa" w:w="1624"/>
                 <w:vAlign w:val="center"/>
                 <w:tcMar>
                   <w:top w:w="90" w:type="dxa"/>
@@ -6960,7 +6960,7 @@
             </w:tc>
             <w:tc>
               <w:tcPr>
-                <w:tcW w:type="dxa" w:w="1888"/>
+                <w:tcW w:type="dxa" w:w="1715"/>
                 <w:vAlign w:val="center"/>
                 <w:tcMar>
                   <w:top w:w="90" w:type="dxa"/>
@@ -6986,7 +6986,7 @@
             </w:tc>
             <w:tc>
               <w:tcPr>
-                <w:tcW w:type="dxa" w:w="1888"/>
+                <w:tcW w:type="dxa" w:w="1715"/>
                 <w:vAlign w:val="center"/>
                 <w:tcMar>
                   <w:top w:w="90" w:type="dxa"/>
@@ -7012,7 +7012,7 @@
             </w:tc>
             <w:tc>
               <w:tcPr>
-                <w:tcW w:type="dxa" w:w="4372"/>
+                <w:tcW w:type="dxa" w:w="3972"/>
                 <w:vAlign w:val="center"/>
                 <w:tcMar>
                   <w:top w:w="90" w:type="dxa"/>
@@ -8284,7 +8284,7 @@
         </w:p>
         <w:tbl>
           <w:tblPr>
-            <w:tblW w:type="dxa" w:w="9936"/>
+            <w:tblW w:type="dxa" w:w="9026"/>
             <w:jc w:val="left"/>
             <w:tblLayout w:type="fixed"/>
             <w:tblLook w:firstColumn="1" w:firstRow="1" w:lastColumn="0" w:lastRow="0" w:noHBand="0" w:noVBand="1" w:val="04A0"/>
@@ -8299,11 +8299,11 @@
             </w:tblBorders>
           </w:tblPr>
           <w:tblGrid>
-            <w:gridCol w:w="1788"/>
-            <w:gridCol w:w="1987"/>
-            <w:gridCol w:w="2981"/>
-            <w:gridCol w:w="1987"/>
-            <w:gridCol w:w="1193"/>
+            <w:gridCol w:w="1624"/>
+            <w:gridCol w:w="1805"/>
+            <w:gridCol w:w="2708"/>
+            <w:gridCol w:w="1805"/>
+            <w:gridCol w:w="1084"/>
           </w:tblGrid>
           <w:tr>
             <w:trPr>
@@ -8312,7 +8312,7 @@
             </w:trPr>
             <w:tc>
               <w:tcPr>
-                <w:tcW w:type="dxa" w:w="1788"/>
+                <w:tcW w:type="dxa" w:w="1624"/>
                 <w:vAlign w:val="center"/>
                 <w:shd w:val="clear" w:fill="2F5651"/>
                 <w:tcMar>
@@ -8337,7 +8337,7 @@
             </w:tc>
             <w:tc>
               <w:tcPr>
-                <w:tcW w:type="dxa" w:w="1987"/>
+                <w:tcW w:type="dxa" w:w="1805"/>
                 <w:vAlign w:val="center"/>
                 <w:shd w:val="clear" w:fill="2F5651"/>
                 <w:tcMar>
@@ -8362,7 +8362,7 @@
             </w:tc>
             <w:tc>
               <w:tcPr>
-                <w:tcW w:type="dxa" w:w="2981"/>
+                <w:tcW w:type="dxa" w:w="2708"/>
                 <w:vAlign w:val="center"/>
                 <w:shd w:val="clear" w:fill="2F5651"/>
                 <w:tcMar>
@@ -8387,7 +8387,7 @@
             </w:tc>
             <w:tc>
               <w:tcPr>
-                <w:tcW w:type="dxa" w:w="1987"/>
+                <w:tcW w:type="dxa" w:w="1805"/>
                 <w:vAlign w:val="center"/>
                 <w:shd w:val="clear" w:fill="2F5651"/>
                 <w:tcMar>
@@ -8412,7 +8412,7 @@
             </w:tc>
             <w:tc>
               <w:tcPr>
-                <w:tcW w:type="dxa" w:w="1193"/>
+                <w:tcW w:type="dxa" w:w="1084"/>
                 <w:vAlign w:val="center"/>
                 <w:shd w:val="clear" w:fill="2F5651"/>
                 <w:tcMar>
@@ -8442,7 +8442,7 @@
             </w:trPr>
             <w:tc>
               <w:tcPr>
-                <w:tcW w:type="dxa" w:w="1788"/>
+                <w:tcW w:type="dxa" w:w="1624"/>
                 <w:vAlign w:val="center"/>
                 <w:tcMar>
                   <w:top w:w="90" w:type="dxa"/>
@@ -8468,7 +8468,7 @@
             </w:tc>
             <w:tc>
               <w:tcPr>
-                <w:tcW w:type="dxa" w:w="1987"/>
+                <w:tcW w:type="dxa" w:w="1805"/>
                 <w:vAlign w:val="center"/>
                 <w:tcMar>
                   <w:top w:w="90" w:type="dxa"/>
@@ -8494,7 +8494,7 @@
             </w:tc>
             <w:tc>
               <w:tcPr>
-                <w:tcW w:type="dxa" w:w="2981"/>
+                <w:tcW w:type="dxa" w:w="2708"/>
                 <w:vAlign w:val="center"/>
                 <w:tcMar>
                   <w:top w:w="90" w:type="dxa"/>
@@ -8520,7 +8520,7 @@
             </w:tc>
             <w:tc>
               <w:tcPr>
-                <w:tcW w:type="dxa" w:w="1987"/>
+                <w:tcW w:type="dxa" w:w="1805"/>
                 <w:vAlign w:val="center"/>
                 <w:tcMar>
                   <w:top w:w="90" w:type="dxa"/>
@@ -8546,7 +8546,7 @@
             </w:tc>
             <w:tc>
               <w:tcPr>
-                <w:tcW w:type="dxa" w:w="1193"/>
+                <w:tcW w:type="dxa" w:w="1084"/>
                 <w:vAlign w:val="center"/>
                 <w:tcMar>
                   <w:top w:w="90" w:type="dxa"/>
@@ -8577,7 +8577,7 @@
             </w:trPr>
             <w:tc>
               <w:tcPr>
-                <w:tcW w:type="dxa" w:w="1788"/>
+                <w:tcW w:type="dxa" w:w="1624"/>
                 <w:vAlign w:val="center"/>
                 <w:shd w:val="clear" w:fill="F4F7F5"/>
                 <w:tcMar>
@@ -8604,7 +8604,7 @@
             </w:tc>
             <w:tc>
               <w:tcPr>
-                <w:tcW w:type="dxa" w:w="1987"/>
+                <w:tcW w:type="dxa" w:w="1805"/>
                 <w:vAlign w:val="center"/>
                 <w:shd w:val="clear" w:fill="F4F7F5"/>
                 <w:tcMar>
@@ -8631,7 +8631,7 @@
             </w:tc>
             <w:tc>
               <w:tcPr>
-                <w:tcW w:type="dxa" w:w="2981"/>
+                <w:tcW w:type="dxa" w:w="2708"/>
                 <w:vAlign w:val="center"/>
                 <w:shd w:val="clear" w:fill="F4F7F5"/>
                 <w:tcMar>
@@ -8658,7 +8658,7 @@
             </w:tc>
             <w:tc>
               <w:tcPr>
-                <w:tcW w:type="dxa" w:w="1987"/>
+                <w:tcW w:type="dxa" w:w="1805"/>
                 <w:vAlign w:val="center"/>
                 <w:shd w:val="clear" w:fill="F4F7F5"/>
                 <w:tcMar>
@@ -8685,7 +8685,7 @@
             </w:tc>
             <w:tc>
               <w:tcPr>
-                <w:tcW w:type="dxa" w:w="1193"/>
+                <w:tcW w:type="dxa" w:w="1084"/>
                 <w:vAlign w:val="center"/>
                 <w:shd w:val="clear" w:fill="F4F7F5"/>
                 <w:tcMar>
@@ -8717,7 +8717,7 @@
             </w:trPr>
             <w:tc>
               <w:tcPr>
-                <w:tcW w:type="dxa" w:w="1788"/>
+                <w:tcW w:type="dxa" w:w="1624"/>
                 <w:vAlign w:val="center"/>
                 <w:tcMar>
                   <w:top w:w="90" w:type="dxa"/>
@@ -8743,7 +8743,7 @@
             </w:tc>
             <w:tc>
               <w:tcPr>
-                <w:tcW w:type="dxa" w:w="1987"/>
+                <w:tcW w:type="dxa" w:w="1805"/>
                 <w:vAlign w:val="center"/>
                 <w:tcMar>
                   <w:top w:w="90" w:type="dxa"/>
@@ -8769,7 +8769,7 @@
             </w:tc>
             <w:tc>
               <w:tcPr>
-                <w:tcW w:type="dxa" w:w="2981"/>
+                <w:tcW w:type="dxa" w:w="2708"/>
                 <w:vAlign w:val="center"/>
                 <w:tcMar>
                   <w:top w:w="90" w:type="dxa"/>
@@ -8795,7 +8795,7 @@
             </w:tc>
             <w:tc>
               <w:tcPr>
-                <w:tcW w:type="dxa" w:w="1987"/>
+                <w:tcW w:type="dxa" w:w="1805"/>
                 <w:vAlign w:val="center"/>
                 <w:tcMar>
                   <w:top w:w="90" w:type="dxa"/>
@@ -8821,7 +8821,7 @@
             </w:tc>
             <w:tc>
               <w:tcPr>
-                <w:tcW w:type="dxa" w:w="1193"/>
+                <w:tcW w:type="dxa" w:w="1084"/>
                 <w:vAlign w:val="center"/>
                 <w:tcMar>
                   <w:top w:w="90" w:type="dxa"/>
@@ -8852,7 +8852,7 @@
             </w:trPr>
             <w:tc>
               <w:tcPr>
-                <w:tcW w:type="dxa" w:w="1788"/>
+                <w:tcW w:type="dxa" w:w="1624"/>
                 <w:vAlign w:val="center"/>
                 <w:shd w:val="clear" w:fill="F4F7F5"/>
                 <w:tcMar>
@@ -8879,7 +8879,7 @@
             </w:tc>
             <w:tc>
               <w:tcPr>
-                <w:tcW w:type="dxa" w:w="1987"/>
+                <w:tcW w:type="dxa" w:w="1805"/>
                 <w:vAlign w:val="center"/>
                 <w:shd w:val="clear" w:fill="F4F7F5"/>
                 <w:tcMar>
@@ -8906,7 +8906,7 @@
             </w:tc>
             <w:tc>
               <w:tcPr>
-                <w:tcW w:type="dxa" w:w="2981"/>
+                <w:tcW w:type="dxa" w:w="2708"/>
                 <w:vAlign w:val="center"/>
                 <w:shd w:val="clear" w:fill="F4F7F5"/>
                 <w:tcMar>
@@ -8933,7 +8933,7 @@
             </w:tc>
             <w:tc>
               <w:tcPr>
-                <w:tcW w:type="dxa" w:w="1987"/>
+                <w:tcW w:type="dxa" w:w="1805"/>
                 <w:vAlign w:val="center"/>
                 <w:shd w:val="clear" w:fill="F4F7F5"/>
                 <w:tcMar>
@@ -8960,7 +8960,7 @@
             </w:tc>
             <w:tc>
               <w:tcPr>
-                <w:tcW w:type="dxa" w:w="1193"/>
+                <w:tcW w:type="dxa" w:w="1084"/>
                 <w:vAlign w:val="center"/>
                 <w:shd w:val="clear" w:fill="F4F7F5"/>
                 <w:tcMar>
@@ -9272,7 +9272,7 @@
         </w:p>
         <w:tbl>
           <w:tblPr>
-            <w:tblW w:type="dxa" w:w="9936"/>
+            <w:tblW w:type="dxa" w:w="9026"/>
             <w:jc w:val="left"/>
             <w:tblLayout w:type="fixed"/>
             <w:tblLook w:firstColumn="1" w:firstRow="1" w:lastColumn="0" w:lastRow="0" w:noHBand="0" w:noVBand="1" w:val="04A0"/>
@@ -9287,8 +9287,8 @@
             </w:tblBorders>
           </w:tblPr>
           <w:tblGrid>
-            <w:gridCol w:w="3180"/>
-            <w:gridCol w:w="6756"/>
+            <w:gridCol w:w="2889"/>
+            <w:gridCol w:w="6137"/>
           </w:tblGrid>
           <w:tr>
             <w:trPr>
@@ -9297,7 +9297,7 @@
             </w:trPr>
             <w:tc>
               <w:tcPr>
-                <w:tcW w:type="dxa" w:w="3180"/>
+                <w:tcW w:type="dxa" w:w="2889"/>
                 <w:vAlign w:val="center"/>
                 <w:shd w:val="clear" w:fill="2F5651"/>
                 <w:tcMar>
@@ -9322,7 +9322,7 @@
             </w:tc>
             <w:tc>
               <w:tcPr>
-                <w:tcW w:type="dxa" w:w="6756"/>
+                <w:tcW w:type="dxa" w:w="6137"/>
                 <w:vAlign w:val="center"/>
                 <w:tcMar>
                   <w:top w:w="95" w:type="dxa"/>
@@ -9360,7 +9360,7 @@
             </w:trPr>
             <w:tc>
               <w:tcPr>
-                <w:tcW w:type="dxa" w:w="3180"/>
+                <w:tcW w:type="dxa" w:w="2889"/>
                 <w:vAlign w:val="center"/>
                 <w:shd w:val="clear" w:fill="2F5651"/>
                 <w:tcMar>
@@ -9385,7 +9385,7 @@
             </w:tc>
             <w:tc>
               <w:tcPr>
-                <w:tcW w:type="dxa" w:w="6756"/>
+                <w:tcW w:type="dxa" w:w="6137"/>
                 <w:vAlign w:val="center"/>
                 <w:shd w:val="clear" w:fill="F4F7F5"/>
                 <w:tcMar>
@@ -9445,7 +9445,7 @@
             </w:trPr>
             <w:tc>
               <w:tcPr>
-                <w:tcW w:type="dxa" w:w="3180"/>
+                <w:tcW w:type="dxa" w:w="2889"/>
                 <w:vAlign w:val="center"/>
                 <w:shd w:val="clear" w:fill="2F5651"/>
                 <w:tcMar>
@@ -9470,7 +9470,7 @@
             </w:tc>
             <w:tc>
               <w:tcPr>
-                <w:tcW w:type="dxa" w:w="6756"/>
+                <w:tcW w:type="dxa" w:w="6137"/>
                 <w:vAlign w:val="center"/>
                 <w:tcMar>
                   <w:top w:w="95" w:type="dxa"/>
@@ -9508,7 +9508,7 @@
             </w:trPr>
             <w:tc>
               <w:tcPr>
-                <w:tcW w:type="dxa" w:w="3180"/>
+                <w:tcW w:type="dxa" w:w="2889"/>
                 <w:vAlign w:val="center"/>
                 <w:shd w:val="clear" w:fill="2F5651"/>
                 <w:tcMar>
@@ -9533,7 +9533,7 @@
             </w:tc>
             <w:tc>
               <w:tcPr>
-                <w:tcW w:type="dxa" w:w="6756"/>
+                <w:tcW w:type="dxa" w:w="6137"/>
                 <w:vAlign w:val="center"/>
                 <w:shd w:val="clear" w:fill="F4F7F5"/>
                 <w:tcMar>
@@ -9593,7 +9593,7 @@
             </w:trPr>
             <w:tc>
               <w:tcPr>
-                <w:tcW w:type="dxa" w:w="3180"/>
+                <w:tcW w:type="dxa" w:w="2889"/>
                 <w:vAlign w:val="center"/>
                 <w:shd w:val="clear" w:fill="2F5651"/>
                 <w:tcMar>
@@ -9618,7 +9618,7 @@
             </w:tc>
             <w:tc>
               <w:tcPr>
-                <w:tcW w:type="dxa" w:w="6756"/>
+                <w:tcW w:type="dxa" w:w="6137"/>
                 <w:vAlign w:val="center"/>
                 <w:tcMar>
                   <w:top w:w="95" w:type="dxa"/>
@@ -9677,7 +9677,7 @@
             </w:trPr>
             <w:tc>
               <w:tcPr>
-                <w:tcW w:type="dxa" w:w="3180"/>
+                <w:tcW w:type="dxa" w:w="2889"/>
                 <w:vAlign w:val="center"/>
                 <w:shd w:val="clear" w:fill="2F5651"/>
                 <w:tcMar>
@@ -9702,7 +9702,7 @@
             </w:tc>
             <w:tc>
               <w:tcPr>
-                <w:tcW w:type="dxa" w:w="6756"/>
+                <w:tcW w:type="dxa" w:w="6137"/>
                 <w:vAlign w:val="center"/>
                 <w:shd w:val="clear" w:fill="F4F7F5"/>
                 <w:tcMar>
@@ -9734,7 +9734,7 @@
             </w:trPr>
             <w:tc>
               <w:tcPr>
-                <w:tcW w:type="dxa" w:w="3180"/>
+                <w:tcW w:type="dxa" w:w="2889"/>
                 <w:vAlign w:val="center"/>
                 <w:shd w:val="clear" w:fill="2F5651"/>
                 <w:tcMar>
@@ -9759,7 +9759,7 @@
             </w:tc>
             <w:tc>
               <w:tcPr>
-                <w:tcW w:type="dxa" w:w="6756"/>
+                <w:tcW w:type="dxa" w:w="6137"/>
                 <w:vAlign w:val="center"/>
                 <w:tcMar>
                   <w:top w:w="95" w:type="dxa"/>
@@ -10010,7 +10010,7 @@
       <w:headerReference w:type="default" r:id="rId25"/>
       <w:footerReference w:type="default" r:id="rId26"/>
       <w:pgSz w:w="11906" w:h="16838" w:orient="portrait" w:code="9"/>
-      <w:pgMar w:top="1037" w:right="1152" w:bottom="979" w:left="1152" w:header="360" w:footer="360" w:gutter="0"/>
+      <w:pgMar w:top="1900" w:right="1440" w:bottom="1180" w:left="1440" w:header="560" w:footer="720" w:gutter="0"/>
       <w:cols w:space="720"/>
       <w:docGrid w:linePitch="326"/>
       <w:pgNumType w:fmt="decimal" w:start="1"/>
@@ -10185,7 +10185,7 @@
             <w:rPr>
               <w:rFonts w:ascii="Arial" w:hAnsi="Arial" w:eastAsia="Arial" w:cs="Arial"/>
               <w:color w:val="62716E"/>
-              <w:sz w:val="16"/>
+              <w:sz w:val="18"/>
             </w:rPr>
             <w:t xml:space="preserve">Opal Therapy | Functional Assessment Report | Confidential | </w:t>
           </w:r>
@@ -10200,7 +10200,7 @@
                 <w:rPr>
                   <w:rFonts w:ascii="Arial" w:hAnsi="Arial" w:eastAsia="Arial" w:cs="Arial"/>
                   <w:color w:val="62716E"/>
-                  <w:sz w:val="16"/>
+                  <w:sz w:val="18"/>
                 </w:rPr>
                 <w:t>[PORTAL — REPORT ID]</w:t>
               </w:r>
@@ -10227,7 +10227,7 @@
             <w:rPr>
               <w:rFonts w:ascii="Arial" w:hAnsi="Arial" w:eastAsia="Arial" w:cs="Arial"/>
               <w:color w:val="62716E"/>
-              <w:sz w:val="16"/>
+              <w:sz w:val="18"/>
             </w:rPr>
             <w:t xml:space="preserve">Page </w:t>
           </w:r>
@@ -10235,7 +10235,7 @@
             <w:rPr>
               <w:rFonts w:ascii="Arial" w:hAnsi="Arial" w:eastAsia="Arial" w:cs="Arial"/>
               <w:color w:val="62716E"/>
-              <w:sz w:val="16"/>
+              <w:sz w:val="18"/>
             </w:rPr>
             <w:fldChar w:fldCharType="begin"/>
             <w:instrText xml:space="preserve"> PAGE </w:instrText>
@@ -10333,7 +10333,7 @@
         <w:rFonts w:ascii="Arial" w:hAnsi="Arial" w:eastAsia="Arial" w:cs="Arial"/>
         <w:b/>
         <w:color w:val="2F5651"/>
-        <w:sz w:val="16"/>
+        <w:sz w:val="18"/>
       </w:rPr>
       <w:t>FUNCTIONAL ASSESSMENT REPORT</w:t>
     </w:r>
@@ -10359,7 +10359,7 @@
             <w:rFonts w:ascii="Arial" w:hAnsi="Arial" w:eastAsia="Arial" w:cs="Arial"/>
             <w:b w:val="0"/>
             <w:color w:val="566E70"/>
-            <w:sz w:val="15"/>
+            <w:sz w:val="18"/>
           </w:rPr>
           <w:t>[PORTAL — CLIENT NAME]</w:t>
         </w:r>
@@ -10370,7 +10370,7 @@
         <w:rFonts w:ascii="Arial" w:hAnsi="Arial" w:eastAsia="Arial" w:cs="Arial"/>
         <w:b w:val="0"/>
         <w:color w:val="566E70"/>
-        <w:sz w:val="15"/>
+        <w:sz w:val="18"/>
       </w:rPr>
       <w:t xml:space="preserve"> | NDIS </w:t>
     </w:r>
@@ -10386,7 +10386,7 @@
             <w:rFonts w:ascii="Arial" w:hAnsi="Arial" w:eastAsia="Arial" w:cs="Arial"/>
             <w:b w:val="0"/>
             <w:color w:val="566E70"/>
-            <w:sz w:val="15"/>
+            <w:sz w:val="18"/>
           </w:rPr>
           <w:t>[PORTAL — NDIS NUMBER]</w:t>
         </w:r>
@@ -18696,9 +18696,9 @@
       <w:suff w:val="tab"/>
       <w:pPr>
         <w:tabs>
-          <w:tab w:val="num" w:pos="540"/>
+          <w:tab w:val="num" w:pos="720"/>
         </w:tabs>
-        <w:ind w:left="540" w:hanging="260"/>
+        <w:ind w:left="720" w:hanging="432"/>
       </w:pPr>
       <w:rPr>
         <w:rFonts w:ascii="Arial" w:hAnsi="Arial" w:eastAsia="Arial" w:cs="Arial"/>
@@ -18718,9 +18718,9 @@
       <w:suff w:val="tab"/>
       <w:pPr>
         <w:tabs>
-          <w:tab w:val="num" w:pos="540"/>
+          <w:tab w:val="num" w:pos="720"/>
         </w:tabs>
-        <w:ind w:left="540" w:hanging="260"/>
+        <w:ind w:left="720" w:hanging="432"/>
       </w:pPr>
       <w:rPr>
         <w:rFonts w:ascii="Arial" w:hAnsi="Arial" w:eastAsia="Arial" w:cs="Arial"/>
@@ -19127,7 +19127,7 @@
     <w:name w:val="Normal"/>
     <w:rsid w:val="00465943"/>
     <w:pPr>
-      <w:spacing w:before="0" w:after="140" w:line="288" w:lineRule="auto"/>
+      <w:spacing w:before="0" w:after="240" w:line="300" w:lineRule="auto"/>
     </w:pPr>
     <w:rPr>
       <w:rFonts w:asciiTheme="minorHAnsi" w:hAnsiTheme="minorHAnsi" w:ascii="Arial" w:hAnsi="Arial" w:eastAsia="Arial" w:cs="Arial"/>
@@ -19153,9 +19153,9 @@
     <w:tblPr>
       <w:tblInd w:w="0" w:type="dxa"/>
       <w:tblCellMar>
-        <w:top w:w="0" w:type="dxa"/>
+        <w:top w:w="60" w:type="dxa"/>
         <w:left w:w="108" w:type="dxa"/>
-        <w:bottom w:w="0" w:type="dxa"/>
+        <w:bottom w:w="60" w:type="dxa"/>
         <w:right w:w="108" w:type="dxa"/>
       </w:tblCellMar>
     </w:tblPr>
@@ -19197,7 +19197,7 @@
     <w:rPr>
       <w:i w:val="0"/>
       <w:iCs w:val="0"/>
-      <w:sz w:val="24"/>
+      <w:sz w:val="18"/>
       <w:szCs w:val="22"/>
     </w:rPr>
     <w:semiHidden/>
@@ -19215,7 +19215,7 @@
     </w:pPr>
     <w:rPr>
       <w:rFonts w:cstheme="minorHAnsi"/>
-      <w:sz w:val="21"/>
+      <w:sz w:val="18"/>
     </w:rPr>
   </w:style>
   <w:style w:type="character" w:styleId="Hyperlink">
@@ -19234,7 +19234,7 @@
     <w:uiPriority w:val="1"/>
     <w:qFormat/>
     <w:pPr>
-      <w:spacing w:before="0" w:after="140" w:line="288" w:lineRule="auto"/>
+      <w:spacing w:before="0" w:after="240" w:line="300" w:lineRule="auto"/>
     </w:pPr>
     <w:rPr>
       <w:rFonts w:ascii="Arial" w:hAnsi="Arial" w:eastAsia="Arial" w:cs="Arial"/>
@@ -19250,7 +19250,7 @@
     <w:uiPriority w:val="2"/>
     <w:qFormat/>
     <w:pPr>
-      <w:spacing w:after="140"/>
+      <w:spacing w:before="0" w:after="240" w:line="300" w:lineRule="auto"/>
     </w:pPr>
     <w:rPr>
       <w:rFonts w:ascii="Arial" w:hAnsi="Arial" w:eastAsia="Arial" w:cs="Arial"/>
@@ -19275,7 +19275,7 @@
       <w:b/>
       <w:i w:val="0"/>
       <w:color w:val="2F5651"/>
-      <w:sz w:val="60"/>
+      <w:sz w:val="44"/>
     </w:rPr>
   </w:style>
   <w:style w:type="paragraph" w:customStyle="1" w:styleId="OPAL–Subtitle">
@@ -19293,7 +19293,7 @@
       <w:b w:val="0"/>
       <w:i w:val="0"/>
       <w:color w:val="566E70"/>
-      <w:sz w:val="27"/>
+      <w:sz w:val="28"/>
     </w:rPr>
   </w:style>
   <w:style w:type="paragraph" w:customStyle="1" w:styleId="OPAL–Heading1">
@@ -19304,7 +19304,7 @@
     <w:pPr>
       <w:keepNext/>
       <w:keepLines/>
-      <w:spacing w:before="360" w:after="180"/>
+      <w:spacing w:before="480" w:after="240"/>
       <w:outlineLvl w:val="0"/>
     </w:pPr>
     <w:rPr>
@@ -19312,7 +19312,7 @@
       <w:b/>
       <w:i w:val="0"/>
       <w:color w:val="2F5651"/>
-      <w:sz w:val="40"/>
+      <w:sz w:val="28"/>
     </w:rPr>
   </w:style>
   <w:style w:type="paragraph" w:customStyle="1" w:styleId="OPAL–Heading2">
@@ -19323,7 +19323,7 @@
     <w:pPr>
       <w:keepNext/>
       <w:keepLines/>
-      <w:spacing w:before="300" w:after="120"/>
+      <w:spacing w:before="360" w:after="120"/>
       <w:outlineLvl w:val="1"/>
     </w:pPr>
     <w:rPr>
@@ -19331,7 +19331,7 @@
       <w:b/>
       <w:i w:val="0"/>
       <w:color w:val="2F5651"/>
-      <w:sz w:val="30"/>
+      <w:sz w:val="24"/>
     </w:rPr>
   </w:style>
   <w:style w:type="paragraph" w:customStyle="1" w:styleId="OPAL–Heading3">
@@ -19342,7 +19342,7 @@
     <w:pPr>
       <w:keepNext/>
       <w:keepLines/>
-      <w:spacing w:before="240" w:after="80"/>
+      <w:spacing w:before="240" w:after="120"/>
       <w:outlineLvl w:val="2"/>
     </w:pPr>
     <w:rPr>
@@ -19350,7 +19350,7 @@
       <w:b/>
       <w:i w:val="0"/>
       <w:color w:val="566E70"/>
-      <w:sz w:val="24"/>
+      <w:sz w:val="22"/>
     </w:rPr>
   </w:style>
   <w:style w:type="paragraph" w:customStyle="1" w:styleId="OPAL–Heading4">
@@ -19361,7 +19361,7 @@
     <w:pPr>
       <w:keepNext/>
       <w:keepLines/>
-      <w:spacing w:before="180" w:after="60"/>
+      <w:spacing w:before="240" w:after="60"/>
       <w:outlineLvl w:val="3"/>
     </w:pPr>
     <w:rPr>
@@ -19378,7 +19378,7 @@
     <w:uiPriority w:val="13"/>
     <w:qFormat/>
     <w:pPr>
-      <w:spacing w:before="80" w:after="160" w:line="288" w:lineRule="auto"/>
+      <w:spacing w:before="0" w:after="240" w:line="300" w:lineRule="auto"/>
       <w:ind w:left="216" w:right="144"/>
       <w:shd w:val="clear" w:fill="E8F1EC"/>
       <w:pBdr>
@@ -19390,7 +19390,7 @@
       <w:b w:val="0"/>
       <w:i/>
       <w:color w:val="566E70"/>
-      <w:sz w:val="21"/>
+      <w:sz w:val="22"/>
     </w:rPr>
   </w:style>
   <w:style w:type="paragraph" w:customStyle="1" w:styleId="OPAL–ClinicalPrompt">
@@ -19400,7 +19400,7 @@
     <w:qFormat/>
     <w:pPr>
       <w:keepLines/>
-      <w:spacing w:before="100" w:after="180"/>
+      <w:spacing w:before="0" w:after="240" w:line="276" w:lineRule="auto"/>
       <w:ind w:left="216" w:right="144"/>
       <w:shd w:val="clear" w:fill="F6EDE5"/>
       <w:pBdr>
@@ -19412,7 +19412,7 @@
       <w:b w:val="0"/>
       <w:i/>
       <w:color w:val="566E70"/>
-      <w:sz w:val="19"/>
+      <w:sz w:val="18"/>
     </w:rPr>
   </w:style>
   <w:style w:type="paragraph" w:customStyle="1" w:styleId="OPAL–KeyFinding">
@@ -19422,7 +19422,7 @@
     <w:qFormat/>
     <w:pPr>
       <w:keepLines/>
-      <w:spacing w:before="120" w:after="200"/>
+      <w:spacing w:before="120" w:after="240" w:line="300" w:lineRule="auto"/>
       <w:ind w:left="245" w:right="144"/>
       <w:shd w:val="clear" w:fill="E8F1EC"/>
       <w:pBdr>
@@ -19444,7 +19444,7 @@
     <w:qFormat/>
     <w:pPr>
       <w:keepLines/>
-      <w:spacing w:before="120" w:after="180"/>
+      <w:spacing w:before="120" w:after="240" w:line="300" w:lineRule="auto"/>
       <w:ind w:left="245" w:right="144"/>
       <w:shd w:val="clear" w:fill="FAF7F2"/>
       <w:pBdr>
@@ -19456,7 +19456,7 @@
       <w:b w:val="0"/>
       <w:i w:val="0"/>
       <w:color w:val="263633"/>
-      <w:sz w:val="21"/>
+      <w:sz w:val="22"/>
     </w:rPr>
   </w:style>
   <w:style w:type="paragraph" w:customStyle="1" w:styleId="OPAL–Caption">
@@ -19466,7 +19466,7 @@
     <w:qFormat/>
     <w:pPr>
       <w:keepNext/>
-      <w:spacing w:before="80" w:after="180"/>
+      <w:spacing w:before="240" w:after="120"/>
     </w:pPr>
     <w:rPr>
       <w:rFonts w:ascii="Arial" w:hAnsi="Arial" w:eastAsia="Arial" w:cs="Arial"/>
@@ -19482,14 +19482,14 @@
     <w:uiPriority w:val="99"/>
     <w:semiHidden/>
     <w:pPr>
-      <w:spacing w:before="20" w:after="20" w:line="252" w:lineRule="auto"/>
+      <w:spacing w:before="20" w:after="20" w:line="240" w:lineRule="auto"/>
     </w:pPr>
     <w:rPr>
       <w:rFonts w:ascii="Arial" w:hAnsi="Arial" w:eastAsia="Arial" w:cs="Arial"/>
       <w:b/>
       <w:i w:val="0"/>
       <w:color w:val="FFFFFF"/>
-      <w:sz w:val="19"/>
+      <w:sz w:val="18"/>
     </w:rPr>
   </w:style>
   <w:style w:type="paragraph" w:customStyle="1" w:styleId="OPAL–TableBody">
@@ -19498,14 +19498,14 @@
     <w:uiPriority w:val="99"/>
     <w:semiHidden/>
     <w:pPr>
-      <w:spacing w:before="20" w:after="20" w:line="264" w:lineRule="auto"/>
+      <w:spacing w:before="20" w:after="20" w:line="240" w:lineRule="auto"/>
     </w:pPr>
     <w:rPr>
       <w:rFonts w:ascii="Arial" w:hAnsi="Arial" w:eastAsia="Arial" w:cs="Arial"/>
       <w:b w:val="0"/>
       <w:i w:val="0"/>
       <w:color w:val="263633"/>
-      <w:sz w:val="19"/>
+      <w:sz w:val="18"/>
     </w:rPr>
   </w:style>
   <w:style w:type="paragraph" w:customStyle="1" w:styleId="OPAL–DocumentControl">
@@ -19537,7 +19537,7 @@
       <w:b/>
       <w:i w:val="0"/>
       <w:color w:val="566E70"/>
-      <w:sz w:val="17"/>
+      <w:sz w:val="18"/>
     </w:rPr>
   </w:style>
   <w:style w:type="paragraph" w:customStyle="1" w:styleId="OPAL–Footer">
@@ -19553,7 +19553,7 @@
       <w:b w:val="0"/>
       <w:i w:val="0"/>
       <w:color w:val="62716E"/>
-      <w:sz w:val="17"/>
+      <w:sz w:val="18"/>
     </w:rPr>
   </w:style>
   <w:style w:type="paragraph" w:customStyle="1" w:styleId="OPAL–Bullet">
@@ -19562,8 +19562,8 @@
     <w:uiPriority w:val="3"/>
     <w:qFormat/>
     <w:pPr>
-      <w:spacing w:after="80"/>
-      <w:ind w:left="540" w:hanging="259"/>
+      <w:spacing w:before="0" w:after="120" w:line="276" w:lineRule="auto"/>
+      <w:ind w:left="720" w:hanging="432"/>
       <w:numPr>
         <w:ilvl w:val="0"/>
         <w:numId w:val="82"/>
@@ -19583,8 +19583,8 @@
     <w:uiPriority w:val="12"/>
     <w:qFormat/>
     <w:pPr>
-      <w:spacing w:after="80"/>
-      <w:ind w:left="540" w:hanging="259"/>
+      <w:spacing w:before="0" w:after="120" w:line="276" w:lineRule="auto"/>
+      <w:ind w:left="720" w:hanging="432"/>
       <w:numPr>
         <w:ilvl w:val="0"/>
         <w:numId w:val="83"/>
@@ -19611,7 +19611,7 @@
       <w:b/>
       <w:i w:val="0"/>
       <w:color w:val="2F5651"/>
-      <w:sz w:val="20"/>
+      <w:sz w:val="22"/>
     </w:rPr>
   </w:style>
   <w:style w:type="paragraph" w:customStyle="1" w:styleId="TOC2">
@@ -19627,7 +19627,7 @@
       <w:b w:val="0"/>
       <w:i w:val="0"/>
       <w:color w:val="263633"/>
-      <w:sz w:val="19"/>
+      <w:sz w:val="18"/>
     </w:rPr>
   </w:style>
   <w:style w:type="paragraph" w:customStyle="1" w:styleId="TOC3">

</xml_diff>

<commit_message>
feat(fca): the Opal logo sits in the running header band
header6 becomes a borderless two-cell band: the logo (0.55in, reusing the
cover's image1.png through a new header6 relationship) on the left, the
report title and participant/NDIS line right-aligned beside it, with the
green rule under the whole band. Controls unchanged.

Co-Authored-By: Claude Fable 5.1 <noreply@anthropic.com>
</commit_message>
<xml_diff>
--- a/backend/fca/templates/fca-v1.docx
+++ b/backend/fca/templates/fca-v1.docx
@@ -10322,76 +10322,165 @@
 
 <file path=word/header6.xml><?xml version="1.0" encoding="utf-8"?>
 <w:hdr xmlns:m="http://schemas.openxmlformats.org/officeDocument/2006/math" xmlns:mc="http://schemas.openxmlformats.org/markup-compatibility/2006" xmlns:mo="http://schemas.microsoft.com/office/mac/office/2008/main" xmlns:mv="urn:schemas-microsoft-com:mac:vml" xmlns:o="urn:schemas-microsoft-com:office:office" xmlns:r="http://schemas.openxmlformats.org/officeDocument/2006/relationships" xmlns:v="urn:schemas-microsoft-com:vml" xmlns:w10="urn:schemas-microsoft-com:office:word" xmlns:w14="http://schemas.microsoft.com/office/word/2010/wordml" xmlns:w="http://schemas.openxmlformats.org/wordprocessingml/2006/main" xmlns:wne="http://schemas.microsoft.com/office/word/2006/wordml" xmlns:wp14="http://schemas.microsoft.com/office/word/2010/wordprocessingDrawing" xmlns:wp="http://schemas.openxmlformats.org/drawingml/2006/wordprocessingDrawing" xmlns:wpc="http://schemas.microsoft.com/office/word/2010/wordprocessingCanvas" xmlns:wpg="http://schemas.microsoft.com/office/word/2010/wordprocessingGroup" xmlns:wpi="http://schemas.microsoft.com/office/word/2010/wordprocessingInk" xmlns:wps="http://schemas.microsoft.com/office/word/2010/wordprocessingShape" mc:Ignorable="w14 wp14">
+  <w:tbl>
+    <w:tblPr>
+      <w:tblW w:w="9026" w:type="dxa"/>
+      <w:tblBorders>
+        <w:top w:val="nil"/>
+        <w:left w:val="nil"/>
+        <w:bottom w:val="single" w:sz="4" w:space="0" w:color="BFCDCE"/>
+        <w:right w:val="nil"/>
+        <w:insideH w:val="nil"/>
+        <w:insideV w:val="nil"/>
+      </w:tblBorders>
+      <w:tblCellMar>
+        <w:top w:w="0" w:type="dxa"/>
+        <w:left w:w="0" w:type="dxa"/>
+        <w:bottom w:w="80" w:type="dxa"/>
+        <w:right w:w="0" w:type="dxa"/>
+      </w:tblCellMar>
+      <w:tblLook w:val="0000"/>
+    </w:tblPr>
+    <w:tblGrid>
+      <w:gridCol w:w="1200"/>
+      <w:gridCol w:w="7826"/>
+    </w:tblGrid>
+    <w:tr>
+      <w:trPr>
+        <w:cantSplit/>
+      </w:trPr>
+      <w:tc>
+        <w:tcPr>
+          <w:tcW w:w="1200" w:type="dxa"/>
+          <w:vAlign w:val="center"/>
+        </w:tcPr>
+        <w:p>
+          <w:pPr>
+            <w:pStyle w:val="OPAL–Header"/>
+            <w:spacing w:before="0" w:after="0"/>
+          </w:pPr>
+          <w:r>
+            <w:drawing>
+              <wp:inline distT="0" distB="0" distL="0" distR="0">
+                <wp:extent cx="502920" cy="502920"/>
+                <wp:docPr id="901" name="Opal logo" descr="Opal Therapy logo"/>
+                <wp:cNvGraphicFramePr>
+                  <a:graphicFrameLocks xmlns:a="http://schemas.openxmlformats.org/drawingml/2006/main" noChangeAspect="1"/>
+                </wp:cNvGraphicFramePr>
+                <a:graphic xmlns:a="http://schemas.openxmlformats.org/drawingml/2006/main">
+                  <a:graphicData uri="http://schemas.openxmlformats.org/drawingml/2006/picture">
+                    <pic:pic xmlns:pic="http://schemas.openxmlformats.org/drawingml/2006/picture">
+                      <pic:nvPicPr>
+                        <pic:cNvPr id="0" name="opal-logo.png"/>
+                        <pic:cNvPicPr/>
+                      </pic:nvPicPr>
+                      <pic:blipFill>
+                        <a:blip r:embed="rId1"/>
+                        <a:stretch>
+                          <a:fillRect/>
+                        </a:stretch>
+                      </pic:blipFill>
+                      <pic:spPr>
+                        <a:xfrm>
+                          <a:off x="0" y="0"/>
+                          <a:ext cx="502920" cy="502920"/>
+                        </a:xfrm>
+                        <a:prstGeom prst="rect">
+                          <a:avLst/>
+                        </a:prstGeom>
+                      </pic:spPr>
+                    </pic:pic>
+                  </a:graphicData>
+                </a:graphic>
+              </wp:inline>
+            </w:drawing>
+          </w:r>
+        </w:p>
+      </w:tc>
+      <w:tc>
+        <w:tcPr>
+          <w:tcW w:w="7826" w:type="dxa"/>
+          <w:vAlign w:val="center"/>
+        </w:tcPr>
+        <w:p>
+          <w:pPr>
+            <w:pStyle w:val="OPAL–Header"/>
+            <w:spacing w:before="0" w:after="0"/>
+            <w:jc w:val="right"/>
+          </w:pPr>
+          <w:r>
+            <w:rPr>
+              <w:rFonts w:ascii="Arial" w:hAnsi="Arial" w:eastAsia="Arial" w:cs="Arial"/>
+              <w:b/>
+              <w:color w:val="2F5651"/>
+              <w:sz w:val="18"/>
+            </w:rPr>
+            <w:t>FUNCTIONAL ASSESSMENT REPORT</w:t>
+          </w:r>
+        </w:p>
+        <w:p>
+          <w:pPr>
+            <w:pStyle w:val="OPAL–Header"/>
+            <w:spacing w:before="0" w:after="40"/>
+            <w:jc w:val="right"/>
+          </w:pPr>
+          <w:sdt>
+            <w:sdtPr>
+              <w:tag w:val="OPAL_CLIENT_FULL_NAME"/>
+              <w:alias w:val="PORTAL — CLIENT NAME"/>
+              <w:text/>
+            </w:sdtPr>
+            <w:sdtContent>
+              <w:r>
+                <w:rPr>
+                  <w:rFonts w:ascii="Arial" w:hAnsi="Arial" w:eastAsia="Arial" w:cs="Arial"/>
+                  <w:b w:val="0"/>
+                  <w:color w:val="566E70"/>
+                  <w:sz w:val="18"/>
+                </w:rPr>
+                <w:t>[PORTAL — CLIENT NAME]</w:t>
+              </w:r>
+            </w:sdtContent>
+          </w:sdt>
+          <w:r>
+            <w:rPr>
+              <w:rFonts w:ascii="Arial" w:hAnsi="Arial" w:eastAsia="Arial" w:cs="Arial"/>
+              <w:b w:val="0"/>
+              <w:color w:val="566E70"/>
+              <w:sz w:val="18"/>
+            </w:rPr>
+            <w:t xml:space="preserve"> | NDIS </w:t>
+          </w:r>
+          <w:sdt>
+            <w:sdtPr>
+              <w:tag w:val="OPAL_CLIENT_NDIS_NUMBER"/>
+              <w:alias w:val="PORTAL — NDIS NUMBER"/>
+              <w:text/>
+            </w:sdtPr>
+            <w:sdtContent>
+              <w:r>
+                <w:rPr>
+                  <w:rFonts w:ascii="Arial" w:hAnsi="Arial" w:eastAsia="Arial" w:cs="Arial"/>
+                  <w:b w:val="0"/>
+                  <w:color w:val="566E70"/>
+                  <w:sz w:val="18"/>
+                </w:rPr>
+                <w:t>[PORTAL — NDIS NUMBER]</w:t>
+              </w:r>
+            </w:sdtContent>
+          </w:sdt>
+        </w:p>
+      </w:tc>
+    </w:tr>
+  </w:tbl>
   <w:p>
     <w:pPr>
       <w:pStyle w:val="OPAL–Header"/>
       <w:spacing w:before="0" w:after="0"/>
-      <w:jc w:val="right"/>
+      <w:rPr>
+        <w:sz w:val="4"/>
+      </w:rPr>
     </w:pPr>
-    <w:r>
-      <w:rPr>
-        <w:rFonts w:ascii="Arial" w:hAnsi="Arial" w:eastAsia="Arial" w:cs="Arial"/>
-        <w:b/>
-        <w:color w:val="2F5651"/>
-        <w:sz w:val="18"/>
-      </w:rPr>
-      <w:t>FUNCTIONAL ASSESSMENT REPORT</w:t>
-    </w:r>
-  </w:p>
-  <w:p>
-    <w:pPr>
-      <w:pStyle w:val="OPAL–Header"/>
-      <w:spacing w:before="0" w:after="40"/>
-      <w:jc w:val="right"/>
-      <w:pBdr>
-        <w:bottom w:val="single" w:sz="4" w:space="4" w:color="BFCDCE"/>
-      </w:pBdr>
-    </w:pPr>
-    <w:sdt>
-      <w:sdtPr>
-        <w:tag w:val="OPAL_CLIENT_FULL_NAME"/>
-        <w:alias w:val="PORTAL — CLIENT NAME"/>
-        <w:text/>
-      </w:sdtPr>
-      <w:sdtContent>
-        <w:r>
-          <w:rPr>
-            <w:rFonts w:ascii="Arial" w:hAnsi="Arial" w:eastAsia="Arial" w:cs="Arial"/>
-            <w:b w:val="0"/>
-            <w:color w:val="566E70"/>
-            <w:sz w:val="18"/>
-          </w:rPr>
-          <w:t>[PORTAL — CLIENT NAME]</w:t>
-        </w:r>
-      </w:sdtContent>
-    </w:sdt>
-    <w:r>
-      <w:rPr>
-        <w:rFonts w:ascii="Arial" w:hAnsi="Arial" w:eastAsia="Arial" w:cs="Arial"/>
-        <w:b w:val="0"/>
-        <w:color w:val="566E70"/>
-        <w:sz w:val="18"/>
-      </w:rPr>
-      <w:t xml:space="preserve"> | NDIS </w:t>
-    </w:r>
-    <w:sdt>
-      <w:sdtPr>
-        <w:tag w:val="OPAL_CLIENT_NDIS_NUMBER"/>
-        <w:alias w:val="PORTAL — NDIS NUMBER"/>
-        <w:text/>
-      </w:sdtPr>
-      <w:sdtContent>
-        <w:r>
-          <w:rPr>
-            <w:rFonts w:ascii="Arial" w:hAnsi="Arial" w:eastAsia="Arial" w:cs="Arial"/>
-            <w:b w:val="0"/>
-            <w:color w:val="566E70"/>
-            <w:sz w:val="18"/>
-          </w:rPr>
-          <w:t>[PORTAL — NDIS NUMBER]</w:t>
-        </w:r>
-      </w:sdtContent>
-    </w:sdt>
   </w:p>
 </w:hdr>
 </file>

</xml_diff>

<commit_message>
feat(fca): no document-control page, no forced page breaks, a contents list that fits
- The Document control heading, note and table are gone from the front
  matter. Its Reviewed / approved by and Status rows now sit under a
  'Review and status' sub-heading at the end of the Professional
  Declaration, so the reviewer and status controls keep their home.
- All 19 page-break-before flags are removed, so headings no longer jump
  to a new page and Enter behaves. The cover section becomes a real
  next-page section instead of relying on a forced break.
- Contents entries are re-tabbed to the 9026 dxa text column (they were
  wrapping past the 1in margin), level 2 entries are 10pt and indented
  0.25in, level 3 9pt at 0.5in. Page numbers are filled by Word on open
  (updateFields stays on); they cannot be computed outside Word.

Controls: 54 unique / 73 occurrences / 29 scalars.

Co-Authored-By: Claude Fable 5.1 <noreply@anthropic.com>
</commit_message>
<xml_diff>
--- a/backend/fca/templates/fca-v1.docx
+++ b/backend/fca/templates/fca-v1.docx
@@ -439,721 +439,6 @@
     </w:p>
     <w:p>
       <w:pPr>
-        <w:pStyle w:val="OPAL–Heading1"/>
-        <w:outlineLvl w:val="9"/>
-      </w:pPr>
-      <w:r>
-        <w:t>Document control</w:t>
-      </w:r>
-    </w:p>
-    <w:p>
-      <w:pPr>
-        <w:pStyle w:val="OPAL–BodyEmphasis"/>
-      </w:pPr>
-      <w:r>
-        <w:t>Complete this page before issue and retain the final signed report in the approved clinical record system.</w:t>
-      </w:r>
-    </w:p>
-    <w:tbl>
-      <w:tblPr>
-        <w:tblW w:type="dxa" w:w="9026"/>
-        <w:jc w:val="left"/>
-        <w:tblLayout w:type="fixed"/>
-        <w:tblLook w:firstColumn="1" w:firstRow="1" w:lastColumn="0" w:lastRow="0" w:noHBand="0" w:noVBand="1" w:val="04A0"/>
-        <w:tblInd w:type="dxa" w:w="120"/>
-        <w:tblBorders>
-          <w:top w:val="single" w:sz="6" w:color="BFCDCE"/>
-          <w:left w:val="single" w:sz="6" w:color="BFCDCE"/>
-          <w:bottom w:val="single" w:sz="6" w:color="BFCDCE"/>
-          <w:right w:val="single" w:sz="6" w:color="BFCDCE"/>
-          <w:insideH w:val="single" w:sz="4" w:color="D9E2DE"/>
-          <w:insideV w:val="single" w:sz="4" w:color="D9E2DE"/>
-        </w:tblBorders>
-      </w:tblPr>
-      <w:tblGrid>
-        <w:gridCol w:w="2889"/>
-        <w:gridCol w:w="6137"/>
-      </w:tblGrid>
-      <w:tr>
-        <w:trPr>
-          <w:cantSplit w:val="true"/>
-          <w:tblHeader w:val="true"/>
-        </w:trPr>
-        <w:tc>
-          <w:tcPr>
-            <w:tcW w:type="dxa" w:w="2889"/>
-            <w:vAlign w:val="center"/>
-            <w:shd w:val="clear" w:fill="2F5651"/>
-            <w:tcMar>
-              <w:top w:w="95" w:type="dxa"/>
-              <w:bottom w:w="95" w:type="dxa"/>
-              <w:start w:w="120" w:type="dxa"/>
-              <w:end w:w="120" w:type="dxa"/>
-            </w:tcMar>
-          </w:tcPr>
-          <w:p>
-            <w:pPr>
-              <w:pStyle w:val="OPAL–TableHeader"/>
-              <w:jc w:val="left"/>
-            </w:pPr>
-            <w:r>
-              <w:rPr>
-                <w:rFonts w:ascii="Arial" w:hAnsi="Arial" w:eastAsia="Arial" w:cs="Arial"/>
-              </w:rPr>
-              <w:t>Document title</w:t>
-            </w:r>
-          </w:p>
-        </w:tc>
-        <w:tc>
-          <w:tcPr>
-            <w:tcW w:type="dxa" w:w="6137"/>
-            <w:vAlign w:val="center"/>
-            <w:tcMar>
-              <w:top w:w="95" w:type="dxa"/>
-              <w:bottom w:w="95" w:type="dxa"/>
-              <w:start w:w="120" w:type="dxa"/>
-              <w:end w:w="120" w:type="dxa"/>
-            </w:tcMar>
-          </w:tcPr>
-          <w:p>
-            <w:pPr>
-              <w:pStyle w:val="OPAL–TableBody"/>
-              <w:jc w:val="left"/>
-            </w:pPr>
-            <w:r>
-              <w:rPr>
-                <w:rFonts w:ascii="Arial" w:hAnsi="Arial" w:eastAsia="Arial" w:cs="Arial"/>
-              </w:rPr>
-              <w:t>Functional Assessment Report</w:t>
-            </w:r>
-          </w:p>
-        </w:tc>
-      </w:tr>
-      <w:tr>
-        <w:trPr>
-          <w:cantSplit w:val="true"/>
-        </w:trPr>
-        <w:tc>
-          <w:tcPr>
-            <w:tcW w:type="dxa" w:w="2889"/>
-            <w:vAlign w:val="center"/>
-            <w:shd w:val="clear" w:fill="2F5651"/>
-            <w:tcMar>
-              <w:top w:w="95" w:type="dxa"/>
-              <w:bottom w:w="95" w:type="dxa"/>
-              <w:start w:w="120" w:type="dxa"/>
-              <w:end w:w="120" w:type="dxa"/>
-            </w:tcMar>
-          </w:tcPr>
-          <w:p>
-            <w:pPr>
-              <w:pStyle w:val="OPAL–TableHeader"/>
-              <w:jc w:val="left"/>
-            </w:pPr>
-            <w:r>
-              <w:rPr>
-                <w:rFonts w:ascii="Arial" w:hAnsi="Arial" w:eastAsia="Arial" w:cs="Arial"/>
-              </w:rPr>
-              <w:t>Service</w:t>
-            </w:r>
-          </w:p>
-        </w:tc>
-        <w:tc>
-          <w:tcPr>
-            <w:tcW w:type="dxa" w:w="6137"/>
-            <w:vAlign w:val="center"/>
-            <w:shd w:val="clear" w:fill="F4F7F5"/>
-            <w:tcMar>
-              <w:top w:w="95" w:type="dxa"/>
-              <w:bottom w:w="95" w:type="dxa"/>
-              <w:start w:w="120" w:type="dxa"/>
-              <w:end w:w="120" w:type="dxa"/>
-            </w:tcMar>
-          </w:tcPr>
-          <w:p>
-            <w:pPr>
-              <w:pStyle w:val="OPAL–TableBody"/>
-              <w:jc w:val="left"/>
-            </w:pPr>
-            <w:r>
-              <w:rPr>
-                <w:rFonts w:ascii="Arial" w:hAnsi="Arial" w:eastAsia="Arial" w:cs="Arial"/>
-              </w:rPr>
-              <w:t>Occupational Therapy</w:t>
-            </w:r>
-          </w:p>
-        </w:tc>
-      </w:tr>
-      <w:tr>
-        <w:trPr>
-          <w:cantSplit w:val="true"/>
-        </w:trPr>
-        <w:tc>
-          <w:tcPr>
-            <w:tcW w:type="dxa" w:w="2889"/>
-            <w:vAlign w:val="center"/>
-            <w:shd w:val="clear" w:fill="2F5651"/>
-            <w:tcMar>
-              <w:top w:w="95" w:type="dxa"/>
-              <w:bottom w:w="95" w:type="dxa"/>
-              <w:start w:w="120" w:type="dxa"/>
-              <w:end w:w="120" w:type="dxa"/>
-            </w:tcMar>
-          </w:tcPr>
-          <w:p>
-            <w:pPr>
-              <w:pStyle w:val="OPAL–TableHeader"/>
-              <w:jc w:val="left"/>
-            </w:pPr>
-            <w:r>
-              <w:rPr>
-                <w:rFonts w:ascii="Arial" w:hAnsi="Arial" w:eastAsia="Arial" w:cs="Arial"/>
-              </w:rPr>
-              <w:t>Document ID</w:t>
-            </w:r>
-          </w:p>
-        </w:tc>
-        <w:tc>
-          <w:tcPr>
-            <w:tcW w:type="dxa" w:w="6137"/>
-            <w:vAlign w:val="center"/>
-            <w:tcMar>
-              <w:top w:w="95" w:type="dxa"/>
-              <w:bottom w:w="95" w:type="dxa"/>
-              <w:start w:w="120" w:type="dxa"/>
-              <w:end w:w="120" w:type="dxa"/>
-            </w:tcMar>
-          </w:tcPr>
-          <w:p>
-            <w:pPr>
-              <w:pStyle w:val="OPAL–TableBody"/>
-              <w:jc w:val="left"/>
-            </w:pPr>
-            <w:sdt>
-              <w:sdtPr>
-                <w:tag w:val="OPAL_REPORT_DOCUMENT_ID"/>
-                <w:alias w:val="PORTAL — REPORT ID"/>
-                <w:text/>
-              </w:sdtPr>
-              <w:sdtContent>
-                <w:r>
-                  <w:rPr>
-                    <w:rFonts w:ascii="Arial" w:hAnsi="Arial" w:eastAsia="Arial" w:cs="Arial"/>
-                  </w:rPr>
-                  <w:t>[PORTAL — REPORT ID]</w:t>
-                </w:r>
-              </w:sdtContent>
-            </w:sdt>
-          </w:p>
-        </w:tc>
-      </w:tr>
-      <w:tr>
-        <w:trPr>
-          <w:cantSplit w:val="true"/>
-        </w:trPr>
-        <w:tc>
-          <w:tcPr>
-            <w:tcW w:type="dxa" w:w="2889"/>
-            <w:vAlign w:val="center"/>
-            <w:shd w:val="clear" w:fill="2F5651"/>
-            <w:tcMar>
-              <w:top w:w="95" w:type="dxa"/>
-              <w:bottom w:w="95" w:type="dxa"/>
-              <w:start w:w="120" w:type="dxa"/>
-              <w:end w:w="120" w:type="dxa"/>
-            </w:tcMar>
-          </w:tcPr>
-          <w:p>
-            <w:pPr>
-              <w:pStyle w:val="OPAL–TableHeader"/>
-              <w:jc w:val="left"/>
-            </w:pPr>
-            <w:r>
-              <w:rPr>
-                <w:rFonts w:ascii="Arial" w:hAnsi="Arial" w:eastAsia="Arial" w:cs="Arial"/>
-              </w:rPr>
-              <w:t>Version</w:t>
-            </w:r>
-          </w:p>
-        </w:tc>
-        <w:tc>
-          <w:tcPr>
-            <w:tcW w:type="dxa" w:w="6137"/>
-            <w:vAlign w:val="center"/>
-            <w:shd w:val="clear" w:fill="F4F7F5"/>
-            <w:tcMar>
-              <w:top w:w="95" w:type="dxa"/>
-              <w:bottom w:w="95" w:type="dxa"/>
-              <w:start w:w="120" w:type="dxa"/>
-              <w:end w:w="120" w:type="dxa"/>
-            </w:tcMar>
-          </w:tcPr>
-          <w:p>
-            <w:pPr>
-              <w:pStyle w:val="OPAL–TableBody"/>
-              <w:jc w:val="left"/>
-            </w:pPr>
-            <w:sdt>
-              <w:sdtPr>
-                <w:tag w:val="OPAL_REPORT_VERSION"/>
-                <w:alias w:val="PORTAL — VERSION"/>
-                <w:text/>
-              </w:sdtPr>
-              <w:sdtContent>
-                <w:r>
-                  <w:rPr>
-                    <w:rFonts w:ascii="Arial" w:hAnsi="Arial" w:eastAsia="Arial" w:cs="Arial"/>
-                  </w:rPr>
-                  <w:t>[PORTAL — VERSION]</w:t>
-                </w:r>
-              </w:sdtContent>
-            </w:sdt>
-          </w:p>
-        </w:tc>
-      </w:tr>
-      <w:tr>
-        <w:trPr>
-          <w:cantSplit w:val="true"/>
-        </w:trPr>
-        <w:tc>
-          <w:tcPr>
-            <w:tcW w:type="dxa" w:w="2889"/>
-            <w:vAlign w:val="center"/>
-            <w:shd w:val="clear" w:fill="2F5651"/>
-            <w:tcMar>
-              <w:top w:w="95" w:type="dxa"/>
-              <w:bottom w:w="95" w:type="dxa"/>
-              <w:start w:w="120" w:type="dxa"/>
-              <w:end w:w="120" w:type="dxa"/>
-            </w:tcMar>
-          </w:tcPr>
-          <w:p>
-            <w:pPr>
-              <w:pStyle w:val="OPAL–TableHeader"/>
-              <w:jc w:val="left"/>
-            </w:pPr>
-            <w:r>
-              <w:rPr>
-                <w:rFonts w:ascii="Arial" w:hAnsi="Arial" w:eastAsia="Arial" w:cs="Arial"/>
-              </w:rPr>
-              <w:t>Status</w:t>
-            </w:r>
-          </w:p>
-        </w:tc>
-        <w:tc>
-          <w:tcPr>
-            <w:tcW w:type="dxa" w:w="6137"/>
-            <w:vAlign w:val="center"/>
-            <w:tcMar>
-              <w:top w:w="95" w:type="dxa"/>
-              <w:bottom w:w="95" w:type="dxa"/>
-              <w:start w:w="120" w:type="dxa"/>
-              <w:end w:w="120" w:type="dxa"/>
-            </w:tcMar>
-          </w:tcPr>
-          <w:p>
-            <w:pPr>
-              <w:pStyle w:val="OPAL–TableBody"/>
-              <w:jc w:val="left"/>
-            </w:pPr>
-            <w:sdt>
-              <w:sdtPr>
-                <w:tag w:val="OPAL_REPORT_STATUS"/>
-                <w:alias w:val="PORTAL — STATUS"/>
-                <w:text/>
-              </w:sdtPr>
-              <w:sdtContent>
-                <w:r>
-                  <w:rPr>
-                    <w:rFonts w:ascii="Arial" w:hAnsi="Arial" w:eastAsia="Arial" w:cs="Arial"/>
-                  </w:rPr>
-                  <w:t>[PORTAL — STATUS]</w:t>
-                </w:r>
-              </w:sdtContent>
-            </w:sdt>
-          </w:p>
-        </w:tc>
-      </w:tr>
-      <w:tr>
-        <w:trPr>
-          <w:cantSplit w:val="true"/>
-        </w:trPr>
-        <w:tc>
-          <w:tcPr>
-            <w:tcW w:type="dxa" w:w="2889"/>
-            <w:vAlign w:val="center"/>
-            <w:shd w:val="clear" w:fill="2F5651"/>
-            <w:tcMar>
-              <w:top w:w="95" w:type="dxa"/>
-              <w:bottom w:w="95" w:type="dxa"/>
-              <w:start w:w="120" w:type="dxa"/>
-              <w:end w:w="120" w:type="dxa"/>
-            </w:tcMar>
-          </w:tcPr>
-          <w:p>
-            <w:pPr>
-              <w:pStyle w:val="OPAL–TableHeader"/>
-              <w:jc w:val="left"/>
-            </w:pPr>
-            <w:r>
-              <w:rPr>
-                <w:rFonts w:ascii="Arial" w:hAnsi="Arial" w:eastAsia="Arial" w:cs="Arial"/>
-              </w:rPr>
-              <w:t>Prepared by</w:t>
-            </w:r>
-          </w:p>
-        </w:tc>
-        <w:tc>
-          <w:tcPr>
-            <w:tcW w:type="dxa" w:w="6137"/>
-            <w:vAlign w:val="center"/>
-            <w:shd w:val="clear" w:fill="F4F7F5"/>
-            <w:tcMar>
-              <w:top w:w="95" w:type="dxa"/>
-              <w:bottom w:w="95" w:type="dxa"/>
-              <w:start w:w="120" w:type="dxa"/>
-              <w:end w:w="120" w:type="dxa"/>
-            </w:tcMar>
-          </w:tcPr>
-          <w:p>
-            <w:pPr>
-              <w:pStyle w:val="OPAL–TableBody"/>
-              <w:jc w:val="left"/>
-            </w:pPr>
-            <w:sdt>
-              <w:sdtPr>
-                <w:tag w:val="OPAL_THERAPIST_FULL_NAME"/>
-                <w:alias w:val="PORTAL — THERAPIST NAME"/>
-                <w:text/>
-              </w:sdtPr>
-              <w:sdtContent>
-                <w:r>
-                  <w:rPr>
-                    <w:rFonts w:ascii="Arial" w:hAnsi="Arial" w:eastAsia="Arial" w:cs="Arial"/>
-                  </w:rPr>
-                  <w:t>[PORTAL — THERAPIST NAME]</w:t>
-                </w:r>
-              </w:sdtContent>
-            </w:sdt>
-            <w:r>
-              <w:rPr>
-                <w:rFonts w:ascii="Arial" w:hAnsi="Arial" w:eastAsia="Arial" w:cs="Arial"/>
-              </w:rPr>
-              <w:t xml:space="preserve">, </w:t>
-            </w:r>
-            <w:sdt>
-              <w:sdtPr>
-                <w:tag w:val="OPAL_THERAPIST_CREDENTIALS"/>
-                <w:alias w:val="PORTAL — THERAPIST CREDENTIALS"/>
-                <w:text/>
-              </w:sdtPr>
-              <w:sdtContent>
-                <w:r>
-                  <w:rPr>
-                    <w:rFonts w:ascii="Arial" w:hAnsi="Arial" w:eastAsia="Arial" w:cs="Arial"/>
-                  </w:rPr>
-                  <w:t>[PORTAL — THERAPIST CREDENTIALS]</w:t>
-                </w:r>
-              </w:sdtContent>
-            </w:sdt>
-          </w:p>
-        </w:tc>
-      </w:tr>
-      <w:tr>
-        <w:trPr>
-          <w:cantSplit w:val="true"/>
-        </w:trPr>
-        <w:tc>
-          <w:tcPr>
-            <w:tcW w:type="dxa" w:w="2889"/>
-            <w:vAlign w:val="center"/>
-            <w:shd w:val="clear" w:fill="2F5651"/>
-            <w:tcMar>
-              <w:top w:w="95" w:type="dxa"/>
-              <w:bottom w:w="95" w:type="dxa"/>
-              <w:start w:w="120" w:type="dxa"/>
-              <w:end w:w="120" w:type="dxa"/>
-            </w:tcMar>
-          </w:tcPr>
-          <w:p>
-            <w:pPr>
-              <w:pStyle w:val="OPAL–TableHeader"/>
-              <w:jc w:val="left"/>
-            </w:pPr>
-            <w:r>
-              <w:rPr>
-                <w:rFonts w:ascii="Arial" w:hAnsi="Arial" w:eastAsia="Arial" w:cs="Arial"/>
-              </w:rPr>
-              <w:t>Reviewed / approved by</w:t>
-            </w:r>
-          </w:p>
-        </w:tc>
-        <w:tc>
-          <w:tcPr>
-            <w:tcW w:type="dxa" w:w="6137"/>
-            <w:vAlign w:val="center"/>
-            <w:tcMar>
-              <w:top w:w="95" w:type="dxa"/>
-              <w:bottom w:w="95" w:type="dxa"/>
-              <w:start w:w="120" w:type="dxa"/>
-              <w:end w:w="120" w:type="dxa"/>
-            </w:tcMar>
-          </w:tcPr>
-          <w:p>
-            <w:pPr>
-              <w:pStyle w:val="OPAL–TableBody"/>
-              <w:jc w:val="left"/>
-            </w:pPr>
-            <w:sdt>
-              <w:sdtPr>
-                <w:tag w:val="OPAL_REPORT_REVIEWER_NAME"/>
-                <w:alias w:val="PORTAL — REVIEWER NAME"/>
-                <w:text/>
-              </w:sdtPr>
-              <w:sdtContent>
-                <w:r>
-                  <w:rPr>
-                    <w:rFonts w:ascii="Arial" w:hAnsi="Arial" w:eastAsia="Arial" w:cs="Arial"/>
-                  </w:rPr>
-                  <w:t>[PORTAL — REVIEWER NAME]</w:t>
-                </w:r>
-              </w:sdtContent>
-            </w:sdt>
-            <w:r>
-              <w:rPr>
-                <w:rFonts w:ascii="Arial" w:hAnsi="Arial" w:eastAsia="Arial" w:cs="Arial"/>
-              </w:rPr>
-              <w:t xml:space="preserve">, </w:t>
-            </w:r>
-            <w:sdt>
-              <w:sdtPr>
-                <w:tag w:val="OPAL_REPORT_REVIEWER_ROLE"/>
-                <w:alias w:val="PORTAL — REVIEWER ROLE"/>
-                <w:text/>
-              </w:sdtPr>
-              <w:sdtContent>
-                <w:r>
-                  <w:rPr>
-                    <w:rFonts w:ascii="Arial" w:hAnsi="Arial" w:eastAsia="Arial" w:cs="Arial"/>
-                  </w:rPr>
-                  <w:t>[PORTAL — REVIEWER ROLE]</w:t>
-                </w:r>
-              </w:sdtContent>
-            </w:sdt>
-          </w:p>
-        </w:tc>
-      </w:tr>
-      <w:tr>
-        <w:trPr>
-          <w:cantSplit w:val="true"/>
-        </w:trPr>
-        <w:tc>
-          <w:tcPr>
-            <w:tcW w:type="dxa" w:w="2889"/>
-            <w:vAlign w:val="center"/>
-            <w:shd w:val="clear" w:fill="2F5651"/>
-            <w:tcMar>
-              <w:top w:w="95" w:type="dxa"/>
-              <w:bottom w:w="95" w:type="dxa"/>
-              <w:start w:w="120" w:type="dxa"/>
-              <w:end w:w="120" w:type="dxa"/>
-            </w:tcMar>
-          </w:tcPr>
-          <w:p>
-            <w:pPr>
-              <w:pStyle w:val="OPAL–TableHeader"/>
-              <w:jc w:val="left"/>
-            </w:pPr>
-            <w:r>
-              <w:rPr>
-                <w:rFonts w:ascii="Arial" w:hAnsi="Arial" w:eastAsia="Arial" w:cs="Arial"/>
-              </w:rPr>
-              <w:t>Issue date</w:t>
-            </w:r>
-          </w:p>
-        </w:tc>
-        <w:tc>
-          <w:tcPr>
-            <w:tcW w:type="dxa" w:w="6137"/>
-            <w:vAlign w:val="center"/>
-            <w:shd w:val="clear" w:fill="F4F7F5"/>
-            <w:tcMar>
-              <w:top w:w="95" w:type="dxa"/>
-              <w:bottom w:w="95" w:type="dxa"/>
-              <w:start w:w="120" w:type="dxa"/>
-              <w:end w:w="120" w:type="dxa"/>
-            </w:tcMar>
-          </w:tcPr>
-          <w:p>
-            <w:pPr>
-              <w:pStyle w:val="OPAL–TableBody"/>
-              <w:jc w:val="left"/>
-            </w:pPr>
-            <w:sdt>
-              <w:sdtPr>
-                <w:tag w:val="OPAL_REPORT_ISSUE_DATE"/>
-                <w:alias w:val="PORTAL — REPORT ISSUE DATE"/>
-                <w:text/>
-              </w:sdtPr>
-              <w:sdtContent>
-                <w:r>
-                  <w:rPr>
-                    <w:rFonts w:ascii="Arial" w:hAnsi="Arial" w:eastAsia="Arial" w:cs="Arial"/>
-                  </w:rPr>
-                  <w:t>[PORTAL — REPORT ISSUE DATE]</w:t>
-                </w:r>
-              </w:sdtContent>
-            </w:sdt>
-          </w:p>
-        </w:tc>
-      </w:tr>
-      <w:tr>
-        <w:trPr>
-          <w:cantSplit w:val="true"/>
-        </w:trPr>
-        <w:tc>
-          <w:tcPr>
-            <w:tcW w:type="dxa" w:w="2889"/>
-            <w:vAlign w:val="center"/>
-            <w:shd w:val="clear" w:fill="2F5651"/>
-            <w:tcMar>
-              <w:top w:w="95" w:type="dxa"/>
-              <w:bottom w:w="95" w:type="dxa"/>
-              <w:start w:w="120" w:type="dxa"/>
-              <w:end w:w="120" w:type="dxa"/>
-            </w:tcMar>
-          </w:tcPr>
-          <w:p>
-            <w:pPr>
-              <w:pStyle w:val="OPAL–TableHeader"/>
-              <w:jc w:val="left"/>
-            </w:pPr>
-            <w:r>
-              <w:rPr>
-                <w:rFonts w:ascii="Arial" w:hAnsi="Arial" w:eastAsia="Arial" w:cs="Arial"/>
-              </w:rPr>
-              <w:t>Participant</w:t>
-            </w:r>
-          </w:p>
-        </w:tc>
-        <w:tc>
-          <w:tcPr>
-            <w:tcW w:type="dxa" w:w="6137"/>
-            <w:vAlign w:val="center"/>
-            <w:tcMar>
-              <w:top w:w="95" w:type="dxa"/>
-              <w:bottom w:w="95" w:type="dxa"/>
-              <w:start w:w="120" w:type="dxa"/>
-              <w:end w:w="120" w:type="dxa"/>
-            </w:tcMar>
-          </w:tcPr>
-          <w:p>
-            <w:pPr>
-              <w:pStyle w:val="OPAL–TableBody"/>
-              <w:jc w:val="left"/>
-            </w:pPr>
-            <w:sdt>
-              <w:sdtPr>
-                <w:tag w:val="OPAL_CLIENT_FULL_NAME"/>
-                <w:alias w:val="PORTAL — CLIENT NAME"/>
-                <w:text/>
-              </w:sdtPr>
-              <w:sdtContent>
-                <w:r>
-                  <w:rPr>
-                    <w:rFonts w:ascii="Arial" w:hAnsi="Arial" w:eastAsia="Arial" w:cs="Arial"/>
-                  </w:rPr>
-                  <w:t>[PORTAL — CLIENT NAME]</w:t>
-                </w:r>
-              </w:sdtContent>
-            </w:sdt>
-            <w:r>
-              <w:rPr>
-                <w:rFonts w:ascii="Arial" w:hAnsi="Arial" w:eastAsia="Arial" w:cs="Arial"/>
-              </w:rPr>
-              <w:t xml:space="preserve"> | </w:t>
-            </w:r>
-            <w:sdt>
-              <w:sdtPr>
-                <w:tag w:val="OPAL_CLIENT_NDIS_NUMBER"/>
-                <w:alias w:val="PORTAL — NDIS NUMBER"/>
-                <w:text/>
-              </w:sdtPr>
-              <w:sdtContent>
-                <w:r>
-                  <w:rPr>
-                    <w:rFonts w:ascii="Arial" w:hAnsi="Arial" w:eastAsia="Arial" w:cs="Arial"/>
-                  </w:rPr>
-                  <w:t>[PORTAL — NDIS NUMBER]</w:t>
-                </w:r>
-              </w:sdtContent>
-            </w:sdt>
-          </w:p>
-        </w:tc>
-      </w:tr>
-      <w:tr>
-        <w:trPr>
-          <w:cantSplit w:val="true"/>
-        </w:trPr>
-        <w:tc>
-          <w:tcPr>
-            <w:tcW w:type="dxa" w:w="2889"/>
-            <w:vAlign w:val="center"/>
-            <w:shd w:val="clear" w:fill="2F5651"/>
-            <w:tcMar>
-              <w:top w:w="95" w:type="dxa"/>
-              <w:bottom w:w="95" w:type="dxa"/>
-              <w:start w:w="120" w:type="dxa"/>
-              <w:end w:w="120" w:type="dxa"/>
-            </w:tcMar>
-          </w:tcPr>
-          <w:p>
-            <w:pPr>
-              <w:pStyle w:val="OPAL–TableHeader"/>
-              <w:jc w:val="left"/>
-            </w:pPr>
-            <w:r>
-              <w:rPr>
-                <w:rFonts w:ascii="Arial" w:hAnsi="Arial" w:eastAsia="Arial" w:cs="Arial"/>
-              </w:rPr>
-              <w:t>Classification</w:t>
-            </w:r>
-          </w:p>
-        </w:tc>
-        <w:tc>
-          <w:tcPr>
-            <w:tcW w:type="dxa" w:w="6137"/>
-            <w:vAlign w:val="center"/>
-            <w:shd w:val="clear" w:fill="F4F7F5"/>
-            <w:tcMar>
-              <w:top w:w="95" w:type="dxa"/>
-              <w:bottom w:w="95" w:type="dxa"/>
-              <w:start w:w="120" w:type="dxa"/>
-              <w:end w:w="120" w:type="dxa"/>
-            </w:tcMar>
-          </w:tcPr>
-          <w:p>
-            <w:pPr>
-              <w:pStyle w:val="OPAL–TableBody"/>
-              <w:jc w:val="left"/>
-            </w:pPr>
-            <w:r>
-              <w:rPr>
-                <w:rFonts w:ascii="Arial" w:hAnsi="Arial" w:eastAsia="Arial" w:cs="Arial"/>
-              </w:rPr>
-              <w:t>Confidential clinical report</w:t>
-            </w:r>
-          </w:p>
-        </w:tc>
-      </w:tr>
-    </w:tbl>
-    <w:p>
-      <w:pPr>
-        <w:spacing w:after="40"/>
-      </w:pPr>
-    </w:p>
-    <w:p>
-      <w:pPr>
         <w:pStyle w:val="OPAL–Heading2"/>
         <w:outlineLvl w:val="9"/>
       </w:pPr>
@@ -1236,7 +521,6 @@
     <w:p>
       <w:pPr>
         <w:pStyle w:val="OPAL–DocumentTitle"/>
-        <w:pageBreakBefore/>
         <w:jc w:val="left"/>
       </w:pPr>
       <w:r>
@@ -1247,7 +531,7 @@
       <w:pPr>
         <w:pStyle w:val="TOC1"/>
         <w:tabs>
-          <w:tab w:pos="9432" w:val="right" w:leader="dot"/>
+          <w:tab w:pos="9026" w:val="right" w:leader="dot"/>
         </w:tabs>
       </w:pPr>
       <w:r>
@@ -1291,7 +575,7 @@
       <w:pPr>
         <w:pStyle w:val="TOC1"/>
         <w:tabs>
-          <w:tab w:pos="9432" w:val="right" w:leader="dot"/>
+          <w:tab w:pos="9026" w:val="right" w:leader="dot"/>
         </w:tabs>
       </w:pPr>
       <w:r>
@@ -1325,7 +609,7 @@
       <w:pPr>
         <w:pStyle w:val="TOC1"/>
         <w:tabs>
-          <w:tab w:pos="9432" w:val="right" w:leader="dot"/>
+          <w:tab w:pos="9026" w:val="right" w:leader="dot"/>
         </w:tabs>
       </w:pPr>
       <w:r>
@@ -1359,7 +643,7 @@
       <w:pPr>
         <w:pStyle w:val="TOC1"/>
         <w:tabs>
-          <w:tab w:pos="9432" w:val="right" w:leader="dot"/>
+          <w:tab w:pos="9026" w:val="right" w:leader="dot"/>
         </w:tabs>
       </w:pPr>
       <w:r>
@@ -1393,7 +677,7 @@
       <w:pPr>
         <w:pStyle w:val="TOC2"/>
         <w:tabs>
-          <w:tab w:pos="9432" w:val="right" w:leader="dot"/>
+          <w:tab w:pos="9026" w:val="right" w:leader="dot"/>
         </w:tabs>
       </w:pPr>
       <w:r>
@@ -1401,7 +685,7 @@
           <w:rFonts w:ascii="Arial" w:hAnsi="Arial" w:eastAsia="Arial" w:cs="Arial"/>
           <w:b w:val="0"/>
           <w:color w:val="263633"/>
-          <w:sz w:val="18"/>
+          <w:sz w:val="20"/>
         </w:rPr>
         <w:t>Assessment synthesis</w:t>
       </w:r>
@@ -1409,7 +693,7 @@
         <w:rPr>
           <w:rFonts w:ascii="Arial" w:hAnsi="Arial" w:eastAsia="Arial" w:cs="Arial"/>
           <w:color w:val="263633"/>
-          <w:sz w:val="18"/>
+          <w:sz w:val="20"/>
         </w:rPr>
         <w:tab/>
       </w:r>
@@ -1418,7 +702,7 @@
           <w:rFonts w:ascii="Arial" w:hAnsi="Arial" w:eastAsia="Arial" w:cs="Arial"/>
           <w:b w:val="0"/>
           <w:color w:val="263633"/>
-          <w:sz w:val="18"/>
+          <w:sz w:val="20"/>
         </w:rPr>
         <w:t>6</w:t>
       </w:r>
@@ -1427,7 +711,7 @@
       <w:pPr>
         <w:pStyle w:val="TOC1"/>
         <w:tabs>
-          <w:tab w:pos="9432" w:val="right" w:leader="dot"/>
+          <w:tab w:pos="9026" w:val="right" w:leader="dot"/>
         </w:tabs>
       </w:pPr>
       <w:r>
@@ -1461,7 +745,7 @@
       <w:pPr>
         <w:pStyle w:val="TOC2"/>
         <w:tabs>
-          <w:tab w:pos="9432" w:val="right" w:leader="dot"/>
+          <w:tab w:pos="9026" w:val="right" w:leader="dot"/>
         </w:tabs>
       </w:pPr>
       <w:r>
@@ -1469,7 +753,7 @@
           <w:rFonts w:ascii="Arial" w:hAnsi="Arial" w:eastAsia="Arial" w:cs="Arial"/>
           <w:b w:val="0"/>
           <w:color w:val="263633"/>
-          <w:sz w:val="18"/>
+          <w:sz w:val="20"/>
         </w:rPr>
         <w:t>Mobility</w:t>
       </w:r>
@@ -1477,7 +761,7 @@
         <w:rPr>
           <w:rFonts w:ascii="Arial" w:hAnsi="Arial" w:eastAsia="Arial" w:cs="Arial"/>
           <w:color w:val="263633"/>
-          <w:sz w:val="18"/>
+          <w:sz w:val="20"/>
         </w:rPr>
         <w:tab/>
       </w:r>
@@ -1486,7 +770,7 @@
           <w:rFonts w:ascii="Arial" w:hAnsi="Arial" w:eastAsia="Arial" w:cs="Arial"/>
           <w:b w:val="0"/>
           <w:color w:val="263633"/>
-          <w:sz w:val="18"/>
+          <w:sz w:val="20"/>
         </w:rPr>
         <w:t>8</w:t>
       </w:r>
@@ -1495,7 +779,7 @@
       <w:pPr>
         <w:pStyle w:val="TOC2"/>
         <w:tabs>
-          <w:tab w:pos="9432" w:val="right" w:leader="dot"/>
+          <w:tab w:pos="9026" w:val="right" w:leader="dot"/>
         </w:tabs>
       </w:pPr>
       <w:r>
@@ -1503,7 +787,7 @@
           <w:rFonts w:ascii="Arial" w:hAnsi="Arial" w:eastAsia="Arial" w:cs="Arial"/>
           <w:b w:val="0"/>
           <w:color w:val="263633"/>
-          <w:sz w:val="18"/>
+          <w:sz w:val="20"/>
         </w:rPr>
         <w:t>Cognition</w:t>
       </w:r>
@@ -1511,7 +795,7 @@
         <w:rPr>
           <w:rFonts w:ascii="Arial" w:hAnsi="Arial" w:eastAsia="Arial" w:cs="Arial"/>
           <w:color w:val="263633"/>
-          <w:sz w:val="18"/>
+          <w:sz w:val="20"/>
         </w:rPr>
         <w:tab/>
       </w:r>
@@ -1520,7 +804,7 @@
           <w:rFonts w:ascii="Arial" w:hAnsi="Arial" w:eastAsia="Arial" w:cs="Arial"/>
           <w:b w:val="0"/>
           <w:color w:val="263633"/>
-          <w:sz w:val="18"/>
+          <w:sz w:val="20"/>
         </w:rPr>
         <w:t>9</w:t>
       </w:r>
@@ -1529,7 +813,7 @@
       <w:pPr>
         <w:pStyle w:val="TOC2"/>
         <w:tabs>
-          <w:tab w:pos="9432" w:val="right" w:leader="dot"/>
+          <w:tab w:pos="9026" w:val="right" w:leader="dot"/>
         </w:tabs>
       </w:pPr>
       <w:r>
@@ -1537,7 +821,7 @@
           <w:rFonts w:ascii="Arial" w:hAnsi="Arial" w:eastAsia="Arial" w:cs="Arial"/>
           <w:b w:val="0"/>
           <w:color w:val="263633"/>
-          <w:sz w:val="18"/>
+          <w:sz w:val="20"/>
         </w:rPr>
         <w:t>Communication</w:t>
       </w:r>
@@ -1545,7 +829,7 @@
         <w:rPr>
           <w:rFonts w:ascii="Arial" w:hAnsi="Arial" w:eastAsia="Arial" w:cs="Arial"/>
           <w:color w:val="263633"/>
-          <w:sz w:val="18"/>
+          <w:sz w:val="20"/>
         </w:rPr>
         <w:tab/>
       </w:r>
@@ -1554,7 +838,7 @@
           <w:rFonts w:ascii="Arial" w:hAnsi="Arial" w:eastAsia="Arial" w:cs="Arial"/>
           <w:b w:val="0"/>
           <w:color w:val="263633"/>
-          <w:sz w:val="18"/>
+          <w:sz w:val="20"/>
         </w:rPr>
         <w:t>10</w:t>
       </w:r>
@@ -1563,7 +847,7 @@
       <w:pPr>
         <w:pStyle w:val="TOC2"/>
         <w:tabs>
-          <w:tab w:pos="9432" w:val="right" w:leader="dot"/>
+          <w:tab w:pos="9026" w:val="right" w:leader="dot"/>
         </w:tabs>
       </w:pPr>
       <w:r>
@@ -1571,7 +855,7 @@
           <w:rFonts w:ascii="Arial" w:hAnsi="Arial" w:eastAsia="Arial" w:cs="Arial"/>
           <w:b w:val="0"/>
           <w:color w:val="263633"/>
-          <w:sz w:val="18"/>
+          <w:sz w:val="20"/>
         </w:rPr>
         <w:t>Psychological/Emotional</w:t>
       </w:r>
@@ -1579,7 +863,7 @@
         <w:rPr>
           <w:rFonts w:ascii="Arial" w:hAnsi="Arial" w:eastAsia="Arial" w:cs="Arial"/>
           <w:color w:val="263633"/>
-          <w:sz w:val="18"/>
+          <w:sz w:val="20"/>
         </w:rPr>
         <w:tab/>
       </w:r>
@@ -1588,7 +872,7 @@
           <w:rFonts w:ascii="Arial" w:hAnsi="Arial" w:eastAsia="Arial" w:cs="Arial"/>
           <w:b w:val="0"/>
           <w:color w:val="263633"/>
-          <w:sz w:val="18"/>
+          <w:sz w:val="20"/>
         </w:rPr>
         <w:t>11</w:t>
       </w:r>
@@ -1597,7 +881,7 @@
       <w:pPr>
         <w:pStyle w:val="TOC2"/>
         <w:tabs>
-          <w:tab w:pos="9432" w:val="right" w:leader="dot"/>
+          <w:tab w:pos="9026" w:val="right" w:leader="dot"/>
         </w:tabs>
       </w:pPr>
       <w:r>
@@ -1605,7 +889,7 @@
           <w:rFonts w:ascii="Arial" w:hAnsi="Arial" w:eastAsia="Arial" w:cs="Arial"/>
           <w:b w:val="0"/>
           <w:color w:val="263633"/>
-          <w:sz w:val="18"/>
+          <w:sz w:val="20"/>
         </w:rPr>
         <w:t>Self-Care ADLs</w:t>
       </w:r>
@@ -1613,7 +897,7 @@
         <w:rPr>
           <w:rFonts w:ascii="Arial" w:hAnsi="Arial" w:eastAsia="Arial" w:cs="Arial"/>
           <w:color w:val="263633"/>
-          <w:sz w:val="18"/>
+          <w:sz w:val="20"/>
         </w:rPr>
         <w:tab/>
       </w:r>
@@ -1622,7 +906,7 @@
           <w:rFonts w:ascii="Arial" w:hAnsi="Arial" w:eastAsia="Arial" w:cs="Arial"/>
           <w:b w:val="0"/>
           <w:color w:val="263633"/>
-          <w:sz w:val="18"/>
+          <w:sz w:val="20"/>
         </w:rPr>
         <w:t>12</w:t>
       </w:r>
@@ -1631,7 +915,7 @@
       <w:pPr>
         <w:pStyle w:val="TOC2"/>
         <w:tabs>
-          <w:tab w:pos="9432" w:val="right" w:leader="dot"/>
+          <w:tab w:pos="9026" w:val="right" w:leader="dot"/>
         </w:tabs>
       </w:pPr>
       <w:r>
@@ -1639,7 +923,7 @@
           <w:rFonts w:ascii="Arial" w:hAnsi="Arial" w:eastAsia="Arial" w:cs="Arial"/>
           <w:b w:val="0"/>
           <w:color w:val="263633"/>
-          <w:sz w:val="18"/>
+          <w:sz w:val="20"/>
         </w:rPr>
         <w:t>Domestic ADLs</w:t>
       </w:r>
@@ -1647,7 +931,7 @@
         <w:rPr>
           <w:rFonts w:ascii="Arial" w:hAnsi="Arial" w:eastAsia="Arial" w:cs="Arial"/>
           <w:color w:val="263633"/>
-          <w:sz w:val="18"/>
+          <w:sz w:val="20"/>
         </w:rPr>
         <w:tab/>
       </w:r>
@@ -1656,7 +940,7 @@
           <w:rFonts w:ascii="Arial" w:hAnsi="Arial" w:eastAsia="Arial" w:cs="Arial"/>
           <w:b w:val="0"/>
           <w:color w:val="263633"/>
-          <w:sz w:val="18"/>
+          <w:sz w:val="20"/>
         </w:rPr>
         <w:t>13</w:t>
       </w:r>
@@ -1665,7 +949,7 @@
       <w:pPr>
         <w:pStyle w:val="TOC2"/>
         <w:tabs>
-          <w:tab w:pos="9432" w:val="right" w:leader="dot"/>
+          <w:tab w:pos="9026" w:val="right" w:leader="dot"/>
         </w:tabs>
       </w:pPr>
       <w:r>
@@ -1673,7 +957,7 @@
           <w:rFonts w:ascii="Arial" w:hAnsi="Arial" w:eastAsia="Arial" w:cs="Arial"/>
           <w:b w:val="0"/>
           <w:color w:val="263633"/>
-          <w:sz w:val="18"/>
+          <w:sz w:val="20"/>
         </w:rPr>
         <w:t>Community Access</w:t>
       </w:r>
@@ -1681,7 +965,7 @@
         <w:rPr>
           <w:rFonts w:ascii="Arial" w:hAnsi="Arial" w:eastAsia="Arial" w:cs="Arial"/>
           <w:color w:val="263633"/>
-          <w:sz w:val="18"/>
+          <w:sz w:val="20"/>
         </w:rPr>
         <w:tab/>
       </w:r>
@@ -1690,7 +974,7 @@
           <w:rFonts w:ascii="Arial" w:hAnsi="Arial" w:eastAsia="Arial" w:cs="Arial"/>
           <w:b w:val="0"/>
           <w:color w:val="263633"/>
-          <w:sz w:val="18"/>
+          <w:sz w:val="20"/>
         </w:rPr>
         <w:t>14</w:t>
       </w:r>
@@ -1699,7 +983,7 @@
       <w:pPr>
         <w:pStyle w:val="TOC2"/>
         <w:tabs>
-          <w:tab w:pos="9432" w:val="right" w:leader="dot"/>
+          <w:tab w:pos="9026" w:val="right" w:leader="dot"/>
         </w:tabs>
       </w:pPr>
       <w:r>
@@ -1707,7 +991,7 @@
           <w:rFonts w:ascii="Arial" w:hAnsi="Arial" w:eastAsia="Arial" w:cs="Arial"/>
           <w:b w:val="0"/>
           <w:color w:val="263633"/>
-          <w:sz w:val="18"/>
+          <w:sz w:val="20"/>
         </w:rPr>
         <w:t>Behaviours of Concern</w:t>
       </w:r>
@@ -1715,7 +999,7 @@
         <w:rPr>
           <w:rFonts w:ascii="Arial" w:hAnsi="Arial" w:eastAsia="Arial" w:cs="Arial"/>
           <w:color w:val="263633"/>
-          <w:sz w:val="18"/>
+          <w:sz w:val="20"/>
         </w:rPr>
         <w:tab/>
       </w:r>
@@ -1724,7 +1008,7 @@
           <w:rFonts w:ascii="Arial" w:hAnsi="Arial" w:eastAsia="Arial" w:cs="Arial"/>
           <w:b w:val="0"/>
           <w:color w:val="263633"/>
-          <w:sz w:val="18"/>
+          <w:sz w:val="20"/>
         </w:rPr>
         <w:t>15</w:t>
       </w:r>
@@ -1733,7 +1017,7 @@
       <w:pPr>
         <w:pStyle w:val="TOC2"/>
         <w:tabs>
-          <w:tab w:pos="9432" w:val="right" w:leader="dot"/>
+          <w:tab w:pos="9026" w:val="right" w:leader="dot"/>
         </w:tabs>
       </w:pPr>
       <w:r>
@@ -1741,7 +1025,7 @@
           <w:rFonts w:ascii="Arial" w:hAnsi="Arial" w:eastAsia="Arial" w:cs="Arial"/>
           <w:b w:val="0"/>
           <w:color w:val="263633"/>
-          <w:sz w:val="18"/>
+          <w:sz w:val="20"/>
         </w:rPr>
         <w:t>Home Modifications and Assistive Technology</w:t>
       </w:r>
@@ -1749,7 +1033,7 @@
         <w:rPr>
           <w:rFonts w:ascii="Arial" w:hAnsi="Arial" w:eastAsia="Arial" w:cs="Arial"/>
           <w:color w:val="263633"/>
-          <w:sz w:val="18"/>
+          <w:sz w:val="20"/>
         </w:rPr>
         <w:tab/>
       </w:r>
@@ -1758,7 +1042,7 @@
           <w:rFonts w:ascii="Arial" w:hAnsi="Arial" w:eastAsia="Arial" w:cs="Arial"/>
           <w:b w:val="0"/>
           <w:color w:val="263633"/>
-          <w:sz w:val="18"/>
+          <w:sz w:val="20"/>
         </w:rPr>
         <w:t>16</w:t>
       </w:r>
@@ -1767,7 +1051,7 @@
       <w:pPr>
         <w:pStyle w:val="TOC1"/>
         <w:tabs>
-          <w:tab w:pos="9432" w:val="right" w:leader="dot"/>
+          <w:tab w:pos="9026" w:val="right" w:leader="dot"/>
         </w:tabs>
       </w:pPr>
       <w:r>
@@ -1801,7 +1085,7 @@
       <w:pPr>
         <w:pStyle w:val="TOC2"/>
         <w:tabs>
-          <w:tab w:pos="9432" w:val="right" w:leader="dot"/>
+          <w:tab w:pos="9026" w:val="right" w:leader="dot"/>
         </w:tabs>
       </w:pPr>
       <w:r>
@@ -1809,7 +1093,7 @@
           <w:rFonts w:ascii="Arial" w:hAnsi="Arial" w:eastAsia="Arial" w:cs="Arial"/>
           <w:b w:val="0"/>
           <w:color w:val="263633"/>
-          <w:sz w:val="18"/>
+          <w:sz w:val="20"/>
         </w:rPr>
         <w:t>Core Supports</w:t>
       </w:r>
@@ -1817,7 +1101,7 @@
         <w:rPr>
           <w:rFonts w:ascii="Arial" w:hAnsi="Arial" w:eastAsia="Arial" w:cs="Arial"/>
           <w:color w:val="263633"/>
-          <w:sz w:val="18"/>
+          <w:sz w:val="20"/>
         </w:rPr>
         <w:tab/>
       </w:r>
@@ -1826,7 +1110,7 @@
           <w:rFonts w:ascii="Arial" w:hAnsi="Arial" w:eastAsia="Arial" w:cs="Arial"/>
           <w:b w:val="0"/>
           <w:color w:val="263633"/>
-          <w:sz w:val="18"/>
+          <w:sz w:val="20"/>
         </w:rPr>
         <w:t>18</w:t>
       </w:r>
@@ -1835,7 +1119,7 @@
       <w:pPr>
         <w:pStyle w:val="TOC2"/>
         <w:tabs>
-          <w:tab w:pos="9432" w:val="right" w:leader="dot"/>
+          <w:tab w:pos="9026" w:val="right" w:leader="dot"/>
         </w:tabs>
       </w:pPr>
       <w:r>
@@ -1843,7 +1127,7 @@
           <w:rFonts w:ascii="Arial" w:hAnsi="Arial" w:eastAsia="Arial" w:cs="Arial"/>
           <w:b w:val="0"/>
           <w:color w:val="263633"/>
-          <w:sz w:val="18"/>
+          <w:sz w:val="20"/>
         </w:rPr>
         <w:t>Capacity Building</w:t>
       </w:r>
@@ -1851,7 +1135,7 @@
         <w:rPr>
           <w:rFonts w:ascii="Arial" w:hAnsi="Arial" w:eastAsia="Arial" w:cs="Arial"/>
           <w:color w:val="263633"/>
-          <w:sz w:val="18"/>
+          <w:sz w:val="20"/>
         </w:rPr>
         <w:tab/>
       </w:r>
@@ -1860,7 +1144,7 @@
           <w:rFonts w:ascii="Arial" w:hAnsi="Arial" w:eastAsia="Arial" w:cs="Arial"/>
           <w:b w:val="0"/>
           <w:color w:val="263633"/>
-          <w:sz w:val="18"/>
+          <w:sz w:val="20"/>
         </w:rPr>
         <w:t>19</w:t>
       </w:r>
@@ -1869,7 +1153,7 @@
       <w:pPr>
         <w:pStyle w:val="TOC1"/>
         <w:tabs>
-          <w:tab w:pos="9432" w:val="right" w:leader="dot"/>
+          <w:tab w:pos="9026" w:val="right" w:leader="dot"/>
         </w:tabs>
       </w:pPr>
       <w:r>
@@ -1903,7 +1187,7 @@
       <w:pPr>
         <w:pStyle w:val="TOC1"/>
         <w:tabs>
-          <w:tab w:pos="9432" w:val="right" w:leader="dot"/>
+          <w:tab w:pos="9026" w:val="right" w:leader="dot"/>
         </w:tabs>
       </w:pPr>
       <w:r>
@@ -3047,7 +2331,6 @@
         <w:p>
           <w:pPr>
             <w:pStyle w:val="OPAL–Heading1"/>
-            <w:pageBreakBefore/>
           </w:pPr>
           <w:r>
             <w:t>Referral Information</w:t>
@@ -3370,7 +2653,6 @@
         <w:p>
           <w:pPr>
             <w:pStyle w:val="OPAL–Heading1"/>
-            <w:pageBreakBefore/>
           </w:pPr>
           <w:r>
             <w:t>Participant Information</w:t>
@@ -3540,7 +2822,6 @@
         <w:p>
           <w:pPr>
             <w:pStyle w:val="OPAL–Heading1"/>
-            <w:pageBreakBefore/>
           </w:pPr>
           <w:r>
             <w:t>Assessment Method</w:t>
@@ -7055,7 +6336,6 @@
         <w:p>
           <w:pPr>
             <w:pStyle w:val="OPAL–Heading1"/>
-            <w:pageBreakBefore/>
           </w:pPr>
           <w:r>
             <w:t>Assessment results for Functional Capacity</w:t>
@@ -7087,7 +6367,6 @@
             <w:p>
               <w:pPr>
                 <w:pStyle w:val="OPAL–Heading2"/>
-                <w:pageBreakBefore/>
               </w:pPr>
               <w:r>
                 <w:t>Mobility</w:t>
@@ -7305,7 +6584,6 @@
             <w:p>
               <w:pPr>
                 <w:pStyle w:val="OPAL–Heading2"/>
-                <w:pageBreakBefore/>
               </w:pPr>
               <w:r>
                 <w:t>Cognition</w:t>
@@ -7411,7 +6689,6 @@
             <w:p>
               <w:pPr>
                 <w:pStyle w:val="OPAL–Heading2"/>
-                <w:pageBreakBefore/>
               </w:pPr>
               <w:r>
                 <w:t>Communication</w:t>
@@ -7517,7 +6794,6 @@
             <w:p>
               <w:pPr>
                 <w:pStyle w:val="OPAL–Heading2"/>
-                <w:pageBreakBefore/>
               </w:pPr>
               <w:r>
                 <w:t>Psychological/Emotional</w:t>
@@ -7639,7 +6915,6 @@
             <w:p>
               <w:pPr>
                 <w:pStyle w:val="OPAL–Heading2"/>
-                <w:pageBreakBefore/>
               </w:pPr>
               <w:r>
                 <w:t>Self-Care ADLs</w:t>
@@ -7793,7 +7068,6 @@
             <w:p>
               <w:pPr>
                 <w:pStyle w:val="OPAL–Heading2"/>
-                <w:pageBreakBefore/>
               </w:pPr>
               <w:r>
                 <w:t>Domestic ADLs</w:t>
@@ -7931,7 +7205,6 @@
             <w:p>
               <w:pPr>
                 <w:pStyle w:val="OPAL–Heading2"/>
-                <w:pageBreakBefore/>
               </w:pPr>
               <w:r>
                 <w:t>Community Access</w:t>
@@ -8021,7 +7294,6 @@
             <w:p>
               <w:pPr>
                 <w:pStyle w:val="OPAL–Heading2"/>
-                <w:pageBreakBefore/>
               </w:pPr>
               <w:r>
                 <w:t>Behaviours of Concern</w:t>
@@ -8143,7 +7415,6 @@
             <w:p>
               <w:pPr>
                 <w:pStyle w:val="OPAL–Heading2"/>
-                <w:pageBreakBefore/>
               </w:pPr>
               <w:r>
                 <w:t>Home Modifications and Assistive Technology</w:t>
@@ -8244,7 +7515,6 @@
         <w:p>
           <w:pPr>
             <w:pStyle w:val="OPAL–Heading1"/>
-            <w:pageBreakBefore/>
           </w:pPr>
           <w:r>
             <w:t>Summary and Recommendations</w:t>
@@ -9010,7 +8280,6 @@
             <w:p>
               <w:pPr>
                 <w:pStyle w:val="OPAL–Heading2"/>
-                <w:pageBreakBefore/>
               </w:pPr>
               <w:r>
                 <w:t>Core Supports</w:t>
@@ -9124,7 +8393,6 @@
             <w:p>
               <w:pPr>
                 <w:pStyle w:val="OPAL–Heading2"/>
-                <w:pageBreakBefore/>
               </w:pPr>
               <w:r>
                 <w:t>Capacity Building</w:t>
@@ -9256,7 +8524,6 @@
         <w:p>
           <w:pPr>
             <w:pStyle w:val="OPAL–Heading1"/>
-            <w:pageBreakBefore/>
           </w:pPr>
           <w:r>
             <w:t>Professional Declaration</w:t>
@@ -9858,6 +9125,187 @@
             <w:t>.</w:t>
           </w:r>
         </w:p>
+        <w:p>
+          <w:pPr>
+            <w:pStyle w:val="OPAL–Heading3"/>
+          </w:pPr>
+          <w:r>
+            <w:t>Review and status</w:t>
+          </w:r>
+        </w:p>
+        <w:tbl>
+          <w:tblPr>
+            <w:tblW w:type="dxa" w:w="9026"/>
+            <w:jc w:val="left"/>
+            <w:tblLayout w:type="fixed"/>
+            <w:tblLook w:firstColumn="1" w:firstRow="1" w:lastColumn="0" w:lastRow="0" w:noHBand="0" w:noVBand="1" w:val="04A0"/>
+            <w:tblInd w:type="dxa" w:w="120"/>
+            <w:tblBorders>
+              <w:top w:val="single" w:sz="6" w:color="BFCDCE"/>
+              <w:left w:val="single" w:sz="6" w:color="BFCDCE"/>
+              <w:bottom w:val="single" w:sz="6" w:color="BFCDCE"/>
+              <w:right w:val="single" w:sz="6" w:color="BFCDCE"/>
+              <w:insideH w:val="single" w:sz="4" w:color="D9E2DE"/>
+              <w:insideV w:val="single" w:sz="4" w:color="D9E2DE"/>
+            </w:tblBorders>
+          </w:tblPr>
+          <w:tblGrid>
+            <w:gridCol w:w="2889"/>
+            <w:gridCol w:w="6137"/>
+          </w:tblGrid>
+          <w:tr>
+            <w:trPr>
+              <w:cantSplit w:val="true"/>
+            </w:trPr>
+            <w:tc>
+              <w:tcPr>
+                <w:tcW w:type="dxa" w:w="2889"/>
+                <w:vAlign w:val="center"/>
+                <w:shd w:val="clear" w:fill="2F5651"/>
+                <w:tcMar>
+                  <w:top w:w="95" w:type="dxa"/>
+                  <w:bottom w:w="95" w:type="dxa"/>
+                  <w:start w:w="120" w:type="dxa"/>
+                  <w:end w:w="120" w:type="dxa"/>
+                </w:tcMar>
+              </w:tcPr>
+              <w:p>
+                <w:pPr>
+                  <w:pStyle w:val="OPAL–TableHeader"/>
+                  <w:jc w:val="left"/>
+                </w:pPr>
+                <w:r>
+                  <w:rPr>
+                    <w:rFonts w:ascii="Arial" w:hAnsi="Arial" w:eastAsia="Arial" w:cs="Arial"/>
+                  </w:rPr>
+                  <w:t>Reviewed / approved by</w:t>
+                </w:r>
+              </w:p>
+            </w:tc>
+            <w:tc>
+              <w:tcPr>
+                <w:tcW w:type="dxa" w:w="6137"/>
+                <w:vAlign w:val="center"/>
+                <w:tcMar>
+                  <w:top w:w="95" w:type="dxa"/>
+                  <w:bottom w:w="95" w:type="dxa"/>
+                  <w:start w:w="120" w:type="dxa"/>
+                  <w:end w:w="120" w:type="dxa"/>
+                </w:tcMar>
+              </w:tcPr>
+              <w:p>
+                <w:pPr>
+                  <w:pStyle w:val="OPAL–TableBody"/>
+                  <w:jc w:val="left"/>
+                </w:pPr>
+                <w:sdt>
+                  <w:sdtPr>
+                    <w:tag w:val="OPAL_REPORT_REVIEWER_NAME"/>
+                    <w:alias w:val="PORTAL — REVIEWER NAME"/>
+                    <w:text/>
+                  </w:sdtPr>
+                  <w:sdtContent>
+                    <w:r>
+                      <w:rPr>
+                        <w:rFonts w:ascii="Arial" w:hAnsi="Arial" w:eastAsia="Arial" w:cs="Arial"/>
+                      </w:rPr>
+                      <w:t>[PORTAL — REVIEWER NAME]</w:t>
+                    </w:r>
+                  </w:sdtContent>
+                </w:sdt>
+                <w:r>
+                  <w:rPr>
+                    <w:rFonts w:ascii="Arial" w:hAnsi="Arial" w:eastAsia="Arial" w:cs="Arial"/>
+                  </w:rPr>
+                  <w:t xml:space="preserve">, </w:t>
+                </w:r>
+                <w:sdt>
+                  <w:sdtPr>
+                    <w:tag w:val="OPAL_REPORT_REVIEWER_ROLE"/>
+                    <w:alias w:val="PORTAL — REVIEWER ROLE"/>
+                    <w:text/>
+                  </w:sdtPr>
+                  <w:sdtContent>
+                    <w:r>
+                      <w:rPr>
+                        <w:rFonts w:ascii="Arial" w:hAnsi="Arial" w:eastAsia="Arial" w:cs="Arial"/>
+                      </w:rPr>
+                      <w:t>[PORTAL — REVIEWER ROLE]</w:t>
+                    </w:r>
+                  </w:sdtContent>
+                </w:sdt>
+              </w:p>
+            </w:tc>
+          </w:tr>
+          <w:tr>
+            <w:trPr>
+              <w:cantSplit w:val="true"/>
+            </w:trPr>
+            <w:tc>
+              <w:tcPr>
+                <w:tcW w:type="dxa" w:w="2889"/>
+                <w:vAlign w:val="center"/>
+                <w:shd w:val="clear" w:fill="2F5651"/>
+                <w:tcMar>
+                  <w:top w:w="95" w:type="dxa"/>
+                  <w:bottom w:w="95" w:type="dxa"/>
+                  <w:start w:w="120" w:type="dxa"/>
+                  <w:end w:w="120" w:type="dxa"/>
+                </w:tcMar>
+              </w:tcPr>
+              <w:p>
+                <w:pPr>
+                  <w:pStyle w:val="OPAL–TableHeader"/>
+                  <w:jc w:val="left"/>
+                </w:pPr>
+                <w:r>
+                  <w:rPr>
+                    <w:rFonts w:ascii="Arial" w:hAnsi="Arial" w:eastAsia="Arial" w:cs="Arial"/>
+                  </w:rPr>
+                  <w:t>Status</w:t>
+                </w:r>
+              </w:p>
+            </w:tc>
+            <w:tc>
+              <w:tcPr>
+                <w:tcW w:type="dxa" w:w="6137"/>
+                <w:vAlign w:val="center"/>
+                <w:tcMar>
+                  <w:top w:w="95" w:type="dxa"/>
+                  <w:bottom w:w="95" w:type="dxa"/>
+                  <w:start w:w="120" w:type="dxa"/>
+                  <w:end w:w="120" w:type="dxa"/>
+                </w:tcMar>
+              </w:tcPr>
+              <w:p>
+                <w:pPr>
+                  <w:pStyle w:val="OPAL–TableBody"/>
+                  <w:jc w:val="left"/>
+                </w:pPr>
+                <w:sdt>
+                  <w:sdtPr>
+                    <w:tag w:val="OPAL_REPORT_STATUS"/>
+                    <w:alias w:val="PORTAL — STATUS"/>
+                    <w:text/>
+                  </w:sdtPr>
+                  <w:sdtContent>
+                    <w:r>
+                      <w:rPr>
+                        <w:rFonts w:ascii="Arial" w:hAnsi="Arial" w:eastAsia="Arial" w:cs="Arial"/>
+                      </w:rPr>
+                      <w:t>[PORTAL — STATUS]</w:t>
+                    </w:r>
+                  </w:sdtContent>
+                </w:sdt>
+              </w:p>
+            </w:tc>
+          </w:tr>
+        </w:tbl>
+        <w:p>
+          <w:pPr>
+            <w:pStyle w:val="OPAL–Body"/>
+          </w:pPr>
+        </w:p>
       </w:sdtContent>
     </w:sdt>
     <w:sdt>
@@ -9870,7 +9318,6 @@
         <w:p>
           <w:pPr>
             <w:pStyle w:val="OPAL–Heading1"/>
-            <w:pageBreakBefore/>
           </w:pPr>
           <w:r>
             <w:t>Appendices</w:t>
@@ -19692,7 +19139,7 @@
     <w:basedOn w:val="OPAL–Body"/>
     <w:semiHidden/>
     <w:pPr>
-      <w:spacing w:after="60"/>
+      <w:spacing w:before="120" w:after="40"/>
       <w:ind w:left="0" w:firstLine="0"/>
     </w:pPr>
     <w:rPr>
@@ -19709,14 +19156,14 @@
     <w:semiHidden/>
     <w:pPr>
       <w:spacing w:after="60"/>
-      <w:ind w:left="317" w:firstLine="0"/>
+      <w:ind w:left="360" w:firstLine="0"/>
     </w:pPr>
     <w:rPr>
       <w:rFonts w:ascii="Arial" w:hAnsi="Arial" w:eastAsia="Arial" w:cs="Arial"/>
       <w:b w:val="0"/>
       <w:i w:val="0"/>
       <w:color w:val="263633"/>
-      <w:sz w:val="18"/>
+      <w:sz w:val="20"/>
     </w:rPr>
   </w:style>
   <w:style w:type="paragraph" w:customStyle="1" w:styleId="TOC3">
@@ -19725,7 +19172,7 @@
     <w:semiHidden/>
     <w:pPr>
       <w:spacing w:after="60"/>
-      <w:ind w:left="634" w:firstLine="0"/>
+      <w:ind w:left="720" w:firstLine="0"/>
     </w:pPr>
     <w:rPr>
       <w:rFonts w:ascii="Arial" w:hAnsi="Arial" w:eastAsia="Arial" w:cs="Arial"/>

</xml_diff>

<commit_message>
fix(fca): footer tables span the same 1in text column as the header band
Co-Authored-By: Claude Fable 5.1 <noreply@anthropic.com>
</commit_message>
<xml_diff>
--- a/backend/fca/templates/fca-v1.docx
+++ b/backend/fca/templates/fca-v1.docx
@@ -9451,7 +9451,7 @@
 <w:ftr xmlns:m="http://schemas.openxmlformats.org/officeDocument/2006/math" xmlns:mc="http://schemas.openxmlformats.org/markup-compatibility/2006" xmlns:mo="http://schemas.microsoft.com/office/mac/office/2008/main" xmlns:mv="urn:schemas-microsoft-com:mac:vml" xmlns:o="urn:schemas-microsoft-com:office:office" xmlns:r="http://schemas.openxmlformats.org/officeDocument/2006/relationships" xmlns:v="urn:schemas-microsoft-com:vml" xmlns:w10="urn:schemas-microsoft-com:office:word" xmlns:w14="http://schemas.microsoft.com/office/word/2010/wordml" xmlns:w="http://schemas.openxmlformats.org/wordprocessingml/2006/main" xmlns:wne="http://schemas.microsoft.com/office/word/2006/wordml" xmlns:wp14="http://schemas.microsoft.com/office/word/2010/wordprocessingDrawing" xmlns:wp="http://schemas.openxmlformats.org/drawingml/2006/wordprocessingDrawing" xmlns:wpc="http://schemas.microsoft.com/office/word/2010/wordprocessingCanvas" xmlns:wpg="http://schemas.microsoft.com/office/word/2010/wordprocessingGroup" xmlns:wpi="http://schemas.microsoft.com/office/word/2010/wordprocessingInk" xmlns:wps="http://schemas.microsoft.com/office/word/2010/wordprocessingShape" mc:Ignorable="w14 wp14">
   <w:tbl>
     <w:tblPr>
-      <w:tblW w:type="dxa" w:w="9936"/>
+      <w:tblW w:type="dxa" w:w="9026"/>
       <w:jc w:val="left"/>
       <w:tblLayout w:type="fixed"/>
       <w:tblLook w:firstColumn="1" w:firstRow="1" w:lastColumn="0" w:lastRow="0" w:noHBand="0" w:noVBand="1" w:val="04A0"/>
@@ -9466,8 +9466,8 @@
       </w:tblBorders>
     </w:tblPr>
     <w:tblGrid>
-      <w:gridCol w:w="7154"/>
-      <w:gridCol w:w="2782"/>
+      <w:gridCol w:w="6499"/>
+      <w:gridCol w:w="2527"/>
     </w:tblGrid>
     <w:tr>
       <w:trPr>
@@ -9475,7 +9475,7 @@
       </w:trPr>
       <w:tc>
         <w:tcPr>
-          <w:tcW w:type="dxa" w:w="7154"/>
+          <w:tcW w:type="dxa" w:w="6499"/>
           <w:tcMar>
             <w:top w:w="45" w:type="dxa"/>
             <w:bottom w:w="0" w:type="dxa"/>
@@ -9499,7 +9499,7 @@
       </w:tc>
       <w:tc>
         <w:tcPr>
-          <w:tcW w:type="dxa" w:w="2782"/>
+          <w:tcW w:type="dxa" w:w="2527"/>
           <w:tcMar>
             <w:top w:w="45" w:type="dxa"/>
             <w:bottom w:w="0" w:type="dxa"/>
@@ -9543,7 +9543,7 @@
 <w:ftr xmlns:m="http://schemas.openxmlformats.org/officeDocument/2006/math" xmlns:mc="http://schemas.openxmlformats.org/markup-compatibility/2006" xmlns:mo="http://schemas.microsoft.com/office/mac/office/2008/main" xmlns:mv="urn:schemas-microsoft-com:mac:vml" xmlns:o="urn:schemas-microsoft-com:office:office" xmlns:r="http://schemas.openxmlformats.org/officeDocument/2006/relationships" xmlns:v="urn:schemas-microsoft-com:vml" xmlns:w10="urn:schemas-microsoft-com:office:word" xmlns:w14="http://schemas.microsoft.com/office/word/2010/wordml" xmlns:w="http://schemas.openxmlformats.org/wordprocessingml/2006/main" xmlns:wne="http://schemas.microsoft.com/office/word/2006/wordml" xmlns:wp14="http://schemas.microsoft.com/office/word/2010/wordprocessingDrawing" xmlns:wp="http://schemas.openxmlformats.org/drawingml/2006/wordprocessingDrawing" xmlns:wpc="http://schemas.microsoft.com/office/word/2010/wordprocessingCanvas" xmlns:wpg="http://schemas.microsoft.com/office/word/2010/wordprocessingGroup" xmlns:wpi="http://schemas.microsoft.com/office/word/2010/wordprocessingInk" xmlns:wps="http://schemas.microsoft.com/office/word/2010/wordprocessingShape" mc:Ignorable="w14 wp14">
   <w:tbl>
     <w:tblPr>
-      <w:tblW w:type="dxa" w:w="9936"/>
+      <w:tblW w:type="dxa" w:w="9026"/>
       <w:jc w:val="left"/>
       <w:tblLayout w:type="fixed"/>
       <w:tblLook w:firstColumn="1" w:firstRow="1" w:lastColumn="0" w:lastRow="0" w:noHBand="0" w:noVBand="1" w:val="04A0"/>
@@ -9558,8 +9558,8 @@
       </w:tblBorders>
     </w:tblPr>
     <w:tblGrid>
-      <w:gridCol w:w="7154"/>
-      <w:gridCol w:w="2782"/>
+      <w:gridCol w:w="6499"/>
+      <w:gridCol w:w="2527"/>
     </w:tblGrid>
     <w:tr>
       <w:trPr>
@@ -9567,7 +9567,7 @@
       </w:trPr>
       <w:tc>
         <w:tcPr>
-          <w:tcW w:type="dxa" w:w="7154"/>
+          <w:tcW w:type="dxa" w:w="6499"/>
           <w:tcMar>
             <w:top w:w="45" w:type="dxa"/>
             <w:bottom w:w="0" w:type="dxa"/>
@@ -9622,7 +9622,7 @@
       <w:tc>
         <w:tcPr>
           <w:vAlign w:val="bottom"/>
-          <w:tcW w:type="dxa" w:w="2782"/>
+          <w:tcW w:type="dxa" w:w="2527"/>
           <w:tcMar>
             <w:top w:w="45" w:type="dxa"/>
             <w:bottom w:w="0" w:type="dxa"/>

</xml_diff>

<commit_message>
feat(fca): 'OPAL – Table' in Word's table gallery, applied to the master's own tables
The green header band, soft rules and 9pt Arial cells the master's tables
carry as direct formatting now also exist as a real table style, so a
therapist inserting a new table in Word can pick it. All 12 body tables
reference it (their direct formatting is unchanged).

Co-Authored-By: Claude Fable 5.1 <noreply@anthropic.com>
</commit_message>
<xml_diff>
--- a/backend/fca/templates/fca-v1.docx
+++ b/backend/fca/templates/fca-v1.docx
@@ -109,6 +109,7 @@
     </w:p>
     <w:tbl>
       <w:tblPr>
+        <w:tblStyle w:val="OPAL–Table"/>
         <w:tblW w:type="dxa" w:w="9026"/>
         <w:jc w:val="left"/>
         <w:tblLayout w:type="fixed"/>
@@ -1217,6 +1218,7 @@
         </w:p>
         <w:tbl>
           <w:tblPr>
+            <w:tblStyle w:val="OPAL–Table"/>
             <w:tblW w:type="dxa" w:w="9026"/>
             <w:jc w:val="left"/>
             <w:tblLayout w:type="fixed"/>
@@ -1865,6 +1867,7 @@
         </w:p>
         <w:tbl>
           <w:tblPr>
+            <w:tblStyle w:val="OPAL–Table"/>
             <w:tblW w:type="dxa" w:w="9026"/>
             <w:jc w:val="left"/>
             <w:tblLayout w:type="fixed"/>
@@ -2313,6 +2316,7 @@
         </w:p>
         <w:tbl>
           <w:tblPr>
+            <w:tblStyle w:val="OPAL–Table"/>
             <w:tblW w:type="dxa" w:w="9026"/>
             <w:jc w:val="left"/>
             <w:tblLayout w:type="fixed"/>
@@ -2796,6 +2800,7 @@
         </w:p>
         <w:tbl>
           <w:tblPr>
+            <w:tblStyle w:val="OPAL–Table"/>
             <w:tblW w:type="dxa" w:w="9026"/>
             <w:jc w:val="left"/>
             <w:tblLayout w:type="fixed"/>
@@ -3269,6 +3274,7 @@
         </w:p>
         <w:tbl>
           <w:tblPr>
+            <w:tblStyle w:val="OPAL–Table"/>
             <w:tblW w:type="dxa" w:w="9026"/>
             <w:jc w:val="left"/>
             <w:tblLayout w:type="fixed"/>
@@ -3676,6 +3682,7 @@
             </w:p>
             <w:tbl>
               <w:tblPr>
+                <w:tblStyle w:val="OPAL–Table"/>
                 <w:tblW w:type="dxa" w:w="9026"/>
                 <w:jc w:val="left"/>
                 <w:tblLayout w:type="fixed"/>
@@ -4715,6 +4722,7 @@
             </w:p>
             <w:tbl>
               <w:tblPr>
+                <w:tblStyle w:val="OPAL–Table"/>
                 <w:tblW w:type="dxa" w:w="9026"/>
                 <w:jc w:val="left"/>
                 <w:tblLayout w:type="fixed"/>
@@ -5600,6 +5608,7 @@
         </w:p>
         <w:tbl>
           <w:tblPr>
+            <w:tblStyle w:val="OPAL–Table"/>
             <w:tblW w:type="dxa" w:w="9026"/>
             <w:jc w:val="left"/>
             <w:tblLayout w:type="fixed"/>
@@ -7505,6 +7514,7 @@
         </w:p>
         <w:tbl>
           <w:tblPr>
+            <w:tblStyle w:val="OPAL–Table"/>
             <w:tblW w:type="dxa" w:w="9026"/>
             <w:jc w:val="left"/>
             <w:tblLayout w:type="fixed"/>
@@ -8490,6 +8500,7 @@
         </w:p>
         <w:tbl>
           <w:tblPr>
+            <w:tblStyle w:val="OPAL–Table"/>
             <w:tblW w:type="dxa" w:w="9026"/>
             <w:jc w:val="left"/>
             <w:tblLayout w:type="fixed"/>
@@ -9086,6 +9097,7 @@
         </w:p>
         <w:tbl>
           <w:tblPr>
+            <w:tblStyle w:val="OPAL–Table"/>
             <w:tblW w:type="dxa" w:w="9026"/>
             <w:jc w:val="left"/>
             <w:tblLayout w:type="fixed"/>
@@ -19166,6 +19178,61 @@
       <w:sz w:val="18"/>
     </w:rPr>
   </w:style>
+  <w:style w:type="table" w:customStyle="1" w:styleId="OPAL–Table">
+    <w:name w:val="OPAL – Table"/>
+    <w:basedOn w:val="TableNormal"/>
+    <w:uiPriority w:val="59"/>
+    <w:qFormat/>
+    <w:pPr>
+      <w:spacing w:before="20" w:after="20" w:line="240" w:lineRule="auto"/>
+    </w:pPr>
+    <w:rPr>
+      <w:rFonts w:ascii="Arial" w:hAnsi="Arial" w:eastAsia="Arial" w:cs="Arial"/>
+      <w:color w:val="263633"/>
+      <w:sz w:val="18"/>
+      <w:szCs w:val="18"/>
+    </w:rPr>
+    <w:tblPr>
+      <w:tblInd w:w="0" w:type="dxa"/>
+      <w:tblBorders>
+        <w:top w:val="single" w:sz="6" w:space="0" w:color="BFCDCE"/>
+        <w:left w:val="single" w:sz="6" w:space="0" w:color="BFCDCE"/>
+        <w:bottom w:val="single" w:sz="6" w:space="0" w:color="BFCDCE"/>
+        <w:right w:val="single" w:sz="6" w:space="0" w:color="BFCDCE"/>
+        <w:insideH w:val="single" w:sz="4" w:space="0" w:color="D9E2DE"/>
+        <w:insideV w:val="single" w:sz="4" w:space="0" w:color="D9E2DE"/>
+      </w:tblBorders>
+      <w:tblCellMar>
+        <w:top w:w="90" w:type="dxa"/>
+        <w:left w:w="120" w:type="dxa"/>
+        <w:bottom w:w="90" w:type="dxa"/>
+        <w:right w:w="120" w:type="dxa"/>
+      </w:tblCellMar>
+    </w:tblPr>
+    <w:tcPr>
+      <w:vAlign w:val="center"/>
+    </w:tcPr>
+    <w:tblStylePr w:type="firstRow">
+      <w:trPr>
+        <w:tblHeader/>
+        <w:cantSplit/>
+      </w:trPr>
+      <w:rPr>
+        <w:b/>
+        <w:color w:val="FFFFFF"/>
+        <w:sz w:val="18"/>
+        <w:szCs w:val="18"/>
+      </w:rPr>
+      <w:tcPr>
+        <w:shd w:val="clear" w:color="auto" w:fill="2F5651"/>
+      </w:tcPr>
+    </w:tblStylePr>
+    <w:tblStylePr w:type="firstCol">
+      <w:rPr>
+        <w:b/>
+      </w:rPr>
+    </w:tblStylePr>
+  </w:style>
 </w:styles>
 </file>
 

</xml_diff>

<commit_message>
feat(fca): Contents starts on its own page — blank lines on the cover, no page break
The cover ends in a continuous section break, and the maintainer block after
it is scrubbed at compose, so Contents landed on the cover page. The master
now ends the cover with 36 empty paragraphs (39 fit; verified in Word), so
Backspace moves one line at a time. The preview no longer treats a continuous
section break as the end of a page, so it breaks before Contents too.

Co-Authored-By: Claude Fable 5.1 <noreply@anthropic.com>
</commit_message>
<xml_diff>
--- a/backend/fca/templates/fca-v1.docx
+++ b/backend/fca/templates/fca-v1.docx
@@ -376,6 +376,42 @@
         <w:t xml:space="preserve"> </w:t>
       </w:r>
     </w:p>
+    <w:p/>
+    <w:p/>
+    <w:p/>
+    <w:p/>
+    <w:p/>
+    <w:p/>
+    <w:p/>
+    <w:p/>
+    <w:p/>
+    <w:p/>
+    <w:p/>
+    <w:p/>
+    <w:p/>
+    <w:p/>
+    <w:p/>
+    <w:p/>
+    <w:p/>
+    <w:p/>
+    <w:p/>
+    <w:p/>
+    <w:p/>
+    <w:p/>
+    <w:p/>
+    <w:p/>
+    <w:p/>
+    <w:p/>
+    <w:p/>
+    <w:p/>
+    <w:p/>
+    <w:p/>
+    <w:p/>
+    <w:p/>
+    <w:p/>
+    <w:p/>
+    <w:p/>
+    <w:p/>
     <w:p>
       <w:pPr>
         <w:sectPr>

</xml_diff>

<commit_message>
feat(fca): label/value tables get their own gallery style with white labels; the preview drops the cover's spacer lines
The Participant Details first row took OPAL – Table's dark header-row fill
under dark body text. Label/value tables now use a new 'OPAL – Details Table'
style (dark first column, white bold text, no header row), and body text
colour moves into the document defaults so no paragraph style can override a
table style's white. The preview, which has a real break before Contents,
drops the cover's blank spacer lines so they no longer spill onto an empty
page 2; the download keeps them.

Co-Authored-By: Claude Fable 5.1 <noreply@anthropic.com>
</commit_message>
<xml_diff>
--- a/backend/fca/templates/fca-v1.docx
+++ b/backend/fca/templates/fca-v1.docx
@@ -1254,11 +1254,11 @@
         </w:p>
         <w:tbl>
           <w:tblPr>
-            <w:tblStyle w:val="OPAL–Table"/>
+            <w:tblStyle w:val="OPAL–DetailsTable"/>
             <w:tblW w:type="dxa" w:w="9026"/>
             <w:jc w:val="left"/>
             <w:tblLayout w:type="fixed"/>
-            <w:tblLook w:firstColumn="1" w:firstRow="1" w:lastColumn="0" w:lastRow="0" w:noHBand="0" w:noVBand="1" w:val="04A0"/>
+            <w:tblLook w:firstColumn="1" w:firstRow="0" w:lastColumn="0" w:lastRow="0" w:noHBand="0" w:noVBand="1" w:val="0480"/>
             <w:tblInd w:type="dxa" w:w="120"/>
             <w:tblBorders>
               <w:top w:val="single" w:sz="6" w:color="BFCDCE"/>
@@ -1276,7 +1276,6 @@
           <w:tr>
             <w:trPr>
               <w:cantSplit w:val="true"/>
-              <w:tblHeader w:val="true"/>
             </w:trPr>
             <w:tc>
               <w:tcPr>
@@ -1307,6 +1306,7 @@
               <w:tcPr>
                 <w:tcW w:type="dxa" w:w="6137"/>
                 <w:vAlign w:val="center"/>
+                <w:shd w:val="clear" w:fill="F4F7F5"/>
                 <w:tcMar>
                   <w:top w:w="95" w:type="dxa"/>
                   <w:bottom w:w="95" w:type="dxa"/>
@@ -1903,11 +1903,11 @@
         </w:p>
         <w:tbl>
           <w:tblPr>
-            <w:tblStyle w:val="OPAL–Table"/>
+            <w:tblStyle w:val="OPAL–DetailsTable"/>
             <w:tblW w:type="dxa" w:w="9026"/>
             <w:jc w:val="left"/>
             <w:tblLayout w:type="fixed"/>
-            <w:tblLook w:firstColumn="1" w:firstRow="1" w:lastColumn="0" w:lastRow="0" w:noHBand="0" w:noVBand="1" w:val="04A0"/>
+            <w:tblLook w:firstColumn="1" w:firstRow="0" w:lastColumn="0" w:lastRow="0" w:noHBand="0" w:noVBand="1" w:val="0480"/>
             <w:tblInd w:type="dxa" w:w="120"/>
             <w:tblBorders>
               <w:top w:val="single" w:sz="6" w:color="BFCDCE"/>
@@ -1925,7 +1925,6 @@
           <w:tr>
             <w:trPr>
               <w:cantSplit w:val="true"/>
-              <w:tblHeader w:val="true"/>
             </w:trPr>
             <w:tc>
               <w:tcPr>
@@ -1956,6 +1955,7 @@
               <w:tcPr>
                 <w:tcW w:type="dxa" w:w="6137"/>
                 <w:vAlign w:val="center"/>
+                <w:shd w:val="clear" w:fill="F4F7F5"/>
                 <w:tcMar>
                   <w:top w:w="95" w:type="dxa"/>
                   <w:bottom w:w="95" w:type="dxa"/>
@@ -2352,11 +2352,11 @@
         </w:p>
         <w:tbl>
           <w:tblPr>
-            <w:tblStyle w:val="OPAL–Table"/>
+            <w:tblStyle w:val="OPAL–DetailsTable"/>
             <w:tblW w:type="dxa" w:w="9026"/>
             <w:jc w:val="left"/>
             <w:tblLayout w:type="fixed"/>
-            <w:tblLook w:firstColumn="1" w:firstRow="1" w:lastColumn="0" w:lastRow="0" w:noHBand="0" w:noVBand="1" w:val="04A0"/>
+            <w:tblLook w:firstColumn="1" w:firstRow="0" w:lastColumn="0" w:lastRow="0" w:noHBand="0" w:noVBand="1" w:val="0480"/>
             <w:tblInd w:type="dxa" w:w="120"/>
             <w:tblBorders>
               <w:top w:val="single" w:sz="6" w:color="BFCDCE"/>
@@ -2374,7 +2374,6 @@
           <w:tr>
             <w:trPr>
               <w:cantSplit w:val="true"/>
-              <w:tblHeader w:val="true"/>
             </w:trPr>
             <w:tc>
               <w:tcPr>
@@ -2405,6 +2404,7 @@
               <w:tcPr>
                 <w:tcW w:type="dxa" w:w="6137"/>
                 <w:vAlign w:val="center"/>
+                <w:shd w:val="clear" w:fill="F4F7F5"/>
                 <w:tcMar>
                   <w:top w:w="95" w:type="dxa"/>
                   <w:bottom w:w="95" w:type="dxa"/>
@@ -8536,11 +8536,11 @@
         </w:p>
         <w:tbl>
           <w:tblPr>
-            <w:tblStyle w:val="OPAL–Table"/>
+            <w:tblStyle w:val="OPAL–DetailsTable"/>
             <w:tblW w:type="dxa" w:w="9026"/>
             <w:jc w:val="left"/>
             <w:tblLayout w:type="fixed"/>
-            <w:tblLook w:firstColumn="1" w:firstRow="1" w:lastColumn="0" w:lastRow="0" w:noHBand="0" w:noVBand="1" w:val="04A0"/>
+            <w:tblLook w:firstColumn="1" w:firstRow="0" w:lastColumn="0" w:lastRow="0" w:noHBand="0" w:noVBand="1" w:val="0480"/>
             <w:tblInd w:type="dxa" w:w="120"/>
             <w:tblBorders>
               <w:top w:val="single" w:sz="6" w:color="BFCDCE"/>
@@ -8558,7 +8558,6 @@
           <w:tr>
             <w:trPr>
               <w:cantSplit w:val="true"/>
-              <w:tblHeader w:val="true"/>
             </w:trPr>
             <w:tc>
               <w:tcPr>
@@ -8589,6 +8588,7 @@
               <w:tcPr>
                 <w:tcW w:type="dxa" w:w="6137"/>
                 <w:vAlign w:val="center"/>
+                <w:shd w:val="clear" w:fill="F4F7F5"/>
                 <w:tcMar>
                   <w:top w:w="95" w:type="dxa"/>
                   <w:bottom w:w="95" w:type="dxa"/>
@@ -9133,11 +9133,11 @@
         </w:p>
         <w:tbl>
           <w:tblPr>
-            <w:tblStyle w:val="OPAL–Table"/>
+            <w:tblStyle w:val="OPAL–DetailsTable"/>
             <w:tblW w:type="dxa" w:w="9026"/>
             <w:jc w:val="left"/>
             <w:tblLayout w:type="fixed"/>
-            <w:tblLook w:firstColumn="1" w:firstRow="1" w:lastColumn="0" w:lastRow="0" w:noHBand="0" w:noVBand="1" w:val="04A0"/>
+            <w:tblLook w:firstColumn="1" w:firstRow="0" w:lastColumn="0" w:lastRow="0" w:noHBand="0" w:noVBand="1" w:val="0480"/>
             <w:tblInd w:type="dxa" w:w="120"/>
             <w:tblBorders>
               <w:top w:val="single" w:sz="6" w:color="BFCDCE"/>
@@ -9185,6 +9185,7 @@
               <w:tcPr>
                 <w:tcW w:type="dxa" w:w="6137"/>
                 <w:vAlign w:val="center"/>
+                <w:shd w:val="clear" w:fill="F4F7F5"/>
                 <w:tcMar>
                   <w:top w:w="95" w:type="dxa"/>
                   <w:bottom w:w="95" w:type="dxa"/>
@@ -18308,6 +18309,7 @@
     <w:rPrDefault>
       <w:rPr>
         <w:rFonts w:ascii="Times New Roman" w:hAnsi="Times New Roman" w:eastAsia="Times New Roman" w:cs="Times New Roman"/>
+        <w:color w:val="263633"/>
         <w:lang w:val="en-AU" w:eastAsia="en-US" w:bidi="ar-SA"/>
       </w:rPr>
     </w:rPrDefault>
@@ -18699,9 +18701,6 @@
     </w:pPr>
     <w:rPr>
       <w:rFonts w:asciiTheme="minorHAnsi" w:hAnsiTheme="minorHAnsi" w:ascii="Arial" w:hAnsi="Arial" w:eastAsia="Arial" w:cs="Arial"/>
-      <w:b w:val="0"/>
-      <w:i w:val="0"/>
-      <w:color w:val="263633"/>
       <w:spacing w:val="-5"/>
       <w:sz w:val="22"/>
     </w:rPr>
@@ -18806,9 +18805,6 @@
     </w:pPr>
     <w:rPr>
       <w:rFonts w:ascii="Arial" w:hAnsi="Arial" w:eastAsia="Arial" w:cs="Arial"/>
-      <w:b w:val="0"/>
-      <w:i w:val="0"/>
-      <w:color w:val="263633"/>
       <w:sz w:val="22"/>
     </w:rPr>
   </w:style>
@@ -19072,7 +19068,6 @@
       <w:rFonts w:ascii="Arial" w:hAnsi="Arial" w:eastAsia="Arial" w:cs="Arial"/>
       <w:b w:val="0"/>
       <w:i w:val="0"/>
-      <w:color w:val="263633"/>
       <w:sz w:val="18"/>
     </w:rPr>
   </w:style>
@@ -19267,6 +19262,52 @@
       <w:rPr>
         <w:b/>
       </w:rPr>
+    </w:tblStylePr>
+  </w:style>
+  <w:style w:type="table" w:customStyle="1" w:styleId="OPAL–DetailsTable">
+    <w:name w:val="OPAL – Details Table"/>
+    <w:basedOn w:val="TableNormal"/>
+    <w:uiPriority w:val="59"/>
+    <w:qFormat/>
+    <w:pPr>
+      <w:spacing w:before="20" w:after="20" w:line="240" w:lineRule="auto"/>
+    </w:pPr>
+    <w:rPr>
+      <w:rFonts w:ascii="Arial" w:hAnsi="Arial" w:eastAsia="Arial" w:cs="Arial"/>
+      <w:color w:val="263633"/>
+      <w:sz w:val="18"/>
+      <w:szCs w:val="18"/>
+    </w:rPr>
+    <w:tblPr>
+      <w:tblInd w:w="0" w:type="dxa"/>
+      <w:tblBorders>
+        <w:top w:val="single" w:sz="6" w:space="0" w:color="BFCDCE"/>
+        <w:left w:val="single" w:sz="6" w:space="0" w:color="BFCDCE"/>
+        <w:bottom w:val="single" w:sz="6" w:space="0" w:color="BFCDCE"/>
+        <w:right w:val="single" w:sz="6" w:space="0" w:color="BFCDCE"/>
+        <w:insideH w:val="single" w:sz="4" w:space="0" w:color="D9E2DE"/>
+        <w:insideV w:val="single" w:sz="4" w:space="0" w:color="D9E2DE"/>
+      </w:tblBorders>
+      <w:tblCellMar>
+        <w:top w:w="90" w:type="dxa"/>
+        <w:left w:w="120" w:type="dxa"/>
+        <w:bottom w:w="90" w:type="dxa"/>
+        <w:right w:w="120" w:type="dxa"/>
+      </w:tblCellMar>
+    </w:tblPr>
+    <w:tcPr>
+      <w:vAlign w:val="center"/>
+    </w:tcPr>
+    <w:tblStylePr w:type="firstCol">
+      <w:rPr>
+        <w:b/>
+        <w:color w:val="FFFFFF"/>
+        <w:sz w:val="18"/>
+        <w:szCs w:val="18"/>
+      </w:rPr>
+      <w:tcPr>
+        <w:shd w:val="clear" w:color="auto" w:fill="2F5651"/>
+      </w:tcPr>
     </w:tblStylePr>
   </w:style>
 </w:styles>

</xml_diff>

<commit_message>
fix(fca): no empty page 2, white label text in the preview, contents styles that survive an update
36 spacer lines was a misread calibration: only 12 lines fit under the cover,
so the rest filled a page of their own. The cover now ends in 9. The Opal
table styles no longer carry a text colour, which the previewer ranked above
the white label style (dark text on the green cells). The master held two
styles for each of TOC1-3; they are merged under Word's own 'toc N' names so
Update Field keeps the Opal look instead of Word's italic built-ins.

Co-Authored-By: Claude Fable 5.1 <noreply@anthropic.com>
</commit_message>
<xml_diff>
--- a/backend/fca/templates/fca-v1.docx
+++ b/backend/fca/templates/fca-v1.docx
@@ -376,33 +376,6 @@
         <w:t xml:space="preserve"> </w:t>
       </w:r>
     </w:p>
-    <w:p/>
-    <w:p/>
-    <w:p/>
-    <w:p/>
-    <w:p/>
-    <w:p/>
-    <w:p/>
-    <w:p/>
-    <w:p/>
-    <w:p/>
-    <w:p/>
-    <w:p/>
-    <w:p/>
-    <w:p/>
-    <w:p/>
-    <w:p/>
-    <w:p/>
-    <w:p/>
-    <w:p/>
-    <w:p/>
-    <w:p/>
-    <w:p/>
-    <w:p/>
-    <w:p/>
-    <w:p/>
-    <w:p/>
-    <w:p/>
     <w:p/>
     <w:p/>
     <w:p/>
@@ -18733,58 +18706,6 @@
     <w:semiHidden/>
     <w:unhideWhenUsed/>
   </w:style>
-  <w:style w:type="paragraph" w:styleId="TOC1">
-    <w:name w:val="toc 1"/>
-    <w:basedOn w:val="Normal"/>
-    <w:autoRedefine/>
-    <w:uiPriority w:val="39"/>
-    <w:rsid w:val="002F1453"/>
-    <w:pPr>
-      <w:spacing w:before="120" w:after="0"/>
-    </w:pPr>
-    <w:rPr>
-      <w:rFonts w:cstheme="minorHAnsi"/>
-      <w:b/>
-      <w:bCs/>
-      <w:i/>
-      <w:iCs/>
-      <w:szCs w:val="24"/>
-    </w:rPr>
-    <w:semiHidden/>
-  </w:style>
-  <w:style w:type="paragraph" w:styleId="TOC2">
-    <w:name w:val="toc 2"/>
-    <w:basedOn w:val="TOC1"/>
-    <w:autoRedefine/>
-    <w:uiPriority w:val="39"/>
-    <w:rsid w:val="002F1453"/>
-    <w:pPr>
-      <w:ind w:left="240"/>
-    </w:pPr>
-    <w:rPr>
-      <w:i w:val="0"/>
-      <w:iCs w:val="0"/>
-      <w:sz w:val="18"/>
-      <w:szCs w:val="22"/>
-    </w:rPr>
-    <w:semiHidden/>
-  </w:style>
-  <w:style w:type="paragraph" w:styleId="TOC3">
-    <w:name w:val="toc 3"/>
-    <w:basedOn w:val="Normal"/>
-    <w:next w:val="Normal"/>
-    <w:autoRedefine/>
-    <w:semiHidden/>
-    <w:rsid w:val="00DA28BB"/>
-    <w:pPr>
-      <w:spacing w:after="0"/>
-      <w:ind w:left="480"/>
-    </w:pPr>
-    <w:rPr>
-      <w:rFonts w:cstheme="minorHAnsi"/>
-      <w:sz w:val="18"/>
-    </w:rPr>
-  </w:style>
   <w:style w:type="character" w:styleId="Hyperlink">
     <w:name w:val="Hyperlink"/>
     <w:uiPriority w:val="99"/>
@@ -19161,10 +19082,12 @@
       <w:sz w:val="22"/>
     </w:rPr>
   </w:style>
-  <w:style w:type="paragraph" w:customStyle="1" w:styleId="TOC1">
-    <w:name w:val="TOC 1"/>
+  <w:style w:type="paragraph" w:styleId="TOC1">
+    <w:name w:val="toc 1"/>
     <w:basedOn w:val="OPAL–Body"/>
-    <w:semiHidden/>
+    <w:next w:val="Normal"/>
+    <w:uiPriority w:val="39"/>
+    <w:unhideWhenUsed/>
     <w:pPr>
       <w:spacing w:before="120" w:after="40"/>
       <w:ind w:left="0" w:firstLine="0"/>
@@ -19177,10 +19100,12 @@
       <w:sz w:val="22"/>
     </w:rPr>
   </w:style>
-  <w:style w:type="paragraph" w:customStyle="1" w:styleId="TOC2">
-    <w:name w:val="TOC 2"/>
+  <w:style w:type="paragraph" w:styleId="TOC2">
+    <w:name w:val="toc 2"/>
     <w:basedOn w:val="OPAL–Body"/>
-    <w:semiHidden/>
+    <w:next w:val="Normal"/>
+    <w:uiPriority w:val="39"/>
+    <w:unhideWhenUsed/>
     <w:pPr>
       <w:spacing w:after="60"/>
       <w:ind w:left="360" w:firstLine="0"/>
@@ -19193,10 +19118,12 @@
       <w:sz w:val="20"/>
     </w:rPr>
   </w:style>
-  <w:style w:type="paragraph" w:customStyle="1" w:styleId="TOC3">
-    <w:name w:val="TOC 3"/>
+  <w:style w:type="paragraph" w:styleId="TOC3">
+    <w:name w:val="toc 3"/>
     <w:basedOn w:val="OPAL–Body"/>
-    <w:semiHidden/>
+    <w:next w:val="Normal"/>
+    <w:uiPriority w:val="39"/>
+    <w:unhideWhenUsed/>
     <w:pPr>
       <w:spacing w:after="60"/>
       <w:ind w:left="720" w:firstLine="0"/>
@@ -19219,7 +19146,6 @@
     </w:pPr>
     <w:rPr>
       <w:rFonts w:ascii="Arial" w:hAnsi="Arial" w:eastAsia="Arial" w:cs="Arial"/>
-      <w:color w:val="263633"/>
       <w:sz w:val="18"/>
       <w:szCs w:val="18"/>
     </w:rPr>
@@ -19274,7 +19200,6 @@
     </w:pPr>
     <w:rPr>
       <w:rFonts w:ascii="Arial" w:hAnsi="Arial" w:eastAsia="Arial" w:cs="Arial"/>
-      <w:color w:val="263633"/>
       <w:sz w:val="18"/>
       <w:szCs w:val="18"/>
     </w:rPr>

</xml_diff>